<commit_message>
dado algo de forma al global de la 3a ev.
</commit_message>
<xml_diff>
--- a/matematicas_1ESOA/examenes/global_3a_ev.docx
+++ b/matematicas_1ESOA/examenes/global_3a_ev.docx
@@ -69,7 +69,7 @@
           <w:bCs w:val="0"/>
           <w:color w:val="414141"/>
         </w:rPr>
-        <w:t xml:space="preserve">Romina, Bernarda y Gilberta están nadando en la piscina olímpica municipal. </w:t>
+        <w:t>Reducir expresiones algebraicas sencillas</w:t>
       </w:r>
     </w:p>
     <w:p>
@@ -97,6 +97,34 @@
           <w:bCs w:val="0"/>
           <w:color w:val="414141"/>
         </w:rPr>
+        <w:t>Resolver ecuaciones varias</w:t>
+      </w:r>
+    </w:p>
+    <w:p>
+      <w:pPr>
+        <w:pStyle w:val="NormalWeb"/>
+        <w:numPr>
+          <w:ilvl w:val="0"/>
+          <w:numId w:val="8"/>
+        </w:numPr>
+        <w:shd w:val="clear" w:color="auto" w:fill="FFFFFF"/>
+        <w:spacing w:before="0" w:beforeAutospacing="0" w:after="225" w:afterAutospacing="0" w:line="405" w:lineRule="atLeast"/>
+        <w:rPr>
+          <w:rStyle w:val="Strong"/>
+          <w:rFonts w:ascii="Arial" w:hAnsi="Arial" w:cs="Arial"/>
+          <w:b w:val="0"/>
+          <w:bCs w:val="0"/>
+          <w:color w:val="414141"/>
+        </w:rPr>
+      </w:pPr>
+      <w:r>
+        <w:rPr>
+          <w:rStyle w:val="Strong"/>
+          <w:rFonts w:ascii="Arial" w:hAnsi="Arial" w:cs="Arial"/>
+          <w:b w:val="0"/>
+          <w:bCs w:val="0"/>
+          <w:color w:val="414141"/>
+        </w:rPr>
         <w:t>En la asignatura de Matemáticas del IES Sapere Aude, la primera evaluación pondera un 20%, la segunda un 30% y la tercera un 50%. Frumencio ha sacado un 3 en la primera y otro 3 en la segunda evaluación. Con un 5 en la tercera evaluación:</w:t>
       </w:r>
     </w:p>
@@ -196,28 +224,331 @@
         <w:shd w:val="clear" w:color="auto" w:fill="FFFFFF"/>
         <w:spacing w:before="0" w:beforeAutospacing="0" w:after="225" w:afterAutospacing="0" w:line="405" w:lineRule="atLeast"/>
         <w:rPr>
-          <w:rFonts w:ascii="Arial" w:hAnsi="Arial" w:cs="Arial"/>
-          <w:color w:val="414141"/>
-        </w:rPr>
-      </w:pPr>
-      <w:r>
-        <w:rPr>
-          <w:rStyle w:val="Strong"/>
-          <w:rFonts w:ascii="Arial" w:hAnsi="Arial" w:cs="Arial"/>
-          <w:b w:val="0"/>
-          <w:bCs w:val="0"/>
-          <w:color w:val="414141"/>
-        </w:rPr>
-        <w:t>municipal.</w:t>
+          <w:rStyle w:val="Strong"/>
+          <w:rFonts w:ascii="Arial" w:hAnsi="Arial" w:cs="Arial"/>
+          <w:b w:val="0"/>
+          <w:bCs w:val="0"/>
+          <w:color w:val="414141"/>
+        </w:rPr>
+      </w:pPr>
+      <w:r>
+        <w:rPr>
+          <w:rStyle w:val="Strong"/>
+          <w:rFonts w:ascii="Arial" w:hAnsi="Arial" w:cs="Arial"/>
+          <w:b w:val="0"/>
+          <w:bCs w:val="0"/>
+          <w:color w:val="414141"/>
+        </w:rPr>
+        <w:t>Funciones interpretar gráfica</w:t>
+      </w:r>
+      <w:r>
+        <w:rPr>
+          <w:rStyle w:val="Strong"/>
+          <w:rFonts w:ascii="Arial" w:hAnsi="Arial" w:cs="Arial"/>
+          <w:b w:val="0"/>
+          <w:bCs w:val="0"/>
+          <w:color w:val="414141"/>
+        </w:rPr>
+        <w:t xml:space="preserve">: </w:t>
+      </w:r>
+      <w:proofErr w:type="spellStart"/>
+      <w:r>
+        <w:rPr>
+          <w:rStyle w:val="Strong"/>
+          <w:rFonts w:ascii="Arial" w:hAnsi="Arial" w:cs="Arial"/>
+          <w:b w:val="0"/>
+          <w:bCs w:val="0"/>
+          <w:color w:val="414141"/>
+        </w:rPr>
+        <w:t>ej</w:t>
+      </w:r>
+      <w:proofErr w:type="spellEnd"/>
+      <w:r>
+        <w:rPr>
+          <w:rStyle w:val="Strong"/>
+          <w:rFonts w:ascii="Arial" w:hAnsi="Arial" w:cs="Arial"/>
+          <w:b w:val="0"/>
+          <w:bCs w:val="0"/>
+          <w:color w:val="414141"/>
+        </w:rPr>
+        <w:t xml:space="preserve"> 19 y/o 20 de avión </w:t>
+      </w:r>
+      <w:proofErr w:type="spellStart"/>
+      <w:r>
+        <w:rPr>
+          <w:rStyle w:val="Strong"/>
+          <w:rFonts w:ascii="Arial" w:hAnsi="Arial" w:cs="Arial"/>
+          <w:b w:val="0"/>
+          <w:bCs w:val="0"/>
+          <w:color w:val="414141"/>
+        </w:rPr>
+        <w:t>helic</w:t>
+      </w:r>
+      <w:proofErr w:type="spellEnd"/>
+      <w:r>
+        <w:rPr>
+          <w:rStyle w:val="Strong"/>
+          <w:rFonts w:ascii="Arial" w:hAnsi="Arial" w:cs="Arial"/>
+          <w:b w:val="0"/>
+          <w:bCs w:val="0"/>
+          <w:color w:val="414141"/>
+        </w:rPr>
+        <w:t xml:space="preserve"> y bus o de ingresos y gastos</w:t>
+      </w:r>
+      <w:r>
+        <w:rPr>
+          <w:rStyle w:val="Strong"/>
+          <w:rFonts w:ascii="Arial" w:hAnsi="Arial" w:cs="Arial"/>
+          <w:b w:val="0"/>
+          <w:bCs w:val="0"/>
+          <w:color w:val="414141"/>
+        </w:rPr>
+        <w:t xml:space="preserve"> (en este que dibujen la recta de gastos por otro proveedor. </w:t>
+      </w:r>
+      <w:proofErr w:type="gramStart"/>
+      <w:r>
+        <w:rPr>
+          <w:rStyle w:val="Strong"/>
+          <w:rFonts w:ascii="Arial" w:hAnsi="Arial" w:cs="Arial"/>
+          <w:b w:val="0"/>
+          <w:bCs w:val="0"/>
+          <w:color w:val="414141"/>
+        </w:rPr>
+        <w:t xml:space="preserve">Cual sale </w:t>
+      </w:r>
+      <w:proofErr w:type="spellStart"/>
+      <w:r>
+        <w:rPr>
+          <w:rStyle w:val="Strong"/>
+          <w:rFonts w:ascii="Arial" w:hAnsi="Arial" w:cs="Arial"/>
+          <w:b w:val="0"/>
+          <w:bCs w:val="0"/>
+          <w:color w:val="414141"/>
+        </w:rPr>
+        <w:t>mas</w:t>
+      </w:r>
+      <w:proofErr w:type="spellEnd"/>
+      <w:r>
+        <w:rPr>
+          <w:rStyle w:val="Strong"/>
+          <w:rFonts w:ascii="Arial" w:hAnsi="Arial" w:cs="Arial"/>
+          <w:b w:val="0"/>
+          <w:bCs w:val="0"/>
+          <w:color w:val="414141"/>
+        </w:rPr>
+        <w:t xml:space="preserve"> rentable?</w:t>
+      </w:r>
+      <w:proofErr w:type="gramEnd"/>
+      <w:r>
+        <w:rPr>
+          <w:rStyle w:val="Strong"/>
+          <w:rFonts w:ascii="Arial" w:hAnsi="Arial" w:cs="Arial"/>
+          <w:b w:val="0"/>
+          <w:bCs w:val="0"/>
+          <w:color w:val="414141"/>
+        </w:rPr>
+        <w:t>)</w:t>
+      </w:r>
+    </w:p>
+    <w:p>
+      <w:pPr>
+        <w:pStyle w:val="NormalWeb"/>
+        <w:numPr>
+          <w:ilvl w:val="0"/>
+          <w:numId w:val="8"/>
+        </w:numPr>
+        <w:shd w:val="clear" w:color="auto" w:fill="FFFFFF"/>
+        <w:spacing w:before="0" w:beforeAutospacing="0" w:after="225" w:afterAutospacing="0" w:line="405" w:lineRule="atLeast"/>
+        <w:rPr>
+          <w:rStyle w:val="Strong"/>
+          <w:rFonts w:ascii="Arial" w:hAnsi="Arial" w:cs="Arial"/>
+          <w:b w:val="0"/>
+          <w:bCs w:val="0"/>
+          <w:color w:val="414141"/>
+        </w:rPr>
+      </w:pPr>
+      <w:r>
+        <w:rPr>
+          <w:rStyle w:val="Strong"/>
+          <w:rFonts w:ascii="Arial" w:hAnsi="Arial" w:cs="Arial"/>
+          <w:b w:val="0"/>
+          <w:bCs w:val="0"/>
+          <w:color w:val="414141"/>
+        </w:rPr>
+        <w:t xml:space="preserve">Fill in </w:t>
+      </w:r>
+      <w:proofErr w:type="spellStart"/>
+      <w:r>
+        <w:rPr>
+          <w:rStyle w:val="Strong"/>
+          <w:rFonts w:ascii="Arial" w:hAnsi="Arial" w:cs="Arial"/>
+          <w:b w:val="0"/>
+          <w:bCs w:val="0"/>
+          <w:color w:val="414141"/>
+        </w:rPr>
+        <w:t>the</w:t>
+      </w:r>
+      <w:proofErr w:type="spellEnd"/>
+      <w:r>
+        <w:rPr>
+          <w:rStyle w:val="Strong"/>
+          <w:rFonts w:ascii="Arial" w:hAnsi="Arial" w:cs="Arial"/>
+          <w:b w:val="0"/>
+          <w:bCs w:val="0"/>
+          <w:color w:val="414141"/>
+        </w:rPr>
+        <w:t xml:space="preserve"> gaps de palabras técnicas geometría?</w:t>
+      </w:r>
+    </w:p>
+    <w:p>
+      <w:pPr>
+        <w:pStyle w:val="NormalWeb"/>
+        <w:numPr>
+          <w:ilvl w:val="0"/>
+          <w:numId w:val="8"/>
+        </w:numPr>
+        <w:shd w:val="clear" w:color="auto" w:fill="FFFFFF"/>
+        <w:spacing w:before="0" w:beforeAutospacing="0" w:after="225" w:afterAutospacing="0" w:line="405" w:lineRule="atLeast"/>
+        <w:rPr>
+          <w:rStyle w:val="Strong"/>
+          <w:rFonts w:ascii="Arial" w:hAnsi="Arial" w:cs="Arial"/>
+          <w:b w:val="0"/>
+          <w:bCs w:val="0"/>
+          <w:color w:val="414141"/>
+        </w:rPr>
+      </w:pPr>
+      <w:r>
+        <w:rPr>
+          <w:rStyle w:val="Strong"/>
+          <w:rFonts w:ascii="Arial" w:hAnsi="Arial" w:cs="Arial"/>
+          <w:b w:val="0"/>
+          <w:bCs w:val="0"/>
+          <w:color w:val="414141"/>
+        </w:rPr>
+        <w:t xml:space="preserve">Sabiendo que los segmentos AB y CD son paralelos al eje de simetría de la figura (la línea discontinua) y que el ángulo </w:t>
+      </w:r>
+      <w:r>
+        <w:rPr>
+          <w:rStyle w:val="Strong"/>
+          <w:b w:val="0"/>
+          <w:bCs w:val="0"/>
+          <w:color w:val="414141"/>
+        </w:rPr>
+        <w:t>α</w:t>
+      </w:r>
+      <w:r>
+        <w:rPr>
+          <w:rStyle w:val="Strong"/>
+          <w:rFonts w:ascii="Arial" w:hAnsi="Arial" w:cs="Arial"/>
+          <w:b w:val="0"/>
+          <w:bCs w:val="0"/>
+          <w:color w:val="414141"/>
+        </w:rPr>
+        <w:t xml:space="preserve"> del diagrama tiene un valor de 37º, indica el valor del resto de ángulos etiquetados en la figura. (desde el 1 hasta el 11)</w:t>
+      </w:r>
+      <w:r>
+        <w:rPr>
+          <w:rStyle w:val="Strong"/>
+          <w:rFonts w:ascii="Arial" w:hAnsi="Arial" w:cs="Arial"/>
+          <w:b w:val="0"/>
+          <w:bCs w:val="0"/>
+          <w:color w:val="414141"/>
+        </w:rPr>
+        <w:t xml:space="preserve"> (o mejor pocos)</w:t>
+      </w:r>
+    </w:p>
+    <w:p>
+      <w:pPr>
+        <w:pStyle w:val="NormalWeb"/>
+        <w:shd w:val="clear" w:color="auto" w:fill="FFFFFF"/>
+        <w:spacing w:before="0" w:beforeAutospacing="0" w:after="225" w:afterAutospacing="0" w:line="405" w:lineRule="atLeast"/>
+        <w:ind w:left="720"/>
+        <w:rPr>
+          <w:rStyle w:val="Strong"/>
+          <w:rFonts w:ascii="Arial" w:hAnsi="Arial" w:cs="Arial"/>
+          <w:b w:val="0"/>
+          <w:bCs w:val="0"/>
+          <w:color w:val="414141"/>
+        </w:rPr>
+      </w:pPr>
+      <w:r>
+        <w:rPr>
+          <w:rStyle w:val="Strong"/>
+          <w:rFonts w:ascii="Arial" w:hAnsi="Arial" w:cs="Arial"/>
+          <w:b w:val="0"/>
+          <w:bCs w:val="0"/>
+          <w:color w:val="414141"/>
+        </w:rPr>
+        <w:lastRenderedPageBreak/>
+        <w:drawing>
+          <wp:inline distT="0" distB="0" distL="0" distR="0" wp14:anchorId="51F698C2" wp14:editId="0A63B1E8">
+            <wp:extent cx="5400040" cy="4988560"/>
+            <wp:effectExtent l="0" t="0" r="0" b="2540"/>
+            <wp:docPr id="536709051" name="Picture 1"/>
+            <wp:cNvGraphicFramePr>
+              <a:graphicFrameLocks xmlns:a="http://schemas.openxmlformats.org/drawingml/2006/main" noChangeAspect="1"/>
+            </wp:cNvGraphicFramePr>
+            <a:graphic xmlns:a="http://schemas.openxmlformats.org/drawingml/2006/main">
+              <a:graphicData uri="http://schemas.openxmlformats.org/drawingml/2006/picture">
+                <pic:pic xmlns:pic="http://schemas.openxmlformats.org/drawingml/2006/picture">
+                  <pic:nvPicPr>
+                    <pic:cNvPr id="536709051" name=""/>
+                    <pic:cNvPicPr/>
+                  </pic:nvPicPr>
+                  <pic:blipFill>
+                    <a:blip r:embed="rId8"/>
+                    <a:stretch>
+                      <a:fillRect/>
+                    </a:stretch>
+                  </pic:blipFill>
+                  <pic:spPr>
+                    <a:xfrm>
+                      <a:off x="0" y="0"/>
+                      <a:ext cx="5400040" cy="4988560"/>
+                    </a:xfrm>
+                    <a:prstGeom prst="rect">
+                      <a:avLst/>
+                    </a:prstGeom>
+                  </pic:spPr>
+                </pic:pic>
+              </a:graphicData>
+            </a:graphic>
+          </wp:inline>
+        </w:drawing>
+      </w:r>
+    </w:p>
+    <w:p>
+      <w:pPr>
+        <w:pStyle w:val="NormalWeb"/>
+        <w:numPr>
+          <w:ilvl w:val="0"/>
+          <w:numId w:val="8"/>
+        </w:numPr>
+        <w:shd w:val="clear" w:color="auto" w:fill="FFFFFF"/>
+        <w:spacing w:before="0" w:beforeAutospacing="0" w:after="225" w:afterAutospacing="0" w:line="405" w:lineRule="atLeast"/>
+        <w:rPr>
+          <w:rFonts w:ascii="Arial" w:hAnsi="Arial" w:cs="Arial"/>
+          <w:color w:val="414141"/>
+        </w:rPr>
+      </w:pPr>
+      <w:r>
+        <w:rPr>
+          <w:rStyle w:val="Strong"/>
+          <w:rFonts w:ascii="Arial" w:hAnsi="Arial" w:cs="Arial"/>
+          <w:b w:val="0"/>
+          <w:bCs w:val="0"/>
+          <w:color w:val="414141"/>
+        </w:rPr>
+        <w:t>¿Cuánto mide cada ángulo de un hexágono regular?</w:t>
       </w:r>
     </w:p>
     <w:sectPr>
-      <w:headerReference w:type="even" r:id="rId8"/>
-      <w:headerReference w:type="default" r:id="rId9"/>
-      <w:footerReference w:type="even" r:id="rId10"/>
-      <w:footerReference w:type="default" r:id="rId11"/>
-      <w:headerReference w:type="first" r:id="rId12"/>
-      <w:footerReference w:type="first" r:id="rId13"/>
+      <w:headerReference w:type="even" r:id="rId9"/>
+      <w:headerReference w:type="default" r:id="rId10"/>
+      <w:footerReference w:type="even" r:id="rId11"/>
+      <w:footerReference w:type="default" r:id="rId12"/>
+      <w:headerReference w:type="first" r:id="rId13"/>
+      <w:footerReference w:type="first" r:id="rId14"/>
       <w:type w:val="continuous"/>
       <w:pgSz w:w="11906" w:h="16838"/>
       <w:pgMar w:top="1417" w:right="1701" w:bottom="1417" w:left="1701" w:header="283" w:footer="708" w:gutter="0"/>

</xml_diff>

<commit_message>
global 3a ev hecho y mazo más cosas
</commit_message>
<xml_diff>
--- a/matematicas_1ESOA/examenes/global_3a_ev.docx
+++ b/matematicas_1ESOA/examenes/global_3a_ev.docx
@@ -27,9 +27,8 @@
           <w:iCs/>
           <w:color w:val="414141"/>
         </w:rPr>
-        <w:t xml:space="preserve">[3 </w:t>
-      </w:r>
-      <w:proofErr w:type="spellStart"/>
+        <w:t>[</w:t>
+      </w:r>
       <w:r>
         <w:rPr>
           <w:rStyle w:val="Strong"/>
@@ -38,9 +37,9 @@
           <w:iCs/>
           <w:color w:val="414141"/>
         </w:rPr>
-        <w:t>pts</w:t>
-      </w:r>
-      <w:proofErr w:type="spellEnd"/>
+        <w:t xml:space="preserve">1,5 </w:t>
+      </w:r>
+      <w:proofErr w:type="spellStart"/>
       <w:r>
         <w:rPr>
           <w:rStyle w:val="Strong"/>
@@ -49,6 +48,17 @@
           <w:iCs/>
           <w:color w:val="414141"/>
         </w:rPr>
+        <w:t>pts</w:t>
+      </w:r>
+      <w:proofErr w:type="spellEnd"/>
+      <w:r>
+        <w:rPr>
+          <w:rStyle w:val="Strong"/>
+          <w:rFonts w:ascii="Arial" w:hAnsi="Arial" w:cs="Arial"/>
+          <w:i/>
+          <w:iCs/>
+          <w:color w:val="414141"/>
+        </w:rPr>
         <w:t>]</w:t>
       </w:r>
       <w:r>
@@ -69,8 +79,324 @@
           <w:bCs w:val="0"/>
           <w:color w:val="414141"/>
         </w:rPr>
-        <w:t>Reducir expresiones algebraicas sencillas</w:t>
-      </w:r>
+        <w:t>Resuelve las siguientes operaciones combinadas paso a paso. Ten en cuenta que tu respuesta final debe coincidir con la indicada.</w:t>
+      </w:r>
+    </w:p>
+    <w:tbl>
+      <w:tblPr>
+        <w:tblStyle w:val="TableGrid"/>
+        <w:tblW w:w="0" w:type="auto"/>
+        <w:tblInd w:w="0" w:type="dxa"/>
+        <w:tblLook w:val="04A0" w:firstRow="1" w:lastRow="0" w:firstColumn="1" w:lastColumn="0" w:noHBand="0" w:noVBand="1"/>
+      </w:tblPr>
+      <w:tblGrid>
+        <w:gridCol w:w="4247"/>
+        <w:gridCol w:w="4247"/>
+      </w:tblGrid>
+      <w:tr>
+        <w:tc>
+          <w:tcPr>
+            <w:tcW w:w="4247" w:type="dxa"/>
+          </w:tcPr>
+          <w:p>
+            <w:pPr>
+              <w:pStyle w:val="NormalWeb"/>
+              <w:spacing w:before="0" w:beforeAutospacing="0" w:after="225" w:afterAutospacing="0" w:line="405" w:lineRule="atLeast"/>
+              <w:rPr>
+                <w:rStyle w:val="Strong"/>
+                <w:rFonts w:ascii="Arial" w:hAnsi="Arial" w:cs="Arial"/>
+                <w:b w:val="0"/>
+                <w:bCs w:val="0"/>
+                <w:color w:val="414141"/>
+              </w:rPr>
+            </w:pPr>
+            <w:r>
+              <w:rPr>
+                <w:rStyle w:val="HeaderChar"/>
+                <w:rFonts w:ascii="Arial" w:hAnsi="Arial" w:cs="Arial"/>
+                <w:color w:val="414141"/>
+              </w:rPr>
+              <w:drawing>
+                <wp:inline distT="0" distB="0" distL="0" distR="0" wp14:anchorId="52E1CC95" wp14:editId="3B725236">
+                  <wp:extent cx="2466974" cy="838200"/>
+                  <wp:effectExtent l="0" t="0" r="0" b="0"/>
+                  <wp:docPr id="448220478" name="Picture 1"/>
+                  <wp:cNvGraphicFramePr>
+                    <a:graphicFrameLocks xmlns:a="http://schemas.openxmlformats.org/drawingml/2006/main" noChangeAspect="1"/>
+                  </wp:cNvGraphicFramePr>
+                  <a:graphic xmlns:a="http://schemas.openxmlformats.org/drawingml/2006/main">
+                    <a:graphicData uri="http://schemas.openxmlformats.org/drawingml/2006/picture">
+                      <pic:pic xmlns:pic="http://schemas.openxmlformats.org/drawingml/2006/picture">
+                        <pic:nvPicPr>
+                          <pic:cNvPr id="1418694364" name=""/>
+                          <pic:cNvPicPr/>
+                        </pic:nvPicPr>
+                        <pic:blipFill rotWithShape="1">
+                          <a:blip r:embed="rId8"/>
+                          <a:srcRect b="58294"/>
+                          <a:stretch>
+                            <a:fillRect/>
+                          </a:stretch>
+                        </pic:blipFill>
+                        <pic:spPr bwMode="auto">
+                          <a:xfrm>
+                            <a:off x="0" y="0"/>
+                            <a:ext cx="2467319" cy="838317"/>
+                          </a:xfrm>
+                          <a:prstGeom prst="rect">
+                            <a:avLst/>
+                          </a:prstGeom>
+                          <a:ln>
+                            <a:noFill/>
+                          </a:ln>
+                          <a:extLst>
+                            <a:ext uri="{53640926-AAD7-44D8-BBD7-CCE9431645EC}">
+                              <a14:shadowObscured xmlns:a14="http://schemas.microsoft.com/office/drawing/2010/main"/>
+                            </a:ext>
+                          </a:extLst>
+                        </pic:spPr>
+                      </pic:pic>
+                    </a:graphicData>
+                  </a:graphic>
+                </wp:inline>
+              </w:drawing>
+            </w:r>
+          </w:p>
+        </w:tc>
+        <w:tc>
+          <w:tcPr>
+            <w:tcW w:w="4247" w:type="dxa"/>
+          </w:tcPr>
+          <w:p>
+            <w:pPr>
+              <w:pStyle w:val="NormalWeb"/>
+              <w:spacing w:before="0" w:beforeAutospacing="0" w:after="225" w:afterAutospacing="0" w:line="405" w:lineRule="atLeast"/>
+              <w:rPr>
+                <w:rStyle w:val="Strong"/>
+                <w:rFonts w:ascii="Arial" w:hAnsi="Arial" w:cs="Arial"/>
+                <w:b w:val="0"/>
+                <w:bCs w:val="0"/>
+                <w:color w:val="414141"/>
+              </w:rPr>
+            </w:pPr>
+            <w:r>
+              <w:rPr>
+                <w:rStyle w:val="HeaderChar"/>
+                <w:rFonts w:ascii="Arial" w:hAnsi="Arial" w:cs="Arial"/>
+                <w:color w:val="414141"/>
+              </w:rPr>
+              <w:drawing>
+                <wp:inline distT="0" distB="0" distL="0" distR="0" wp14:anchorId="4AFB537F" wp14:editId="7EE49A38">
+                  <wp:extent cx="2457450" cy="702129"/>
+                  <wp:effectExtent l="0" t="0" r="0" b="3175"/>
+                  <wp:docPr id="1585554317" name="Picture 1"/>
+                  <wp:cNvGraphicFramePr>
+                    <a:graphicFrameLocks xmlns:a="http://schemas.openxmlformats.org/drawingml/2006/main" noChangeAspect="1"/>
+                  </wp:cNvGraphicFramePr>
+                  <a:graphic xmlns:a="http://schemas.openxmlformats.org/drawingml/2006/main">
+                    <a:graphicData uri="http://schemas.openxmlformats.org/drawingml/2006/picture">
+                      <pic:pic xmlns:pic="http://schemas.openxmlformats.org/drawingml/2006/picture">
+                        <pic:nvPicPr>
+                          <pic:cNvPr id="851486032" name=""/>
+                          <pic:cNvPicPr/>
+                        </pic:nvPicPr>
+                        <pic:blipFill rotWithShape="1">
+                          <a:blip r:embed="rId9"/>
+                          <a:srcRect b="61702"/>
+                          <a:stretch>
+                            <a:fillRect/>
+                          </a:stretch>
+                        </pic:blipFill>
+                        <pic:spPr bwMode="auto">
+                          <a:xfrm>
+                            <a:off x="0" y="0"/>
+                            <a:ext cx="2459709" cy="702774"/>
+                          </a:xfrm>
+                          <a:prstGeom prst="rect">
+                            <a:avLst/>
+                          </a:prstGeom>
+                          <a:ln>
+                            <a:noFill/>
+                          </a:ln>
+                          <a:extLst>
+                            <a:ext uri="{53640926-AAD7-44D8-BBD7-CCE9431645EC}">
+                              <a14:shadowObscured xmlns:a14="http://schemas.microsoft.com/office/drawing/2010/main"/>
+                            </a:ext>
+                          </a:extLst>
+                        </pic:spPr>
+                      </pic:pic>
+                    </a:graphicData>
+                  </a:graphic>
+                </wp:inline>
+              </w:drawing>
+            </w:r>
+          </w:p>
+        </w:tc>
+      </w:tr>
+      <w:tr>
+        <w:tc>
+          <w:tcPr>
+            <w:tcW w:w="4247" w:type="dxa"/>
+          </w:tcPr>
+          <w:p>
+            <w:pPr>
+              <w:pStyle w:val="NormalWeb"/>
+              <w:numPr>
+                <w:ilvl w:val="0"/>
+                <w:numId w:val="9"/>
+              </w:numPr>
+              <w:spacing w:before="0" w:beforeAutospacing="0" w:after="225" w:afterAutospacing="0" w:line="405" w:lineRule="atLeast"/>
+              <w:rPr>
+                <w:rStyle w:val="Strong"/>
+                <w:rFonts w:ascii="Arial" w:hAnsi="Arial" w:cs="Arial"/>
+                <w:b w:val="0"/>
+                <w:bCs w:val="0"/>
+                <w:color w:val="414141"/>
+              </w:rPr>
+            </w:pPr>
+            <w:r>
+              <w:rPr>
+                <w:rStyle w:val="Strong"/>
+                <w:rFonts w:ascii="Arial" w:hAnsi="Arial" w:cs="Arial"/>
+                <w:b w:val="0"/>
+                <w:bCs w:val="0"/>
+                <w:color w:val="414141"/>
+              </w:rPr>
+              <w:t>Respuesta: 49 / 4</w:t>
+            </w:r>
+          </w:p>
+        </w:tc>
+        <w:tc>
+          <w:tcPr>
+            <w:tcW w:w="4247" w:type="dxa"/>
+          </w:tcPr>
+          <w:p>
+            <w:pPr>
+              <w:pStyle w:val="NormalWeb"/>
+              <w:numPr>
+                <w:ilvl w:val="0"/>
+                <w:numId w:val="9"/>
+              </w:numPr>
+              <w:spacing w:before="0" w:beforeAutospacing="0" w:after="225" w:afterAutospacing="0" w:line="405" w:lineRule="atLeast"/>
+              <w:rPr>
+                <w:rStyle w:val="Strong"/>
+                <w:rFonts w:ascii="Arial" w:hAnsi="Arial" w:cs="Arial"/>
+                <w:b w:val="0"/>
+                <w:bCs w:val="0"/>
+                <w:color w:val="414141"/>
+              </w:rPr>
+            </w:pPr>
+            <w:r>
+              <w:rPr>
+                <w:rStyle w:val="Strong"/>
+                <w:rFonts w:ascii="Arial" w:hAnsi="Arial" w:cs="Arial"/>
+                <w:b w:val="0"/>
+                <w:bCs w:val="0"/>
+                <w:color w:val="414141"/>
+              </w:rPr>
+              <w:t>Respuesta: -27 / 4</w:t>
+            </w:r>
+          </w:p>
+        </w:tc>
+      </w:tr>
+    </w:tbl>
+    <w:p>
+      <w:pPr>
+        <w:pStyle w:val="NormalWeb"/>
+        <w:shd w:val="clear" w:color="auto" w:fill="FFFFFF"/>
+        <w:spacing w:before="0" w:beforeAutospacing="0" w:after="225" w:afterAutospacing="0" w:line="405" w:lineRule="atLeast"/>
+        <w:rPr>
+          <w:rStyle w:val="Strong"/>
+          <w:rFonts w:ascii="Arial" w:hAnsi="Arial" w:cs="Arial"/>
+          <w:b w:val="0"/>
+          <w:bCs w:val="0"/>
+          <w:color w:val="414141"/>
+        </w:rPr>
+      </w:pPr>
+    </w:p>
+    <w:p>
+      <w:pPr>
+        <w:pStyle w:val="NormalWeb"/>
+        <w:shd w:val="clear" w:color="auto" w:fill="FFFFFF"/>
+        <w:spacing w:before="0" w:beforeAutospacing="0" w:after="225" w:afterAutospacing="0" w:line="405" w:lineRule="atLeast"/>
+        <w:rPr>
+          <w:rStyle w:val="Strong"/>
+          <w:rFonts w:ascii="Arial" w:hAnsi="Arial" w:cs="Arial"/>
+          <w:b w:val="0"/>
+          <w:bCs w:val="0"/>
+          <w:color w:val="414141"/>
+        </w:rPr>
+      </w:pPr>
+    </w:p>
+    <w:p>
+      <w:pPr>
+        <w:pStyle w:val="NormalWeb"/>
+        <w:shd w:val="clear" w:color="auto" w:fill="FFFFFF"/>
+        <w:spacing w:before="0" w:beforeAutospacing="0" w:after="225" w:afterAutospacing="0" w:line="405" w:lineRule="atLeast"/>
+        <w:rPr>
+          <w:rStyle w:val="Strong"/>
+          <w:rFonts w:ascii="Arial" w:hAnsi="Arial" w:cs="Arial"/>
+          <w:b w:val="0"/>
+          <w:bCs w:val="0"/>
+          <w:color w:val="414141"/>
+        </w:rPr>
+      </w:pPr>
+    </w:p>
+    <w:p>
+      <w:pPr>
+        <w:pStyle w:val="NormalWeb"/>
+        <w:shd w:val="clear" w:color="auto" w:fill="FFFFFF"/>
+        <w:spacing w:before="0" w:beforeAutospacing="0" w:after="225" w:afterAutospacing="0" w:line="405" w:lineRule="atLeast"/>
+        <w:rPr>
+          <w:rStyle w:val="Strong"/>
+          <w:rFonts w:ascii="Arial" w:hAnsi="Arial" w:cs="Arial"/>
+          <w:b w:val="0"/>
+          <w:bCs w:val="0"/>
+          <w:color w:val="414141"/>
+        </w:rPr>
+      </w:pPr>
+    </w:p>
+    <w:p>
+      <w:pPr>
+        <w:pStyle w:val="NormalWeb"/>
+        <w:shd w:val="clear" w:color="auto" w:fill="FFFFFF"/>
+        <w:spacing w:before="0" w:beforeAutospacing="0" w:after="225" w:afterAutospacing="0" w:line="405" w:lineRule="atLeast"/>
+        <w:rPr>
+          <w:rStyle w:val="Strong"/>
+          <w:rFonts w:ascii="Arial" w:hAnsi="Arial" w:cs="Arial"/>
+          <w:b w:val="0"/>
+          <w:bCs w:val="0"/>
+          <w:color w:val="414141"/>
+        </w:rPr>
+      </w:pPr>
+    </w:p>
+    <w:p>
+      <w:pPr>
+        <w:pStyle w:val="NormalWeb"/>
+        <w:shd w:val="clear" w:color="auto" w:fill="FFFFFF"/>
+        <w:spacing w:before="0" w:beforeAutospacing="0" w:after="225" w:afterAutospacing="0" w:line="405" w:lineRule="atLeast"/>
+        <w:rPr>
+          <w:rStyle w:val="Strong"/>
+          <w:rFonts w:ascii="Arial" w:hAnsi="Arial" w:cs="Arial"/>
+          <w:b w:val="0"/>
+          <w:bCs w:val="0"/>
+          <w:color w:val="414141"/>
+        </w:rPr>
+      </w:pPr>
+    </w:p>
+    <w:p>
+      <w:pPr>
+        <w:pStyle w:val="NormalWeb"/>
+        <w:shd w:val="clear" w:color="auto" w:fill="FFFFFF"/>
+        <w:spacing w:before="0" w:beforeAutospacing="0" w:after="225" w:afterAutospacing="0" w:line="405" w:lineRule="atLeast"/>
+        <w:rPr>
+          <w:rStyle w:val="Strong"/>
+          <w:rFonts w:ascii="Arial" w:hAnsi="Arial" w:cs="Arial"/>
+          <w:b w:val="0"/>
+          <w:bCs w:val="0"/>
+          <w:color w:val="414141"/>
+        </w:rPr>
+      </w:pPr>
     </w:p>
     <w:p>
       <w:pPr>
@@ -93,12 +419,247 @@
         <w:rPr>
           <w:rStyle w:val="Strong"/>
           <w:rFonts w:ascii="Arial" w:hAnsi="Arial" w:cs="Arial"/>
-          <w:b w:val="0"/>
-          <w:bCs w:val="0"/>
-          <w:color w:val="414141"/>
-        </w:rPr>
-        <w:t>Resolver ecuaciones varias</w:t>
-      </w:r>
+          <w:i/>
+          <w:iCs/>
+          <w:color w:val="414141"/>
+        </w:rPr>
+        <w:t>[</w:t>
+      </w:r>
+      <w:r>
+        <w:rPr>
+          <w:rStyle w:val="Strong"/>
+          <w:rFonts w:ascii="Arial" w:hAnsi="Arial" w:cs="Arial"/>
+          <w:i/>
+          <w:iCs/>
+          <w:color w:val="414141"/>
+        </w:rPr>
+        <w:t>1</w:t>
+      </w:r>
+      <w:r>
+        <w:rPr>
+          <w:rStyle w:val="Strong"/>
+          <w:rFonts w:ascii="Arial" w:hAnsi="Arial" w:cs="Arial"/>
+          <w:i/>
+          <w:iCs/>
+          <w:color w:val="414141"/>
+        </w:rPr>
+        <w:t>,5</w:t>
+      </w:r>
+      <w:r>
+        <w:rPr>
+          <w:rStyle w:val="Strong"/>
+          <w:rFonts w:ascii="Arial" w:hAnsi="Arial" w:cs="Arial"/>
+          <w:i/>
+          <w:iCs/>
+          <w:color w:val="414141"/>
+        </w:rPr>
+        <w:t xml:space="preserve"> </w:t>
+      </w:r>
+      <w:proofErr w:type="spellStart"/>
+      <w:r>
+        <w:rPr>
+          <w:rStyle w:val="Strong"/>
+          <w:rFonts w:ascii="Arial" w:hAnsi="Arial" w:cs="Arial"/>
+          <w:i/>
+          <w:iCs/>
+          <w:color w:val="414141"/>
+        </w:rPr>
+        <w:t>pts</w:t>
+      </w:r>
+      <w:proofErr w:type="spellEnd"/>
+      <w:r>
+        <w:rPr>
+          <w:rStyle w:val="Strong"/>
+          <w:rFonts w:ascii="Arial" w:hAnsi="Arial" w:cs="Arial"/>
+          <w:i/>
+          <w:iCs/>
+          <w:color w:val="414141"/>
+        </w:rPr>
+        <w:t>]</w:t>
+      </w:r>
+      <w:r>
+        <w:rPr>
+          <w:rStyle w:val="Strong"/>
+          <w:rFonts w:ascii="Arial" w:hAnsi="Arial" w:cs="Arial"/>
+          <w:b w:val="0"/>
+          <w:bCs w:val="0"/>
+          <w:color w:val="414141"/>
+        </w:rPr>
+        <w:t xml:space="preserve"> </w:t>
+      </w:r>
+      <w:r>
+        <w:rPr>
+          <w:rStyle w:val="Strong"/>
+          <w:rFonts w:ascii="Arial" w:hAnsi="Arial" w:cs="Arial"/>
+          <w:b w:val="0"/>
+          <w:bCs w:val="0"/>
+          <w:color w:val="414141"/>
+        </w:rPr>
+        <w:t>Res</w:t>
+      </w:r>
+      <w:r>
+        <w:rPr>
+          <w:rStyle w:val="Strong"/>
+          <w:rFonts w:ascii="Arial" w:hAnsi="Arial" w:cs="Arial"/>
+          <w:b w:val="0"/>
+          <w:bCs w:val="0"/>
+          <w:color w:val="414141"/>
+        </w:rPr>
+        <w:t>uelve las siguientes ecuaciones lineales:</w:t>
+      </w:r>
+    </w:p>
+    <w:tbl>
+      <w:tblPr>
+        <w:tblStyle w:val="TableGrid"/>
+        <w:tblW w:w="0" w:type="auto"/>
+        <w:tblInd w:w="0" w:type="dxa"/>
+        <w:tblLook w:val="04A0" w:firstRow="1" w:lastRow="0" w:firstColumn="1" w:lastColumn="0" w:noHBand="0" w:noVBand="1"/>
+      </w:tblPr>
+      <w:tblGrid>
+        <w:gridCol w:w="4247"/>
+        <w:gridCol w:w="4247"/>
+      </w:tblGrid>
+      <w:tr>
+        <w:tc>
+          <w:tcPr>
+            <w:tcW w:w="4247" w:type="dxa"/>
+          </w:tcPr>
+          <w:p>
+            <w:pPr>
+              <w:pStyle w:val="NormalWeb"/>
+              <w:numPr>
+                <w:ilvl w:val="1"/>
+                <w:numId w:val="8"/>
+              </w:numPr>
+              <w:spacing w:before="0" w:beforeAutospacing="0" w:after="225" w:afterAutospacing="0" w:line="405" w:lineRule="atLeast"/>
+              <w:rPr>
+                <w:rStyle w:val="Strong"/>
+                <w:rFonts w:ascii="Arial" w:hAnsi="Arial" w:cs="Arial"/>
+                <w:b w:val="0"/>
+                <w:bCs w:val="0"/>
+                <w:color w:val="414141"/>
+              </w:rPr>
+            </w:pPr>
+            <w:r>
+              <w:rPr>
+                <w:rStyle w:val="Strong"/>
+                <w:rFonts w:ascii="Arial" w:eastAsia="Times New Roman" w:hAnsi="Arial" w:cs="Arial"/>
+                <w:b w:val="0"/>
+                <w:bCs w:val="0"/>
+                <w:color w:val="414141"/>
+                <w:kern w:val="0"/>
+                <w:sz w:val="24"/>
+                <w:szCs w:val="24"/>
+                <w:lang w:eastAsia="es-ES"/>
+                <w14:ligatures w14:val="none"/>
+              </w:rPr>
+              <w:t>5x – 2 = 6 - x</w:t>
+            </w:r>
+          </w:p>
+        </w:tc>
+        <w:tc>
+          <w:tcPr>
+            <w:tcW w:w="4247" w:type="dxa"/>
+          </w:tcPr>
+          <w:p>
+            <w:pPr>
+              <w:pStyle w:val="NormalWeb"/>
+              <w:numPr>
+                <w:ilvl w:val="1"/>
+                <w:numId w:val="8"/>
+              </w:numPr>
+              <w:spacing w:before="0" w:beforeAutospacing="0" w:after="225" w:afterAutospacing="0" w:line="405" w:lineRule="atLeast"/>
+              <w:rPr>
+                <w:rStyle w:val="Strong"/>
+                <w:rFonts w:ascii="Arial" w:hAnsi="Arial" w:cs="Arial"/>
+                <w:b w:val="0"/>
+                <w:bCs w:val="0"/>
+                <w:color w:val="414141"/>
+              </w:rPr>
+            </w:pPr>
+            <w:r>
+              <w:rPr>
+                <w:rStyle w:val="Strong"/>
+                <w:rFonts w:ascii="Arial" w:hAnsi="Arial" w:cs="Arial"/>
+                <w:b w:val="0"/>
+                <w:bCs w:val="0"/>
+                <w:color w:val="414141"/>
+              </w:rPr>
+              <w:t>x / 3 + 1 = 0</w:t>
+            </w:r>
+          </w:p>
+        </w:tc>
+      </w:tr>
+    </w:tbl>
+    <w:p>
+      <w:pPr>
+        <w:pStyle w:val="NormalWeb"/>
+        <w:shd w:val="clear" w:color="auto" w:fill="FFFFFF"/>
+        <w:spacing w:before="0" w:beforeAutospacing="0" w:after="225" w:afterAutospacing="0" w:line="405" w:lineRule="atLeast"/>
+        <w:rPr>
+          <w:rStyle w:val="Strong"/>
+          <w:rFonts w:ascii="Arial" w:hAnsi="Arial" w:cs="Arial"/>
+          <w:b w:val="0"/>
+          <w:bCs w:val="0"/>
+          <w:color w:val="414141"/>
+        </w:rPr>
+      </w:pPr>
+    </w:p>
+    <w:p>
+      <w:pPr>
+        <w:pStyle w:val="NormalWeb"/>
+        <w:shd w:val="clear" w:color="auto" w:fill="FFFFFF"/>
+        <w:spacing w:before="0" w:beforeAutospacing="0" w:after="225" w:afterAutospacing="0" w:line="405" w:lineRule="atLeast"/>
+        <w:rPr>
+          <w:rStyle w:val="Strong"/>
+          <w:rFonts w:ascii="Arial" w:hAnsi="Arial" w:cs="Arial"/>
+          <w:b w:val="0"/>
+          <w:bCs w:val="0"/>
+          <w:color w:val="414141"/>
+        </w:rPr>
+      </w:pPr>
+    </w:p>
+    <w:p>
+      <w:pPr>
+        <w:pStyle w:val="NormalWeb"/>
+        <w:shd w:val="clear" w:color="auto" w:fill="FFFFFF"/>
+        <w:spacing w:before="0" w:beforeAutospacing="0" w:after="225" w:afterAutospacing="0" w:line="405" w:lineRule="atLeast"/>
+        <w:rPr>
+          <w:rStyle w:val="Strong"/>
+          <w:rFonts w:ascii="Arial" w:hAnsi="Arial" w:cs="Arial"/>
+          <w:b w:val="0"/>
+          <w:bCs w:val="0"/>
+          <w:color w:val="414141"/>
+        </w:rPr>
+      </w:pPr>
+    </w:p>
+    <w:p>
+      <w:pPr>
+        <w:pStyle w:val="NormalWeb"/>
+        <w:shd w:val="clear" w:color="auto" w:fill="FFFFFF"/>
+        <w:spacing w:before="0" w:beforeAutospacing="0" w:after="225" w:afterAutospacing="0" w:line="405" w:lineRule="atLeast"/>
+        <w:rPr>
+          <w:rStyle w:val="Strong"/>
+          <w:rFonts w:ascii="Arial" w:hAnsi="Arial" w:cs="Arial"/>
+          <w:b w:val="0"/>
+          <w:bCs w:val="0"/>
+          <w:color w:val="414141"/>
+        </w:rPr>
+      </w:pPr>
+    </w:p>
+    <w:p>
+      <w:pPr>
+        <w:pStyle w:val="NormalWeb"/>
+        <w:shd w:val="clear" w:color="auto" w:fill="FFFFFF"/>
+        <w:spacing w:before="0" w:beforeAutospacing="0" w:after="225" w:afterAutospacing="0" w:line="405" w:lineRule="atLeast"/>
+        <w:rPr>
+          <w:rStyle w:val="Strong"/>
+          <w:rFonts w:ascii="Arial" w:hAnsi="Arial" w:cs="Arial"/>
+          <w:b w:val="0"/>
+          <w:bCs w:val="0"/>
+          <w:color w:val="414141"/>
+        </w:rPr>
+      </w:pPr>
     </w:p>
     <w:p>
       <w:pPr>
@@ -121,6 +682,69 @@
         <w:rPr>
           <w:rStyle w:val="Strong"/>
           <w:rFonts w:ascii="Arial" w:hAnsi="Arial" w:cs="Arial"/>
+          <w:i/>
+          <w:iCs/>
+          <w:color w:val="414141"/>
+        </w:rPr>
+        <w:lastRenderedPageBreak/>
+        <w:t>[</w:t>
+      </w:r>
+      <w:r>
+        <w:rPr>
+          <w:rStyle w:val="Strong"/>
+          <w:rFonts w:ascii="Arial" w:hAnsi="Arial" w:cs="Arial"/>
+          <w:i/>
+          <w:iCs/>
+          <w:color w:val="414141"/>
+        </w:rPr>
+        <w:t>1</w:t>
+      </w:r>
+      <w:r>
+        <w:rPr>
+          <w:rStyle w:val="Strong"/>
+          <w:rFonts w:ascii="Arial" w:hAnsi="Arial" w:cs="Arial"/>
+          <w:i/>
+          <w:iCs/>
+          <w:color w:val="414141"/>
+        </w:rPr>
+        <w:t xml:space="preserve"> </w:t>
+      </w:r>
+      <w:proofErr w:type="spellStart"/>
+      <w:r>
+        <w:rPr>
+          <w:rStyle w:val="Strong"/>
+          <w:rFonts w:ascii="Arial" w:hAnsi="Arial" w:cs="Arial"/>
+          <w:i/>
+          <w:iCs/>
+          <w:color w:val="414141"/>
+        </w:rPr>
+        <w:t>pts</w:t>
+      </w:r>
+      <w:proofErr w:type="spellEnd"/>
+      <w:r>
+        <w:rPr>
+          <w:rStyle w:val="Strong"/>
+          <w:rFonts w:ascii="Arial" w:hAnsi="Arial" w:cs="Arial"/>
+          <w:i/>
+          <w:iCs/>
+          <w:color w:val="414141"/>
+        </w:rPr>
+        <w:t>]</w:t>
+      </w:r>
+      <w:r>
+        <w:rPr>
+          <w:rStyle w:val="Strong"/>
+          <w:rFonts w:ascii="Arial" w:hAnsi="Arial" w:cs="Arial"/>
+          <w:b w:val="0"/>
+          <w:bCs w:val="0"/>
+          <w:color w:val="414141"/>
+        </w:rPr>
+        <w:t xml:space="preserve"> </w:t>
+      </w:r>
+      <w:r>
+        <w:rPr>
+          <w:rStyle w:val="Strong"/>
+          <w:rFonts w:ascii="Arial" w:hAnsi="Arial" w:cs="Arial"/>
           <w:b w:val="0"/>
           <w:bCs w:val="0"/>
           <w:color w:val="414141"/>
@@ -159,6 +783,35 @@
     <w:p>
       <w:pPr>
         <w:pStyle w:val="NormalWeb"/>
+        <w:shd w:val="clear" w:color="auto" w:fill="FFFFFF"/>
+        <w:spacing w:before="0" w:beforeAutospacing="0" w:after="225" w:afterAutospacing="0" w:line="405" w:lineRule="atLeast"/>
+        <w:rPr>
+          <w:rStyle w:val="Strong"/>
+          <w:rFonts w:ascii="Arial" w:hAnsi="Arial" w:cs="Arial"/>
+          <w:b w:val="0"/>
+          <w:bCs w:val="0"/>
+          <w:color w:val="414141"/>
+        </w:rPr>
+      </w:pPr>
+    </w:p>
+    <w:p>
+      <w:pPr>
+        <w:pStyle w:val="NormalWeb"/>
+        <w:shd w:val="clear" w:color="auto" w:fill="FFFFFF"/>
+        <w:spacing w:before="0" w:beforeAutospacing="0" w:after="225" w:afterAutospacing="0" w:line="405" w:lineRule="atLeast"/>
+        <w:ind w:left="1440"/>
+        <w:rPr>
+          <w:rStyle w:val="Strong"/>
+          <w:rFonts w:ascii="Arial" w:hAnsi="Arial" w:cs="Arial"/>
+          <w:b w:val="0"/>
+          <w:bCs w:val="0"/>
+          <w:color w:val="414141"/>
+        </w:rPr>
+      </w:pPr>
+    </w:p>
+    <w:p>
+      <w:pPr>
+        <w:pStyle w:val="NormalWeb"/>
         <w:numPr>
           <w:ilvl w:val="1"/>
           <w:numId w:val="8"/>
@@ -211,8 +864,73 @@
           <w:bCs w:val="0"/>
           <w:color w:val="414141"/>
         </w:rPr>
-        <w:t>en la tercera evaluación para aprobar? Nota: solo aprueba si la nota final supera el 5.</w:t>
-      </w:r>
+        <w:t xml:space="preserve">en la tercera evaluación para aprobar? Nota: solo aprueba si la nota final </w:t>
+      </w:r>
+      <w:r>
+        <w:rPr>
+          <w:rStyle w:val="Strong"/>
+          <w:rFonts w:ascii="Arial" w:hAnsi="Arial" w:cs="Arial"/>
+          <w:b w:val="0"/>
+          <w:bCs w:val="0"/>
+          <w:color w:val="414141"/>
+        </w:rPr>
+        <w:t>iguala o supera</w:t>
+      </w:r>
+      <w:r>
+        <w:rPr>
+          <w:rStyle w:val="Strong"/>
+          <w:rFonts w:ascii="Arial" w:hAnsi="Arial" w:cs="Arial"/>
+          <w:b w:val="0"/>
+          <w:bCs w:val="0"/>
+          <w:color w:val="414141"/>
+        </w:rPr>
+        <w:t xml:space="preserve"> el 5.</w:t>
+      </w:r>
+    </w:p>
+    <w:p>
+      <w:pPr>
+        <w:pStyle w:val="NormalWeb"/>
+        <w:shd w:val="clear" w:color="auto" w:fill="FFFFFF"/>
+        <w:spacing w:before="0" w:beforeAutospacing="0" w:after="225" w:afterAutospacing="0" w:line="405" w:lineRule="atLeast"/>
+        <w:ind w:left="1440"/>
+        <w:rPr>
+          <w:rStyle w:val="Strong"/>
+          <w:rFonts w:ascii="Arial" w:hAnsi="Arial" w:cs="Arial"/>
+          <w:b w:val="0"/>
+          <w:bCs w:val="0"/>
+          <w:color w:val="414141"/>
+        </w:rPr>
+      </w:pPr>
+    </w:p>
+    <w:p>
+      <w:pPr>
+        <w:pStyle w:val="NormalWeb"/>
+        <w:shd w:val="clear" w:color="auto" w:fill="FFFFFF"/>
+        <w:spacing w:before="0" w:beforeAutospacing="0" w:after="225" w:afterAutospacing="0" w:line="405" w:lineRule="atLeast"/>
+        <w:ind w:left="1440"/>
+        <w:rPr>
+          <w:rStyle w:val="Strong"/>
+          <w:rFonts w:ascii="Arial" w:hAnsi="Arial" w:cs="Arial"/>
+          <w:b w:val="0"/>
+          <w:bCs w:val="0"/>
+          <w:color w:val="414141"/>
+        </w:rPr>
+      </w:pPr>
+    </w:p>
+    <w:p>
+      <w:pPr>
+        <w:pStyle w:val="NormalWeb"/>
+        <w:shd w:val="clear" w:color="auto" w:fill="FFFFFF"/>
+        <w:spacing w:before="0" w:beforeAutospacing="0" w:after="225" w:afterAutospacing="0" w:line="405" w:lineRule="atLeast"/>
+        <w:ind w:left="1440"/>
+        <w:rPr>
+          <w:rStyle w:val="Strong"/>
+          <w:rFonts w:ascii="Arial" w:hAnsi="Arial" w:cs="Arial"/>
+          <w:b w:val="0"/>
+          <w:bCs w:val="0"/>
+          <w:color w:val="414141"/>
+        </w:rPr>
+      </w:pPr>
     </w:p>
     <w:p>
       <w:pPr>
@@ -235,11 +953,755 @@
         <w:rPr>
           <w:rStyle w:val="Strong"/>
           <w:rFonts w:ascii="Arial" w:hAnsi="Arial" w:cs="Arial"/>
-          <w:b w:val="0"/>
-          <w:bCs w:val="0"/>
-          <w:color w:val="414141"/>
-        </w:rPr>
-        <w:t>Funciones interpretar gráfica</w:t>
+          <w:i/>
+          <w:iCs/>
+          <w:color w:val="414141"/>
+        </w:rPr>
+        <w:t>[</w:t>
+      </w:r>
+      <w:r>
+        <w:rPr>
+          <w:rStyle w:val="Strong"/>
+          <w:rFonts w:ascii="Arial" w:hAnsi="Arial" w:cs="Arial"/>
+          <w:i/>
+          <w:iCs/>
+          <w:color w:val="414141"/>
+        </w:rPr>
+        <w:t>2</w:t>
+      </w:r>
+      <w:r>
+        <w:rPr>
+          <w:rStyle w:val="Strong"/>
+          <w:rFonts w:ascii="Arial" w:hAnsi="Arial" w:cs="Arial"/>
+          <w:i/>
+          <w:iCs/>
+          <w:color w:val="414141"/>
+        </w:rPr>
+        <w:t xml:space="preserve"> pt</w:t>
+      </w:r>
+      <w:proofErr w:type="spellStart"/>
+      <w:r>
+        <w:rPr>
+          <w:rStyle w:val="Strong"/>
+          <w:rFonts w:ascii="Arial" w:hAnsi="Arial" w:cs="Arial"/>
+          <w:i/>
+          <w:iCs/>
+          <w:color w:val="414141"/>
+        </w:rPr>
+        <w:t>s</w:t>
+      </w:r>
+      <w:proofErr w:type="spellEnd"/>
+      <w:r>
+        <w:rPr>
+          <w:rStyle w:val="Strong"/>
+          <w:rFonts w:ascii="Arial" w:hAnsi="Arial" w:cs="Arial"/>
+          <w:i/>
+          <w:iCs/>
+          <w:color w:val="414141"/>
+        </w:rPr>
+        <w:t>]</w:t>
+      </w:r>
+      <w:r>
+        <w:rPr>
+          <w:rStyle w:val="Strong"/>
+          <w:rFonts w:ascii="Arial" w:hAnsi="Arial" w:cs="Arial"/>
+          <w:b w:val="0"/>
+          <w:bCs w:val="0"/>
+          <w:color w:val="414141"/>
+        </w:rPr>
+        <w:t xml:space="preserve"> </w:t>
+      </w:r>
+      <w:r>
+        <w:rPr>
+          <w:rStyle w:val="Strong"/>
+          <w:rFonts w:ascii="Arial" w:hAnsi="Arial" w:cs="Arial"/>
+          <w:b w:val="0"/>
+          <w:bCs w:val="0"/>
+          <w:color w:val="414141"/>
+        </w:rPr>
+        <w:t xml:space="preserve">En la </w:t>
+      </w:r>
+      <w:r>
+        <w:rPr>
+          <w:rStyle w:val="Strong"/>
+          <w:rFonts w:ascii="Arial" w:hAnsi="Arial" w:cs="Arial"/>
+          <w:i/>
+          <w:iCs/>
+          <w:color w:val="414141"/>
+        </w:rPr>
+        <w:t>figura</w:t>
+      </w:r>
+      <w:r>
+        <w:rPr>
+          <w:rStyle w:val="Strong"/>
+          <w:rFonts w:ascii="Arial" w:hAnsi="Arial" w:cs="Arial"/>
+          <w:i/>
+          <w:iCs/>
+          <w:color w:val="414141"/>
+        </w:rPr>
+        <w:t xml:space="preserve"> 1</w:t>
+      </w:r>
+      <w:r>
+        <w:rPr>
+          <w:rStyle w:val="Strong"/>
+          <w:rFonts w:ascii="Arial" w:hAnsi="Arial" w:cs="Arial"/>
+          <w:b w:val="0"/>
+          <w:bCs w:val="0"/>
+          <w:color w:val="414141"/>
+        </w:rPr>
+        <w:t xml:space="preserve"> se muestra</w:t>
+      </w:r>
+      <w:r>
+        <w:rPr>
+          <w:rStyle w:val="Strong"/>
+          <w:rFonts w:ascii="Arial" w:hAnsi="Arial" w:cs="Arial"/>
+          <w:b w:val="0"/>
+          <w:bCs w:val="0"/>
+          <w:color w:val="414141"/>
+        </w:rPr>
+        <w:t xml:space="preserve"> una gráfica de</w:t>
+      </w:r>
+      <w:r>
+        <w:rPr>
+          <w:rStyle w:val="Strong"/>
+          <w:rFonts w:ascii="Arial" w:hAnsi="Arial" w:cs="Arial"/>
+          <w:b w:val="0"/>
+          <w:bCs w:val="0"/>
+          <w:color w:val="414141"/>
+        </w:rPr>
+        <w:t xml:space="preserve"> los ingresos y gastos diarios en una tienda de zapatos en función del número de pares vendidos.</w:t>
+      </w:r>
+    </w:p>
+    <w:p>
+      <w:pPr>
+        <w:pStyle w:val="NormalWeb"/>
+        <w:shd w:val="clear" w:color="auto" w:fill="FFFFFF"/>
+        <w:spacing w:before="0" w:beforeAutospacing="0" w:after="225" w:afterAutospacing="0" w:line="405" w:lineRule="atLeast"/>
+        <w:rPr>
+          <w:rStyle w:val="Strong"/>
+          <w:rFonts w:ascii="Arial" w:hAnsi="Arial" w:cs="Arial"/>
+          <w:b w:val="0"/>
+          <w:bCs w:val="0"/>
+          <w:color w:val="414141"/>
+        </w:rPr>
+      </w:pPr>
+    </w:p>
+    <w:p>
+      <w:pPr>
+        <w:pStyle w:val="NormalWeb"/>
+        <w:numPr>
+          <w:ilvl w:val="1"/>
+          <w:numId w:val="8"/>
+        </w:numPr>
+        <w:shd w:val="clear" w:color="auto" w:fill="FFFFFF"/>
+        <w:spacing w:before="0" w:beforeAutospacing="0" w:after="225" w:afterAutospacing="0" w:line="405" w:lineRule="atLeast"/>
+        <w:rPr>
+          <w:rStyle w:val="Strong"/>
+          <w:rFonts w:ascii="Arial" w:hAnsi="Arial" w:cs="Arial"/>
+          <w:b w:val="0"/>
+          <w:bCs w:val="0"/>
+          <w:color w:val="414141"/>
+        </w:rPr>
+      </w:pPr>
+      <w:r>
+        <w:rPr>
+          <w:rStyle w:val="Strong"/>
+          <w:rFonts w:ascii="Arial" w:hAnsi="Arial" w:cs="Arial"/>
+          <w:b w:val="0"/>
+          <w:bCs w:val="0"/>
+          <w:color w:val="414141"/>
+        </w:rPr>
+        <w:t>¿Cuánto gasto genera al vender 2</w:t>
+      </w:r>
+      <w:r>
+        <w:rPr>
+          <w:rStyle w:val="Strong"/>
+          <w:rFonts w:ascii="Arial" w:hAnsi="Arial" w:cs="Arial"/>
+          <w:b w:val="0"/>
+          <w:bCs w:val="0"/>
+          <w:color w:val="414141"/>
+        </w:rPr>
+        <w:t>4</w:t>
+      </w:r>
+      <w:r>
+        <w:rPr>
+          <w:rStyle w:val="Strong"/>
+          <w:rFonts w:ascii="Arial" w:hAnsi="Arial" w:cs="Arial"/>
+          <w:b w:val="0"/>
+          <w:bCs w:val="0"/>
+          <w:color w:val="414141"/>
+        </w:rPr>
+        <w:t xml:space="preserve">0 pares de zapatos? ¿Cuánto dinero ingresa? </w:t>
+      </w:r>
+    </w:p>
+    <w:p>
+      <w:pPr>
+        <w:pStyle w:val="NormalWeb"/>
+        <w:shd w:val="clear" w:color="auto" w:fill="FFFFFF"/>
+        <w:spacing w:before="0" w:beforeAutospacing="0" w:after="225" w:afterAutospacing="0" w:line="405" w:lineRule="atLeast"/>
+        <w:ind w:left="1440"/>
+        <w:rPr>
+          <w:rStyle w:val="Strong"/>
+          <w:rFonts w:ascii="Arial" w:hAnsi="Arial" w:cs="Arial"/>
+          <w:b w:val="0"/>
+          <w:bCs w:val="0"/>
+          <w:color w:val="414141"/>
+        </w:rPr>
+      </w:pPr>
+    </w:p>
+    <w:p>
+      <w:pPr>
+        <w:pStyle w:val="NormalWeb"/>
+        <w:numPr>
+          <w:ilvl w:val="1"/>
+          <w:numId w:val="8"/>
+        </w:numPr>
+        <w:shd w:val="clear" w:color="auto" w:fill="FFFFFF"/>
+        <w:spacing w:before="0" w:beforeAutospacing="0" w:after="225" w:afterAutospacing="0" w:line="405" w:lineRule="atLeast"/>
+        <w:rPr>
+          <w:rStyle w:val="Strong"/>
+          <w:rFonts w:ascii="Arial" w:hAnsi="Arial" w:cs="Arial"/>
+          <w:b w:val="0"/>
+          <w:bCs w:val="0"/>
+          <w:color w:val="414141"/>
+        </w:rPr>
+      </w:pPr>
+      <w:r>
+        <w:rPr>
+          <w:rStyle w:val="Strong"/>
+          <w:rFonts w:ascii="Arial" w:hAnsi="Arial" w:cs="Arial"/>
+          <w:b w:val="0"/>
+          <w:bCs w:val="0"/>
+          <w:color w:val="414141"/>
+        </w:rPr>
+        <w:t>¿Le sale rentable vender esa cantidad de</w:t>
+      </w:r>
+      <w:r>
+        <w:rPr>
+          <w:rStyle w:val="Strong"/>
+          <w:rFonts w:ascii="Arial" w:hAnsi="Arial" w:cs="Arial"/>
+          <w:b w:val="0"/>
+          <w:bCs w:val="0"/>
+          <w:color w:val="414141"/>
+        </w:rPr>
+        <w:t xml:space="preserve"> 240</w:t>
+      </w:r>
+      <w:r>
+        <w:rPr>
+          <w:rStyle w:val="Strong"/>
+          <w:rFonts w:ascii="Arial" w:hAnsi="Arial" w:cs="Arial"/>
+          <w:b w:val="0"/>
+          <w:bCs w:val="0"/>
+          <w:color w:val="414141"/>
+        </w:rPr>
+        <w:t xml:space="preserve"> zapatos?</w:t>
+      </w:r>
+      <w:r>
+        <w:rPr>
+          <w:rStyle w:val="Strong"/>
+          <w:rFonts w:ascii="Arial" w:hAnsi="Arial" w:cs="Arial"/>
+          <w:b w:val="0"/>
+          <w:bCs w:val="0"/>
+          <w:color w:val="414141"/>
+        </w:rPr>
+        <w:t xml:space="preserve"> ¿Por qué?</w:t>
+      </w:r>
+    </w:p>
+    <w:p>
+      <w:pPr>
+        <w:pStyle w:val="NormalWeb"/>
+        <w:shd w:val="clear" w:color="auto" w:fill="FFFFFF"/>
+        <w:spacing w:before="0" w:beforeAutospacing="0" w:after="225" w:afterAutospacing="0" w:line="405" w:lineRule="atLeast"/>
+        <w:ind w:left="1440"/>
+        <w:rPr>
+          <w:rStyle w:val="Strong"/>
+          <w:rFonts w:ascii="Arial" w:hAnsi="Arial" w:cs="Arial"/>
+          <w:b w:val="0"/>
+          <w:bCs w:val="0"/>
+          <w:color w:val="414141"/>
+        </w:rPr>
+      </w:pPr>
+    </w:p>
+    <w:p>
+      <w:pPr>
+        <w:pStyle w:val="NormalWeb"/>
+        <w:shd w:val="clear" w:color="auto" w:fill="FFFFFF"/>
+        <w:spacing w:before="0" w:beforeAutospacing="0" w:after="225" w:afterAutospacing="0" w:line="405" w:lineRule="atLeast"/>
+        <w:ind w:left="1440"/>
+        <w:rPr>
+          <w:rStyle w:val="Strong"/>
+          <w:rFonts w:ascii="Arial" w:hAnsi="Arial" w:cs="Arial"/>
+          <w:b w:val="0"/>
+          <w:bCs w:val="0"/>
+          <w:color w:val="414141"/>
+        </w:rPr>
+      </w:pPr>
+    </w:p>
+    <w:p>
+      <w:pPr>
+        <w:pStyle w:val="NormalWeb"/>
+        <w:numPr>
+          <w:ilvl w:val="1"/>
+          <w:numId w:val="8"/>
+        </w:numPr>
+        <w:shd w:val="clear" w:color="auto" w:fill="FFFFFF"/>
+        <w:spacing w:before="0" w:beforeAutospacing="0" w:after="225" w:afterAutospacing="0" w:line="405" w:lineRule="atLeast"/>
+        <w:rPr>
+          <w:rStyle w:val="Strong"/>
+          <w:rFonts w:ascii="Arial" w:hAnsi="Arial" w:cs="Arial"/>
+          <w:b w:val="0"/>
+          <w:bCs w:val="0"/>
+          <w:color w:val="414141"/>
+        </w:rPr>
+      </w:pPr>
+      <w:r>
+        <w:rPr>
+          <w:rStyle w:val="Strong"/>
+          <w:rFonts w:ascii="Arial" w:hAnsi="Arial" w:cs="Arial"/>
+          <w:b w:val="0"/>
+          <w:bCs w:val="0"/>
+          <w:color w:val="414141"/>
+        </w:rPr>
+        <w:t>¿Cuántos pares tiene que vender en total para no ganar ni perder dinero?</w:t>
+      </w:r>
+    </w:p>
+    <w:p>
+      <w:pPr>
+        <w:pStyle w:val="NormalWeb"/>
+        <w:shd w:val="clear" w:color="auto" w:fill="FFFFFF"/>
+        <w:spacing w:before="0" w:beforeAutospacing="0" w:after="225" w:afterAutospacing="0" w:line="405" w:lineRule="atLeast"/>
+        <w:rPr>
+          <w:rStyle w:val="Strong"/>
+          <w:rFonts w:ascii="Arial" w:hAnsi="Arial" w:cs="Arial"/>
+          <w:b w:val="0"/>
+          <w:bCs w:val="0"/>
+          <w:color w:val="414141"/>
+        </w:rPr>
+      </w:pPr>
+    </w:p>
+    <w:p>
+      <w:pPr>
+        <w:pStyle w:val="NormalWeb"/>
+        <w:numPr>
+          <w:ilvl w:val="1"/>
+          <w:numId w:val="8"/>
+        </w:numPr>
+        <w:shd w:val="clear" w:color="auto" w:fill="FFFFFF"/>
+        <w:spacing w:before="0" w:beforeAutospacing="0" w:after="225" w:afterAutospacing="0" w:line="405" w:lineRule="atLeast"/>
+        <w:rPr>
+          <w:rStyle w:val="Strong"/>
+          <w:rFonts w:ascii="Arial" w:hAnsi="Arial" w:cs="Arial"/>
+          <w:b w:val="0"/>
+          <w:bCs w:val="0"/>
+          <w:color w:val="414141"/>
+        </w:rPr>
+      </w:pPr>
+      <w:r>
+        <w:rPr>
+          <w:rStyle w:val="Strong"/>
+          <w:rFonts w:ascii="Arial" w:hAnsi="Arial" w:cs="Arial"/>
+          <w:b w:val="0"/>
+          <w:bCs w:val="0"/>
+          <w:color w:val="414141"/>
+        </w:rPr>
+        <w:t xml:space="preserve">¿Qué cantidad tiene que vender para </w:t>
+      </w:r>
+      <w:r>
+        <w:rPr>
+          <w:rStyle w:val="Strong"/>
+          <w:rFonts w:ascii="Arial" w:hAnsi="Arial" w:cs="Arial"/>
+          <w:b w:val="0"/>
+          <w:bCs w:val="0"/>
+          <w:color w:val="414141"/>
+        </w:rPr>
+        <w:t>ganar</w:t>
+      </w:r>
+      <w:r>
+        <w:rPr>
+          <w:rStyle w:val="Strong"/>
+          <w:rFonts w:ascii="Arial" w:hAnsi="Arial" w:cs="Arial"/>
+          <w:b w:val="0"/>
+          <w:bCs w:val="0"/>
+          <w:color w:val="414141"/>
+        </w:rPr>
+        <w:t xml:space="preserve"> 1000 euros netos (o sea que lo que gana menos lo que gasta d</w:t>
+      </w:r>
+      <w:r>
+        <w:rPr>
+          <w:rStyle w:val="Strong"/>
+          <w:rFonts w:ascii="Arial" w:hAnsi="Arial" w:cs="Arial"/>
+          <w:b w:val="0"/>
+          <w:bCs w:val="0"/>
+          <w:color w:val="414141"/>
+        </w:rPr>
+        <w:t>é</w:t>
+      </w:r>
+      <w:r>
+        <w:rPr>
+          <w:rStyle w:val="Strong"/>
+          <w:rFonts w:ascii="Arial" w:hAnsi="Arial" w:cs="Arial"/>
+          <w:b w:val="0"/>
+          <w:bCs w:val="0"/>
+          <w:color w:val="414141"/>
+        </w:rPr>
+        <w:t xml:space="preserve"> 1000 euros)? </w:t>
+      </w:r>
+    </w:p>
+    <w:p>
+      <w:pPr>
+        <w:pStyle w:val="NormalWeb"/>
+        <w:shd w:val="clear" w:color="auto" w:fill="FFFFFF"/>
+        <w:spacing w:before="0" w:beforeAutospacing="0" w:after="225" w:afterAutospacing="0" w:line="405" w:lineRule="atLeast"/>
+        <w:ind w:left="1440"/>
+        <w:rPr>
+          <w:rStyle w:val="Strong"/>
+          <w:rFonts w:ascii="Arial" w:hAnsi="Arial" w:cs="Arial"/>
+          <w:b w:val="0"/>
+          <w:bCs w:val="0"/>
+          <w:color w:val="414141"/>
+        </w:rPr>
+      </w:pPr>
+    </w:p>
+    <w:p>
+      <w:pPr>
+        <w:pStyle w:val="NormalWeb"/>
+        <w:numPr>
+          <w:ilvl w:val="1"/>
+          <w:numId w:val="8"/>
+        </w:numPr>
+        <w:shd w:val="clear" w:color="auto" w:fill="FFFFFF"/>
+        <w:spacing w:before="0" w:beforeAutospacing="0" w:after="225" w:afterAutospacing="0" w:line="405" w:lineRule="atLeast"/>
+        <w:rPr>
+          <w:rStyle w:val="Strong"/>
+          <w:rFonts w:ascii="Arial" w:hAnsi="Arial" w:cs="Arial"/>
+          <w:b w:val="0"/>
+          <w:bCs w:val="0"/>
+          <w:color w:val="414141"/>
+        </w:rPr>
+      </w:pPr>
+      <w:r>
+        <w:rPr>
+          <w:rStyle w:val="Strong"/>
+          <w:rFonts w:ascii="Arial" w:hAnsi="Arial" w:cs="Arial"/>
+          <w:b w:val="0"/>
+          <w:bCs w:val="0"/>
+          <w:color w:val="414141"/>
+        </w:rPr>
+        <w:t xml:space="preserve">Si la tienda vende de media 120 pares al día, ¿cuánto dinero neto gana en una semana, sabiendo que cierra los domingos? </w:t>
+      </w:r>
+    </w:p>
+    <w:p>
+      <w:pPr>
+        <w:pStyle w:val="NormalWeb"/>
+        <w:shd w:val="clear" w:color="auto" w:fill="FFFFFF"/>
+        <w:spacing w:before="0" w:beforeAutospacing="0" w:after="225" w:afterAutospacing="0" w:line="405" w:lineRule="atLeast"/>
+        <w:rPr>
+          <w:rStyle w:val="Strong"/>
+          <w:rFonts w:ascii="Arial" w:hAnsi="Arial" w:cs="Arial"/>
+          <w:b w:val="0"/>
+          <w:bCs w:val="0"/>
+          <w:color w:val="414141"/>
+        </w:rPr>
+      </w:pPr>
+    </w:p>
+    <w:p>
+      <w:pPr>
+        <w:pStyle w:val="NormalWeb"/>
+        <w:numPr>
+          <w:ilvl w:val="1"/>
+          <w:numId w:val="8"/>
+        </w:numPr>
+        <w:shd w:val="clear" w:color="auto" w:fill="FFFFFF"/>
+        <w:spacing w:before="0" w:beforeAutospacing="0" w:after="225" w:afterAutospacing="0" w:line="405" w:lineRule="atLeast"/>
+        <w:rPr>
+          <w:rStyle w:val="Strong"/>
+          <w:rFonts w:ascii="Arial" w:hAnsi="Arial" w:cs="Arial"/>
+          <w:b w:val="0"/>
+          <w:bCs w:val="0"/>
+          <w:color w:val="414141"/>
+        </w:rPr>
+      </w:pPr>
+      <w:r>
+        <w:rPr>
+          <w:rStyle w:val="Strong"/>
+          <w:rFonts w:ascii="Arial" w:hAnsi="Arial" w:cs="Arial"/>
+          <w:b w:val="0"/>
+          <w:bCs w:val="0"/>
+          <w:color w:val="414141"/>
+        </w:rPr>
+        <w:t>En la calle de al lado se monta un mercadillo en el que venden alpargatas</w:t>
+      </w:r>
+      <w:r>
+        <w:rPr>
+          <w:rStyle w:val="Strong"/>
+          <w:rFonts w:ascii="Arial" w:hAnsi="Arial" w:cs="Arial"/>
+          <w:b w:val="0"/>
+          <w:bCs w:val="0"/>
+          <w:color w:val="414141"/>
+        </w:rPr>
+        <w:t xml:space="preserve">. </w:t>
+      </w:r>
+      <w:r>
+        <w:rPr>
+          <w:rStyle w:val="Strong"/>
+          <w:rFonts w:ascii="Arial" w:hAnsi="Arial" w:cs="Arial"/>
+          <w:b w:val="0"/>
+          <w:bCs w:val="0"/>
+          <w:color w:val="414141"/>
+        </w:rPr>
+        <w:t xml:space="preserve">Ahí todos los pares valen lo mismo. Alberto, el dueño del puesto, ayer vendió </w:t>
+      </w:r>
+      <w:r>
+        <w:rPr>
+          <w:rStyle w:val="Strong"/>
+          <w:rFonts w:ascii="Arial" w:hAnsi="Arial" w:cs="Arial"/>
+          <w:b w:val="0"/>
+          <w:bCs w:val="0"/>
+          <w:color w:val="414141"/>
+        </w:rPr>
+        <w:t>80</w:t>
+      </w:r>
+      <w:r>
+        <w:rPr>
+          <w:rStyle w:val="Strong"/>
+          <w:rFonts w:ascii="Arial" w:hAnsi="Arial" w:cs="Arial"/>
+          <w:b w:val="0"/>
+          <w:bCs w:val="0"/>
+          <w:color w:val="414141"/>
+        </w:rPr>
+        <w:t xml:space="preserve"> pares por 2000 euros. ¿Cuántos tiene que vender hoy para </w:t>
+      </w:r>
+      <w:r>
+        <w:rPr>
+          <w:rStyle w:val="Strong"/>
+          <w:rFonts w:ascii="Arial" w:hAnsi="Arial" w:cs="Arial"/>
+          <w:b w:val="0"/>
+          <w:bCs w:val="0"/>
+          <w:color w:val="414141"/>
+        </w:rPr>
+        <w:t>ingresar</w:t>
+      </w:r>
+      <w:r>
+        <w:rPr>
+          <w:rStyle w:val="Strong"/>
+          <w:rFonts w:ascii="Arial" w:hAnsi="Arial" w:cs="Arial"/>
+          <w:b w:val="0"/>
+          <w:bCs w:val="0"/>
+          <w:color w:val="414141"/>
+        </w:rPr>
+        <w:t xml:space="preserve"> los primeros 500 euros del día?</w:t>
+      </w:r>
+    </w:p>
+    <w:p>
+      <w:pPr>
+        <w:pStyle w:val="ListParagraph"/>
+        <w:rPr>
+          <w:rStyle w:val="Strong"/>
+          <w:rFonts w:ascii="Arial" w:hAnsi="Arial" w:cs="Arial"/>
+          <w:b w:val="0"/>
+          <w:bCs w:val="0"/>
+          <w:color w:val="414141"/>
+        </w:rPr>
+      </w:pPr>
+    </w:p>
+    <w:p>
+      <w:pPr>
+        <w:pStyle w:val="NormalWeb"/>
+        <w:shd w:val="clear" w:color="auto" w:fill="FFFFFF"/>
+        <w:spacing w:before="0" w:beforeAutospacing="0" w:after="225" w:afterAutospacing="0" w:line="405" w:lineRule="atLeast"/>
+        <w:ind w:left="1440"/>
+        <w:rPr>
+          <w:rStyle w:val="Strong"/>
+          <w:rFonts w:ascii="Arial" w:hAnsi="Arial" w:cs="Arial"/>
+          <w:b w:val="0"/>
+          <w:bCs w:val="0"/>
+          <w:color w:val="414141"/>
+        </w:rPr>
+      </w:pPr>
+    </w:p>
+    <w:p>
+      <w:pPr>
+        <w:pStyle w:val="NormalWeb"/>
+        <w:numPr>
+          <w:ilvl w:val="1"/>
+          <w:numId w:val="8"/>
+        </w:numPr>
+        <w:shd w:val="clear" w:color="auto" w:fill="FFFFFF"/>
+        <w:spacing w:before="0" w:beforeAutospacing="0" w:after="225" w:afterAutospacing="0" w:line="405" w:lineRule="atLeast"/>
+        <w:rPr>
+          <w:rStyle w:val="Strong"/>
+          <w:rFonts w:ascii="Arial" w:hAnsi="Arial" w:cs="Arial"/>
+          <w:b w:val="0"/>
+          <w:bCs w:val="0"/>
+          <w:color w:val="414141"/>
+        </w:rPr>
+      </w:pPr>
+      <w:r>
+        <w:rPr>
+          <w:rStyle w:val="Strong"/>
+          <w:rFonts w:ascii="Arial" w:hAnsi="Arial" w:cs="Arial"/>
+          <w:b w:val="0"/>
+          <w:bCs w:val="0"/>
+          <w:color w:val="414141"/>
+        </w:rPr>
+        <w:t xml:space="preserve">Dibuja en la misma gráfica la función que representa el dinero </w:t>
+      </w:r>
+      <w:r>
+        <w:rPr>
+          <w:rStyle w:val="Strong"/>
+          <w:rFonts w:ascii="Arial" w:hAnsi="Arial" w:cs="Arial"/>
+          <w:b w:val="0"/>
+          <w:bCs w:val="0"/>
+          <w:color w:val="414141"/>
+        </w:rPr>
+        <w:t>ingresado</w:t>
+      </w:r>
+      <w:r>
+        <w:rPr>
+          <w:rStyle w:val="Strong"/>
+          <w:rFonts w:ascii="Arial" w:hAnsi="Arial" w:cs="Arial"/>
+          <w:b w:val="0"/>
+          <w:bCs w:val="0"/>
+          <w:color w:val="414141"/>
+        </w:rPr>
+        <w:t xml:space="preserve"> por Alberto frente al número de pares de alpargatas vendid</w:t>
+      </w:r>
+      <w:r>
+        <w:rPr>
+          <w:rStyle w:val="Strong"/>
+          <w:rFonts w:ascii="Arial" w:hAnsi="Arial" w:cs="Arial"/>
+          <w:b w:val="0"/>
+          <w:bCs w:val="0"/>
+          <w:color w:val="414141"/>
+        </w:rPr>
+        <w:t>as</w:t>
+      </w:r>
+      <w:r>
+        <w:rPr>
+          <w:rStyle w:val="Strong"/>
+          <w:rFonts w:ascii="Arial" w:hAnsi="Arial" w:cs="Arial"/>
+          <w:b w:val="0"/>
+          <w:bCs w:val="0"/>
+          <w:color w:val="414141"/>
+        </w:rPr>
+        <w:t>.</w:t>
+      </w:r>
+    </w:p>
+    <w:p>
+      <w:pPr>
+        <w:pStyle w:val="NormalWeb"/>
+        <w:numPr>
+          <w:ilvl w:val="1"/>
+          <w:numId w:val="8"/>
+        </w:numPr>
+        <w:shd w:val="clear" w:color="auto" w:fill="FFFFFF"/>
+        <w:spacing w:before="0" w:beforeAutospacing="0" w:after="225" w:afterAutospacing="0" w:line="405" w:lineRule="atLeast"/>
+        <w:rPr>
+          <w:rStyle w:val="Strong"/>
+          <w:rFonts w:ascii="Arial" w:hAnsi="Arial" w:cs="Arial"/>
+          <w:b w:val="0"/>
+          <w:bCs w:val="0"/>
+          <w:color w:val="414141"/>
+        </w:rPr>
+      </w:pPr>
+      <w:r>
+        <w:rPr>
+          <w:rStyle w:val="Strong"/>
+          <w:rFonts w:ascii="Arial" w:hAnsi="Arial" w:cs="Arial"/>
+          <w:b w:val="0"/>
+          <w:bCs w:val="0"/>
+          <w:color w:val="414141"/>
+        </w:rPr>
+        <w:t xml:space="preserve">Indica la forma algebraica de la función dibujada: </w:t>
+      </w:r>
+    </w:p>
+    <w:p>
+      <w:pPr>
+        <w:pStyle w:val="NormalWeb"/>
+        <w:shd w:val="clear" w:color="auto" w:fill="FFFFFF"/>
+        <w:spacing w:before="0" w:beforeAutospacing="0" w:after="225" w:afterAutospacing="0" w:line="405" w:lineRule="atLeast"/>
+        <w:ind w:left="1440"/>
+        <w:rPr>
+          <w:rStyle w:val="Strong"/>
+          <w:rFonts w:ascii="Arial" w:hAnsi="Arial" w:cs="Arial"/>
+          <w:b w:val="0"/>
+          <w:bCs w:val="0"/>
+          <w:color w:val="FFFFFF" w:themeColor="background1"/>
+          <w:u w:val="single"/>
+        </w:rPr>
+      </w:pPr>
+      <w:r>
+        <w:rPr>
+          <w:rStyle w:val="Strong"/>
+          <w:rFonts w:ascii="Arial" w:hAnsi="Arial" w:cs="Arial"/>
+          <w:b w:val="0"/>
+          <w:bCs w:val="0"/>
+          <w:color w:val="414141"/>
+        </w:rPr>
+        <w:t xml:space="preserve">f(x) = </w:t>
+      </w:r>
+      <w:r>
+        <w:rPr>
+          <w:rStyle w:val="Strong"/>
+          <w:rFonts w:ascii="Arial" w:hAnsi="Arial" w:cs="Arial"/>
+          <w:b w:val="0"/>
+          <w:bCs w:val="0"/>
+          <w:color w:val="414141"/>
+          <w:u w:val="single"/>
+        </w:rPr>
+        <w:t xml:space="preserve">              </w:t>
+      </w:r>
+      <w:proofErr w:type="gramStart"/>
+      <w:r>
+        <w:rPr>
+          <w:rStyle w:val="Strong"/>
+          <w:rFonts w:ascii="Arial" w:hAnsi="Arial" w:cs="Arial"/>
+          <w:b w:val="0"/>
+          <w:bCs w:val="0"/>
+          <w:color w:val="414141"/>
+          <w:u w:val="single"/>
+        </w:rPr>
+        <w:t xml:space="preserve"> </w:t>
+      </w:r>
+      <w:r>
+        <w:rPr>
+          <w:rStyle w:val="Strong"/>
+          <w:rFonts w:ascii="Arial" w:hAnsi="Arial" w:cs="Arial"/>
+          <w:b w:val="0"/>
+          <w:bCs w:val="0"/>
+          <w:color w:val="FFFFFF" w:themeColor="background1"/>
+          <w:u w:val="single"/>
+        </w:rPr>
+        <w:t xml:space="preserve"> .</w:t>
+      </w:r>
+      <w:proofErr w:type="gramEnd"/>
+    </w:p>
+    <w:p>
+      <w:pPr>
+        <w:pStyle w:val="NormalWeb"/>
+        <w:numPr>
+          <w:ilvl w:val="1"/>
+          <w:numId w:val="8"/>
+        </w:numPr>
+        <w:shd w:val="clear" w:color="auto" w:fill="FFFFFF"/>
+        <w:spacing w:before="0" w:beforeAutospacing="0" w:after="225" w:afterAutospacing="0" w:line="405" w:lineRule="atLeast"/>
+        <w:rPr>
+          <w:rStyle w:val="Strong"/>
+          <w:rFonts w:ascii="Arial" w:hAnsi="Arial" w:cs="Arial"/>
+          <w:b w:val="0"/>
+          <w:bCs w:val="0"/>
+          <w:color w:val="414141"/>
+        </w:rPr>
+      </w:pPr>
+      <w:r>
+        <w:rPr>
+          <w:rStyle w:val="Strong"/>
+          <w:rFonts w:ascii="Arial" w:hAnsi="Arial" w:cs="Arial"/>
+          <w:i/>
+          <w:iCs/>
+          <w:color w:val="414141"/>
+        </w:rPr>
+        <w:t>EXTRA</w:t>
       </w:r>
       <w:r>
         <w:rPr>
@@ -251,104 +1713,44 @@
         </w:rPr>
         <w:t xml:space="preserve">: </w:t>
       </w:r>
-      <w:proofErr w:type="spellStart"/>
-      <w:r>
-        <w:rPr>
-          <w:rStyle w:val="Strong"/>
-          <w:rFonts w:ascii="Arial" w:hAnsi="Arial" w:cs="Arial"/>
-          <w:b w:val="0"/>
-          <w:bCs w:val="0"/>
-          <w:color w:val="414141"/>
-        </w:rPr>
-        <w:t>ej</w:t>
-      </w:r>
-      <w:proofErr w:type="spellEnd"/>
-      <w:r>
-        <w:rPr>
-          <w:rStyle w:val="Strong"/>
-          <w:rFonts w:ascii="Arial" w:hAnsi="Arial" w:cs="Arial"/>
-          <w:b w:val="0"/>
-          <w:bCs w:val="0"/>
-          <w:color w:val="414141"/>
-        </w:rPr>
-        <w:t xml:space="preserve"> 19 y/o 20 de avión </w:t>
-      </w:r>
-      <w:proofErr w:type="spellStart"/>
-      <w:r>
-        <w:rPr>
-          <w:rStyle w:val="Strong"/>
-          <w:rFonts w:ascii="Arial" w:hAnsi="Arial" w:cs="Arial"/>
-          <w:b w:val="0"/>
-          <w:bCs w:val="0"/>
-          <w:color w:val="414141"/>
-        </w:rPr>
-        <w:t>helic</w:t>
-      </w:r>
-      <w:proofErr w:type="spellEnd"/>
-      <w:r>
-        <w:rPr>
-          <w:rStyle w:val="Strong"/>
-          <w:rFonts w:ascii="Arial" w:hAnsi="Arial" w:cs="Arial"/>
-          <w:b w:val="0"/>
-          <w:bCs w:val="0"/>
-          <w:color w:val="414141"/>
-        </w:rPr>
-        <w:t xml:space="preserve"> y bus o de ingresos y gastos</w:t>
-      </w:r>
-      <w:r>
-        <w:rPr>
-          <w:rStyle w:val="Strong"/>
-          <w:rFonts w:ascii="Arial" w:hAnsi="Arial" w:cs="Arial"/>
-          <w:b w:val="0"/>
-          <w:bCs w:val="0"/>
-          <w:color w:val="414141"/>
-        </w:rPr>
-        <w:t xml:space="preserve"> (en este que dibujen la recta de gastos por otro proveedor. </w:t>
-      </w:r>
-      <w:proofErr w:type="gramStart"/>
-      <w:r>
-        <w:rPr>
-          <w:rStyle w:val="Strong"/>
-          <w:rFonts w:ascii="Arial" w:hAnsi="Arial" w:cs="Arial"/>
-          <w:b w:val="0"/>
-          <w:bCs w:val="0"/>
-          <w:color w:val="414141"/>
-        </w:rPr>
-        <w:t xml:space="preserve">Cual sale </w:t>
-      </w:r>
-      <w:proofErr w:type="spellStart"/>
-      <w:r>
-        <w:rPr>
-          <w:rStyle w:val="Strong"/>
-          <w:rFonts w:ascii="Arial" w:hAnsi="Arial" w:cs="Arial"/>
-          <w:b w:val="0"/>
-          <w:bCs w:val="0"/>
-          <w:color w:val="414141"/>
-        </w:rPr>
-        <w:t>mas</w:t>
-      </w:r>
-      <w:proofErr w:type="spellEnd"/>
-      <w:r>
-        <w:rPr>
-          <w:rStyle w:val="Strong"/>
-          <w:rFonts w:ascii="Arial" w:hAnsi="Arial" w:cs="Arial"/>
-          <w:b w:val="0"/>
-          <w:bCs w:val="0"/>
-          <w:color w:val="414141"/>
-        </w:rPr>
-        <w:t xml:space="preserve"> rentable?</w:t>
-      </w:r>
-      <w:proofErr w:type="gramEnd"/>
-      <w:r>
-        <w:rPr>
-          <w:rStyle w:val="Strong"/>
-          <w:rFonts w:ascii="Arial" w:hAnsi="Arial" w:cs="Arial"/>
-          <w:b w:val="0"/>
-          <w:bCs w:val="0"/>
-          <w:color w:val="414141"/>
-        </w:rPr>
-        <w:t>)</w:t>
-      </w:r>
+      <w:r>
+        <w:rPr>
+          <w:rStyle w:val="Strong"/>
+          <w:rFonts w:ascii="Arial" w:hAnsi="Arial" w:cs="Arial"/>
+          <w:b w:val="0"/>
+          <w:bCs w:val="0"/>
+          <w:color w:val="414141"/>
+        </w:rPr>
+        <w:t>Asumiendo que Alberto se gasta 15 euros fabricando cada alpargata, ¿cuántas tiene que fabricar para gastar más dinero que la tienda?</w:t>
+      </w:r>
+    </w:p>
+    <w:p>
+      <w:pPr>
+        <w:pStyle w:val="NormalWeb"/>
+        <w:shd w:val="clear" w:color="auto" w:fill="FFFFFF"/>
+        <w:spacing w:before="0" w:beforeAutospacing="0" w:after="225" w:afterAutospacing="0" w:line="405" w:lineRule="atLeast"/>
+        <w:rPr>
+          <w:rStyle w:val="Strong"/>
+          <w:rFonts w:ascii="Arial" w:hAnsi="Arial" w:cs="Arial"/>
+          <w:b w:val="0"/>
+          <w:bCs w:val="0"/>
+          <w:color w:val="414141"/>
+        </w:rPr>
+      </w:pPr>
+    </w:p>
+    <w:p>
+      <w:pPr>
+        <w:pStyle w:val="NormalWeb"/>
+        <w:shd w:val="clear" w:color="auto" w:fill="FFFFFF"/>
+        <w:spacing w:before="0" w:beforeAutospacing="0" w:after="225" w:afterAutospacing="0" w:line="405" w:lineRule="atLeast"/>
+        <w:rPr>
+          <w:rStyle w:val="Strong"/>
+          <w:rFonts w:ascii="Arial" w:hAnsi="Arial" w:cs="Arial"/>
+          <w:b w:val="0"/>
+          <w:bCs w:val="0"/>
+          <w:color w:val="414141"/>
+        </w:rPr>
+      </w:pPr>
     </w:p>
     <w:p>
       <w:pPr>
@@ -371,34 +1773,480 @@
         <w:rPr>
           <w:rStyle w:val="Strong"/>
           <w:rFonts w:ascii="Arial" w:hAnsi="Arial" w:cs="Arial"/>
-          <w:b w:val="0"/>
-          <w:bCs w:val="0"/>
-          <w:color w:val="414141"/>
-        </w:rPr>
-        <w:t xml:space="preserve">Fill in </w:t>
+          <w:i/>
+          <w:iCs/>
+          <w:color w:val="414141"/>
+        </w:rPr>
+        <w:lastRenderedPageBreak/>
+        <w:t>[</w:t>
+      </w:r>
+      <w:r>
+        <w:rPr>
+          <w:rStyle w:val="Strong"/>
+          <w:rFonts w:ascii="Arial" w:hAnsi="Arial" w:cs="Arial"/>
+          <w:i/>
+          <w:iCs/>
+          <w:color w:val="414141"/>
+        </w:rPr>
+        <w:t>1</w:t>
+      </w:r>
+      <w:r>
+        <w:rPr>
+          <w:rStyle w:val="Strong"/>
+          <w:rFonts w:ascii="Arial" w:hAnsi="Arial" w:cs="Arial"/>
+          <w:i/>
+          <w:iCs/>
+          <w:color w:val="414141"/>
+        </w:rPr>
+        <w:t xml:space="preserve"> </w:t>
       </w:r>
       <w:proofErr w:type="spellStart"/>
       <w:r>
         <w:rPr>
           <w:rStyle w:val="Strong"/>
           <w:rFonts w:ascii="Arial" w:hAnsi="Arial" w:cs="Arial"/>
-          <w:b w:val="0"/>
-          <w:bCs w:val="0"/>
-          <w:color w:val="414141"/>
-        </w:rPr>
-        <w:t>the</w:t>
+          <w:i/>
+          <w:iCs/>
+          <w:color w:val="414141"/>
+        </w:rPr>
+        <w:t>pts</w:t>
       </w:r>
       <w:proofErr w:type="spellEnd"/>
       <w:r>
         <w:rPr>
           <w:rStyle w:val="Strong"/>
           <w:rFonts w:ascii="Arial" w:hAnsi="Arial" w:cs="Arial"/>
-          <w:b w:val="0"/>
-          <w:bCs w:val="0"/>
-          <w:color w:val="414141"/>
-        </w:rPr>
-        <w:t xml:space="preserve"> gaps de palabras técnicas geometría?</w:t>
-      </w:r>
+          <w:i/>
+          <w:iCs/>
+          <w:color w:val="414141"/>
+        </w:rPr>
+        <w:t>]</w:t>
+      </w:r>
+      <w:r>
+        <w:rPr>
+          <w:rStyle w:val="Strong"/>
+          <w:rFonts w:ascii="Arial" w:hAnsi="Arial" w:cs="Arial"/>
+          <w:b w:val="0"/>
+          <w:bCs w:val="0"/>
+          <w:color w:val="414141"/>
+        </w:rPr>
+        <w:t xml:space="preserve"> </w:t>
+      </w:r>
+      <w:r>
+        <w:rPr>
+          <w:rStyle w:val="Strong"/>
+          <w:rFonts w:ascii="Arial" w:hAnsi="Arial" w:cs="Arial"/>
+          <w:b w:val="0"/>
+          <w:bCs w:val="0"/>
+          <w:color w:val="414141"/>
+        </w:rPr>
+        <w:t xml:space="preserve">Para crear su propia marca de alpargatas, Alberto piensa en utilizar </w:t>
+      </w:r>
+      <w:r>
+        <w:rPr>
+          <w:rStyle w:val="Strong"/>
+          <w:rFonts w:ascii="Arial" w:hAnsi="Arial" w:cs="Arial"/>
+          <w:b w:val="0"/>
+          <w:bCs w:val="0"/>
+          <w:color w:val="414141"/>
+        </w:rPr>
+        <w:t>las siguientes figuras geométricas</w:t>
+      </w:r>
+      <w:r>
+        <w:rPr>
+          <w:rStyle w:val="Strong"/>
+          <w:rFonts w:ascii="Arial" w:hAnsi="Arial" w:cs="Arial"/>
+          <w:b w:val="0"/>
+          <w:bCs w:val="0"/>
+          <w:color w:val="414141"/>
+        </w:rPr>
+        <w:t>. Clasifícalas</w:t>
+      </w:r>
+      <w:r>
+        <w:rPr>
+          <w:rStyle w:val="Strong"/>
+          <w:rFonts w:ascii="Arial" w:hAnsi="Arial" w:cs="Arial"/>
+          <w:b w:val="0"/>
+          <w:bCs w:val="0"/>
+          <w:color w:val="414141"/>
+        </w:rPr>
+        <w:t xml:space="preserve"> escribiendo </w:t>
+      </w:r>
+      <w:r>
+        <w:rPr>
+          <w:rStyle w:val="Strong"/>
+          <w:rFonts w:ascii="Arial" w:hAnsi="Arial" w:cs="Arial"/>
+          <w:b w:val="0"/>
+          <w:bCs w:val="0"/>
+          <w:color w:val="414141"/>
+        </w:rPr>
+        <w:t>el</w:t>
+      </w:r>
+      <w:r>
+        <w:rPr>
+          <w:rStyle w:val="Strong"/>
+          <w:rFonts w:ascii="Arial" w:hAnsi="Arial" w:cs="Arial"/>
+          <w:b w:val="0"/>
+          <w:bCs w:val="0"/>
+          <w:color w:val="414141"/>
+        </w:rPr>
+        <w:t xml:space="preserve"> nombre completo debajo de cada una:</w:t>
+      </w:r>
+    </w:p>
+    <w:tbl>
+      <w:tblPr>
+        <w:tblStyle w:val="TableGrid"/>
+        <w:tblW w:w="0" w:type="auto"/>
+        <w:tblInd w:w="720" w:type="dxa"/>
+        <w:tblLook w:val="04A0" w:firstRow="1" w:lastRow="0" w:firstColumn="1" w:lastColumn="0" w:noHBand="0" w:noVBand="1"/>
+      </w:tblPr>
+      <w:tblGrid>
+        <w:gridCol w:w="3894"/>
+        <w:gridCol w:w="3880"/>
+      </w:tblGrid>
+      <w:tr>
+        <w:tc>
+          <w:tcPr>
+            <w:tcW w:w="3894" w:type="dxa"/>
+          </w:tcPr>
+          <w:p>
+            <w:pPr>
+              <w:pStyle w:val="NormalWeb"/>
+              <w:spacing w:before="0" w:beforeAutospacing="0" w:after="225" w:afterAutospacing="0" w:line="405" w:lineRule="atLeast"/>
+              <w:rPr>
+                <w:rStyle w:val="Strong"/>
+                <w:rFonts w:ascii="Arial" w:hAnsi="Arial" w:cs="Arial"/>
+                <w:b w:val="0"/>
+                <w:bCs w:val="0"/>
+                <w:color w:val="414141"/>
+              </w:rPr>
+            </w:pPr>
+            <w:r>
+              <w:rPr>
+                <w:rStyle w:val="Strong"/>
+                <w:rFonts w:ascii="Arial" w:hAnsi="Arial" w:cs="Arial"/>
+                <w:b w:val="0"/>
+                <w:bCs w:val="0"/>
+                <w:color w:val="414141"/>
+              </w:rPr>
+              <w:drawing>
+                <wp:inline distT="0" distB="0" distL="0" distR="0" wp14:anchorId="161DC532" wp14:editId="22B27C8E">
+                  <wp:extent cx="2288167" cy="2295525"/>
+                  <wp:effectExtent l="0" t="0" r="0" b="0"/>
+                  <wp:docPr id="1465052635" name="Picture 1"/>
+                  <wp:cNvGraphicFramePr>
+                    <a:graphicFrameLocks xmlns:a="http://schemas.openxmlformats.org/drawingml/2006/main" noChangeAspect="1"/>
+                  </wp:cNvGraphicFramePr>
+                  <a:graphic xmlns:a="http://schemas.openxmlformats.org/drawingml/2006/main">
+                    <a:graphicData uri="http://schemas.openxmlformats.org/drawingml/2006/picture">
+                      <pic:pic xmlns:pic="http://schemas.openxmlformats.org/drawingml/2006/picture">
+                        <pic:nvPicPr>
+                          <pic:cNvPr id="1465052635" name=""/>
+                          <pic:cNvPicPr/>
+                        </pic:nvPicPr>
+                        <pic:blipFill>
+                          <a:blip r:embed="rId10"/>
+                          <a:stretch>
+                            <a:fillRect/>
+                          </a:stretch>
+                        </pic:blipFill>
+                        <pic:spPr>
+                          <a:xfrm>
+                            <a:off x="0" y="0"/>
+                            <a:ext cx="2318958" cy="2326415"/>
+                          </a:xfrm>
+                          <a:prstGeom prst="rect">
+                            <a:avLst/>
+                          </a:prstGeom>
+                        </pic:spPr>
+                      </pic:pic>
+                    </a:graphicData>
+                  </a:graphic>
+                </wp:inline>
+              </w:drawing>
+            </w:r>
+          </w:p>
+        </w:tc>
+        <w:tc>
+          <w:tcPr>
+            <w:tcW w:w="3880" w:type="dxa"/>
+          </w:tcPr>
+          <w:p>
+            <w:pPr>
+              <w:pStyle w:val="NormalWeb"/>
+              <w:spacing w:before="0" w:beforeAutospacing="0" w:after="225" w:afterAutospacing="0" w:line="405" w:lineRule="atLeast"/>
+              <w:rPr>
+                <w:rStyle w:val="Strong"/>
+                <w:rFonts w:ascii="Arial" w:hAnsi="Arial" w:cs="Arial"/>
+                <w:b w:val="0"/>
+                <w:bCs w:val="0"/>
+                <w:color w:val="414141"/>
+              </w:rPr>
+            </w:pPr>
+            <w:r>
+              <w:rPr>
+                <w:rStyle w:val="Strong"/>
+                <w:rFonts w:ascii="Arial" w:hAnsi="Arial" w:cs="Arial"/>
+                <w:b w:val="0"/>
+                <w:bCs w:val="0"/>
+                <w:color w:val="414141"/>
+              </w:rPr>
+              <w:drawing>
+                <wp:inline distT="0" distB="0" distL="0" distR="0" wp14:anchorId="0CC49A18" wp14:editId="2AF7D714">
+                  <wp:extent cx="2381250" cy="2264686"/>
+                  <wp:effectExtent l="0" t="0" r="0" b="2540"/>
+                  <wp:docPr id="266121187" name="Picture 1"/>
+                  <wp:cNvGraphicFramePr>
+                    <a:graphicFrameLocks xmlns:a="http://schemas.openxmlformats.org/drawingml/2006/main" noChangeAspect="1"/>
+                  </wp:cNvGraphicFramePr>
+                  <a:graphic xmlns:a="http://schemas.openxmlformats.org/drawingml/2006/main">
+                    <a:graphicData uri="http://schemas.openxmlformats.org/drawingml/2006/picture">
+                      <pic:pic xmlns:pic="http://schemas.openxmlformats.org/drawingml/2006/picture">
+                        <pic:nvPicPr>
+                          <pic:cNvPr id="266121187" name=""/>
+                          <pic:cNvPicPr/>
+                        </pic:nvPicPr>
+                        <pic:blipFill>
+                          <a:blip r:embed="rId11"/>
+                          <a:stretch>
+                            <a:fillRect/>
+                          </a:stretch>
+                        </pic:blipFill>
+                        <pic:spPr>
+                          <a:xfrm>
+                            <a:off x="0" y="0"/>
+                            <a:ext cx="2401880" cy="2284306"/>
+                          </a:xfrm>
+                          <a:prstGeom prst="rect">
+                            <a:avLst/>
+                          </a:prstGeom>
+                        </pic:spPr>
+                      </pic:pic>
+                    </a:graphicData>
+                  </a:graphic>
+                </wp:inline>
+              </w:drawing>
+            </w:r>
+          </w:p>
+        </w:tc>
+      </w:tr>
+      <w:tr>
+        <w:tc>
+          <w:tcPr>
+            <w:tcW w:w="3894" w:type="dxa"/>
+          </w:tcPr>
+          <w:p>
+            <w:pPr>
+              <w:pStyle w:val="NormalWeb"/>
+              <w:spacing w:before="0" w:beforeAutospacing="0" w:after="225" w:afterAutospacing="0" w:line="405" w:lineRule="atLeast"/>
+              <w:rPr>
+                <w:rStyle w:val="Strong"/>
+                <w:rFonts w:ascii="Arial" w:hAnsi="Arial" w:cs="Arial"/>
+                <w:b w:val="0"/>
+                <w:bCs w:val="0"/>
+                <w:color w:val="414141"/>
+              </w:rPr>
+            </w:pPr>
+          </w:p>
+        </w:tc>
+        <w:tc>
+          <w:tcPr>
+            <w:tcW w:w="3880" w:type="dxa"/>
+          </w:tcPr>
+          <w:p>
+            <w:pPr>
+              <w:pStyle w:val="NormalWeb"/>
+              <w:spacing w:before="0" w:beforeAutospacing="0" w:after="225" w:afterAutospacing="0" w:line="405" w:lineRule="atLeast"/>
+              <w:rPr>
+                <w:rStyle w:val="Strong"/>
+                <w:rFonts w:ascii="Arial" w:hAnsi="Arial" w:cs="Arial"/>
+                <w:b w:val="0"/>
+                <w:bCs w:val="0"/>
+                <w:color w:val="414141"/>
+              </w:rPr>
+            </w:pPr>
+          </w:p>
+        </w:tc>
+      </w:tr>
+      <w:tr>
+        <w:tc>
+          <w:tcPr>
+            <w:tcW w:w="3894" w:type="dxa"/>
+          </w:tcPr>
+          <w:p>
+            <w:pPr>
+              <w:pStyle w:val="NormalWeb"/>
+              <w:spacing w:before="0" w:beforeAutospacing="0" w:after="225" w:afterAutospacing="0" w:line="405" w:lineRule="atLeast"/>
+              <w:rPr>
+                <w:rStyle w:val="Strong"/>
+                <w:rFonts w:ascii="Arial" w:hAnsi="Arial" w:cs="Arial"/>
+                <w:b w:val="0"/>
+                <w:bCs w:val="0"/>
+                <w:color w:val="414141"/>
+              </w:rPr>
+            </w:pPr>
+            <w:r>
+              <w:rPr>
+                <w:rStyle w:val="Strong"/>
+                <w:rFonts w:ascii="Arial" w:hAnsi="Arial" w:cs="Arial"/>
+                <w:b w:val="0"/>
+                <w:bCs w:val="0"/>
+                <w:color w:val="414141"/>
+              </w:rPr>
+              <w:drawing>
+                <wp:inline distT="0" distB="0" distL="0" distR="0" wp14:anchorId="595A4E12" wp14:editId="3CF42BA3">
+                  <wp:extent cx="2390775" cy="1509963"/>
+                  <wp:effectExtent l="0" t="0" r="0" b="0"/>
+                  <wp:docPr id="536542743" name="Picture 1"/>
+                  <wp:cNvGraphicFramePr>
+                    <a:graphicFrameLocks xmlns:a="http://schemas.openxmlformats.org/drawingml/2006/main" noChangeAspect="1"/>
+                  </wp:cNvGraphicFramePr>
+                  <a:graphic xmlns:a="http://schemas.openxmlformats.org/drawingml/2006/main">
+                    <a:graphicData uri="http://schemas.openxmlformats.org/drawingml/2006/picture">
+                      <pic:pic xmlns:pic="http://schemas.openxmlformats.org/drawingml/2006/picture">
+                        <pic:nvPicPr>
+                          <pic:cNvPr id="536542743" name=""/>
+                          <pic:cNvPicPr/>
+                        </pic:nvPicPr>
+                        <pic:blipFill>
+                          <a:blip r:embed="rId12"/>
+                          <a:stretch>
+                            <a:fillRect/>
+                          </a:stretch>
+                        </pic:blipFill>
+                        <pic:spPr>
+                          <a:xfrm>
+                            <a:off x="0" y="0"/>
+                            <a:ext cx="2408122" cy="1520919"/>
+                          </a:xfrm>
+                          <a:prstGeom prst="rect">
+                            <a:avLst/>
+                          </a:prstGeom>
+                        </pic:spPr>
+                      </pic:pic>
+                    </a:graphicData>
+                  </a:graphic>
+                </wp:inline>
+              </w:drawing>
+            </w:r>
+          </w:p>
+        </w:tc>
+        <w:tc>
+          <w:tcPr>
+            <w:tcW w:w="3880" w:type="dxa"/>
+          </w:tcPr>
+          <w:p>
+            <w:pPr>
+              <w:pStyle w:val="NormalWeb"/>
+              <w:spacing w:before="0" w:beforeAutospacing="0" w:after="225" w:afterAutospacing="0" w:line="405" w:lineRule="atLeast"/>
+              <w:rPr>
+                <w:rStyle w:val="Strong"/>
+                <w:rFonts w:ascii="Arial" w:hAnsi="Arial" w:cs="Arial"/>
+                <w:b w:val="0"/>
+                <w:bCs w:val="0"/>
+                <w:color w:val="414141"/>
+              </w:rPr>
+            </w:pPr>
+            <w:r>
+              <w:rPr>
+                <w:rStyle w:val="Strong"/>
+                <w:rFonts w:ascii="Arial" w:hAnsi="Arial" w:cs="Arial"/>
+                <w:b w:val="0"/>
+                <w:bCs w:val="0"/>
+                <w:color w:val="414141"/>
+              </w:rPr>
+              <w:drawing>
+                <wp:inline distT="0" distB="0" distL="0" distR="0" wp14:anchorId="0557C285" wp14:editId="500C2CFE">
+                  <wp:extent cx="2209800" cy="1771734"/>
+                  <wp:effectExtent l="0" t="0" r="0" b="0"/>
+                  <wp:docPr id="1880102705" name="Picture 1"/>
+                  <wp:cNvGraphicFramePr>
+                    <a:graphicFrameLocks xmlns:a="http://schemas.openxmlformats.org/drawingml/2006/main" noChangeAspect="1"/>
+                  </wp:cNvGraphicFramePr>
+                  <a:graphic xmlns:a="http://schemas.openxmlformats.org/drawingml/2006/main">
+                    <a:graphicData uri="http://schemas.openxmlformats.org/drawingml/2006/picture">
+                      <pic:pic xmlns:pic="http://schemas.openxmlformats.org/drawingml/2006/picture">
+                        <pic:nvPicPr>
+                          <pic:cNvPr id="1880102705" name=""/>
+                          <pic:cNvPicPr/>
+                        </pic:nvPicPr>
+                        <pic:blipFill>
+                          <a:blip r:embed="rId13"/>
+                          <a:stretch>
+                            <a:fillRect/>
+                          </a:stretch>
+                        </pic:blipFill>
+                        <pic:spPr>
+                          <a:xfrm>
+                            <a:off x="0" y="0"/>
+                            <a:ext cx="2224201" cy="1783281"/>
+                          </a:xfrm>
+                          <a:prstGeom prst="rect">
+                            <a:avLst/>
+                          </a:prstGeom>
+                        </pic:spPr>
+                      </pic:pic>
+                    </a:graphicData>
+                  </a:graphic>
+                </wp:inline>
+              </w:drawing>
+            </w:r>
+          </w:p>
+        </w:tc>
+      </w:tr>
+      <w:tr>
+        <w:tc>
+          <w:tcPr>
+            <w:tcW w:w="3894" w:type="dxa"/>
+          </w:tcPr>
+          <w:p>
+            <w:pPr>
+              <w:pStyle w:val="NormalWeb"/>
+              <w:spacing w:before="0" w:beforeAutospacing="0" w:after="225" w:afterAutospacing="0" w:line="405" w:lineRule="atLeast"/>
+              <w:rPr>
+                <w:rStyle w:val="Strong"/>
+                <w:rFonts w:ascii="Arial" w:hAnsi="Arial" w:cs="Arial"/>
+                <w:b w:val="0"/>
+                <w:bCs w:val="0"/>
+                <w:color w:val="414141"/>
+              </w:rPr>
+            </w:pPr>
+          </w:p>
+        </w:tc>
+        <w:tc>
+          <w:tcPr>
+            <w:tcW w:w="3880" w:type="dxa"/>
+          </w:tcPr>
+          <w:p>
+            <w:pPr>
+              <w:pStyle w:val="NormalWeb"/>
+              <w:spacing w:before="0" w:beforeAutospacing="0" w:after="225" w:afterAutospacing="0" w:line="405" w:lineRule="atLeast"/>
+              <w:rPr>
+                <w:rStyle w:val="Strong"/>
+                <w:rFonts w:ascii="Arial" w:hAnsi="Arial" w:cs="Arial"/>
+                <w:b w:val="0"/>
+                <w:bCs w:val="0"/>
+                <w:color w:val="414141"/>
+              </w:rPr>
+            </w:pPr>
+          </w:p>
+        </w:tc>
+      </w:tr>
+    </w:tbl>
+    <w:p>
+      <w:pPr>
+        <w:pStyle w:val="NormalWeb"/>
+        <w:shd w:val="clear" w:color="auto" w:fill="FFFFFF"/>
+        <w:spacing w:before="0" w:beforeAutospacing="0" w:after="225" w:afterAutospacing="0" w:line="405" w:lineRule="atLeast"/>
+        <w:ind w:left="720"/>
+        <w:rPr>
+          <w:rStyle w:val="Strong"/>
+          <w:rFonts w:ascii="Arial" w:hAnsi="Arial" w:cs="Arial"/>
+          <w:b w:val="0"/>
+          <w:bCs w:val="0"/>
+          <w:color w:val="414141"/>
+        </w:rPr>
+      </w:pPr>
     </w:p>
     <w:p>
       <w:pPr>
@@ -421,6 +2269,128 @@
         <w:rPr>
           <w:rStyle w:val="Strong"/>
           <w:rFonts w:ascii="Arial" w:hAnsi="Arial" w:cs="Arial"/>
+          <w:i/>
+          <w:iCs/>
+          <w:color w:val="414141"/>
+        </w:rPr>
+        <w:t>[</w:t>
+      </w:r>
+      <w:r>
+        <w:rPr>
+          <w:rStyle w:val="Strong"/>
+          <w:rFonts w:ascii="Arial" w:hAnsi="Arial" w:cs="Arial"/>
+          <w:i/>
+          <w:iCs/>
+          <w:color w:val="414141"/>
+        </w:rPr>
+        <w:t>1</w:t>
+      </w:r>
+      <w:r>
+        <w:rPr>
+          <w:rStyle w:val="Strong"/>
+          <w:rFonts w:ascii="Arial" w:hAnsi="Arial" w:cs="Arial"/>
+          <w:i/>
+          <w:iCs/>
+          <w:color w:val="414141"/>
+        </w:rPr>
+        <w:t xml:space="preserve"> </w:t>
+      </w:r>
+      <w:proofErr w:type="spellStart"/>
+      <w:r>
+        <w:rPr>
+          <w:rStyle w:val="Strong"/>
+          <w:rFonts w:ascii="Arial" w:hAnsi="Arial" w:cs="Arial"/>
+          <w:i/>
+          <w:iCs/>
+          <w:color w:val="414141"/>
+        </w:rPr>
+        <w:t>pts</w:t>
+      </w:r>
+      <w:proofErr w:type="spellEnd"/>
+      <w:r>
+        <w:rPr>
+          <w:rStyle w:val="Strong"/>
+          <w:rFonts w:ascii="Arial" w:hAnsi="Arial" w:cs="Arial"/>
+          <w:i/>
+          <w:iCs/>
+          <w:color w:val="414141"/>
+        </w:rPr>
+        <w:t>]</w:t>
+      </w:r>
+      <w:r>
+        <w:rPr>
+          <w:rStyle w:val="Strong"/>
+          <w:rFonts w:ascii="Arial" w:hAnsi="Arial" w:cs="Arial"/>
+          <w:b w:val="0"/>
+          <w:bCs w:val="0"/>
+          <w:color w:val="414141"/>
+        </w:rPr>
+        <w:t xml:space="preserve"> </w:t>
+      </w:r>
+      <w:r>
+        <w:rPr>
+          <w:rStyle w:val="Strong"/>
+          <w:rFonts w:ascii="Arial" w:hAnsi="Arial" w:cs="Arial"/>
+          <w:b w:val="0"/>
+          <w:bCs w:val="0"/>
+          <w:color w:val="414141"/>
+        </w:rPr>
+        <w:t xml:space="preserve">Mira detenidamente la </w:t>
+      </w:r>
+      <w:r>
+        <w:rPr>
+          <w:rStyle w:val="Strong"/>
+          <w:rFonts w:ascii="Arial" w:hAnsi="Arial" w:cs="Arial"/>
+          <w:i/>
+          <w:iCs/>
+          <w:color w:val="414141"/>
+        </w:rPr>
+        <w:t>figura 2</w:t>
+      </w:r>
+      <w:r>
+        <w:rPr>
+          <w:rStyle w:val="Strong"/>
+          <w:rFonts w:ascii="Arial" w:hAnsi="Arial" w:cs="Arial"/>
+          <w:i/>
+          <w:iCs/>
+          <w:color w:val="414141"/>
+        </w:rPr>
+        <w:t xml:space="preserve">, </w:t>
+      </w:r>
+      <w:r>
+        <w:rPr>
+          <w:rStyle w:val="Strong"/>
+          <w:rFonts w:ascii="Arial" w:hAnsi="Arial" w:cs="Arial"/>
+          <w:b w:val="0"/>
+          <w:bCs w:val="0"/>
+          <w:color w:val="414141"/>
+        </w:rPr>
+        <w:t>que representa el logo final de la marca de alpargatas</w:t>
+      </w:r>
+      <w:r>
+        <w:rPr>
+          <w:rStyle w:val="Strong"/>
+          <w:rFonts w:ascii="Arial" w:hAnsi="Arial" w:cs="Arial"/>
+          <w:b w:val="0"/>
+          <w:bCs w:val="0"/>
+          <w:color w:val="414141"/>
+        </w:rPr>
+        <w:t>.</w:t>
+      </w:r>
+      <w:r>
+        <w:rPr>
+          <w:rStyle w:val="Strong"/>
+          <w:rFonts w:ascii="Arial" w:hAnsi="Arial" w:cs="Arial"/>
+          <w:b w:val="0"/>
+          <w:bCs w:val="0"/>
+          <w:color w:val="414141"/>
+        </w:rPr>
+        <w:t xml:space="preserve"> </w:t>
+      </w:r>
+      <w:r>
+        <w:rPr>
+          <w:rStyle w:val="Strong"/>
+          <w:rFonts w:ascii="Arial" w:hAnsi="Arial" w:cs="Arial"/>
           <w:b w:val="0"/>
           <w:bCs w:val="0"/>
           <w:color w:val="414141"/>
@@ -444,17 +2414,246 @@
           <w:bCs w:val="0"/>
           <w:color w:val="414141"/>
         </w:rPr>
-        <w:t xml:space="preserve"> del diagrama tiene un valor de 37º, indica el valor del resto de ángulos etiquetados en la figura. (desde el 1 hasta el 11)</w:t>
-      </w:r>
-      <w:r>
-        <w:rPr>
-          <w:rStyle w:val="Strong"/>
-          <w:rFonts w:ascii="Arial" w:hAnsi="Arial" w:cs="Arial"/>
-          <w:b w:val="0"/>
-          <w:bCs w:val="0"/>
-          <w:color w:val="414141"/>
-        </w:rPr>
-        <w:t xml:space="preserve"> (o mejor pocos)</w:t>
+        <w:t xml:space="preserve"> del diagrama tiene un valor de 37º, indica el valor del resto de ángulos etiquetados en la figura. </w:t>
+      </w:r>
+    </w:p>
+    <w:p>
+      <w:pPr>
+        <w:pStyle w:val="NormalWeb"/>
+        <w:shd w:val="clear" w:color="auto" w:fill="FFFFFF"/>
+        <w:spacing w:before="0" w:beforeAutospacing="0" w:after="225" w:afterAutospacing="0" w:line="405" w:lineRule="atLeast"/>
+        <w:rPr>
+          <w:rStyle w:val="Strong"/>
+          <w:rFonts w:ascii="Arial" w:hAnsi="Arial" w:cs="Arial"/>
+          <w:b w:val="0"/>
+          <w:bCs w:val="0"/>
+          <w:color w:val="414141"/>
+        </w:rPr>
+      </w:pPr>
+    </w:p>
+    <w:p>
+      <w:pPr>
+        <w:pStyle w:val="NormalWeb"/>
+        <w:shd w:val="clear" w:color="auto" w:fill="FFFFFF"/>
+        <w:spacing w:before="0" w:beforeAutospacing="0" w:after="225" w:afterAutospacing="0" w:line="405" w:lineRule="atLeast"/>
+        <w:rPr>
+          <w:rStyle w:val="Strong"/>
+          <w:rFonts w:ascii="Arial" w:hAnsi="Arial" w:cs="Arial"/>
+          <w:b w:val="0"/>
+          <w:bCs w:val="0"/>
+          <w:color w:val="414141"/>
+        </w:rPr>
+      </w:pPr>
+    </w:p>
+    <w:p>
+      <w:pPr>
+        <w:pStyle w:val="NormalWeb"/>
+        <w:numPr>
+          <w:ilvl w:val="0"/>
+          <w:numId w:val="8"/>
+        </w:numPr>
+        <w:shd w:val="clear" w:color="auto" w:fill="FFFFFF"/>
+        <w:spacing w:before="0" w:beforeAutospacing="0" w:after="225" w:afterAutospacing="0" w:line="405" w:lineRule="atLeast"/>
+        <w:rPr>
+          <w:rStyle w:val="Strong"/>
+          <w:rFonts w:ascii="Arial" w:hAnsi="Arial" w:cs="Arial"/>
+          <w:b w:val="0"/>
+          <w:bCs w:val="0"/>
+          <w:color w:val="414141"/>
+        </w:rPr>
+      </w:pPr>
+      <w:r>
+        <w:rPr>
+          <w:rStyle w:val="Strong"/>
+          <w:rFonts w:ascii="Arial" w:hAnsi="Arial" w:cs="Arial"/>
+          <w:i/>
+          <w:iCs/>
+          <w:color w:val="414141"/>
+        </w:rPr>
+        <w:lastRenderedPageBreak/>
+        <w:t>[1</w:t>
+      </w:r>
+      <w:r>
+        <w:rPr>
+          <w:rStyle w:val="Strong"/>
+          <w:rFonts w:ascii="Arial" w:hAnsi="Arial" w:cs="Arial"/>
+          <w:i/>
+          <w:iCs/>
+          <w:color w:val="414141"/>
+        </w:rPr>
+        <w:t xml:space="preserve"> </w:t>
+      </w:r>
+      <w:proofErr w:type="spellStart"/>
+      <w:r>
+        <w:rPr>
+          <w:rStyle w:val="Strong"/>
+          <w:rFonts w:ascii="Arial" w:hAnsi="Arial" w:cs="Arial"/>
+          <w:i/>
+          <w:iCs/>
+          <w:color w:val="414141"/>
+        </w:rPr>
+        <w:t>pts</w:t>
+      </w:r>
+      <w:proofErr w:type="spellEnd"/>
+      <w:r>
+        <w:rPr>
+          <w:rStyle w:val="Strong"/>
+          <w:rFonts w:ascii="Arial" w:hAnsi="Arial" w:cs="Arial"/>
+          <w:i/>
+          <w:iCs/>
+          <w:color w:val="414141"/>
+        </w:rPr>
+        <w:t>]</w:t>
+      </w:r>
+      <w:r>
+        <w:rPr>
+          <w:rStyle w:val="Strong"/>
+          <w:rFonts w:ascii="Arial" w:hAnsi="Arial" w:cs="Arial"/>
+          <w:b w:val="0"/>
+          <w:bCs w:val="0"/>
+          <w:color w:val="414141"/>
+        </w:rPr>
+        <w:t xml:space="preserve"> </w:t>
+      </w:r>
+      <w:r>
+        <w:rPr>
+          <w:rStyle w:val="Strong"/>
+          <w:rFonts w:ascii="Arial" w:hAnsi="Arial" w:cs="Arial"/>
+          <w:b w:val="0"/>
+          <w:bCs w:val="0"/>
+          <w:color w:val="414141"/>
+        </w:rPr>
+        <w:t xml:space="preserve">Calcula el área y el perímetro de la </w:t>
+      </w:r>
+      <w:r>
+        <w:rPr>
+          <w:rStyle w:val="Strong"/>
+          <w:rFonts w:ascii="Arial" w:hAnsi="Arial" w:cs="Arial"/>
+          <w:i/>
+          <w:iCs/>
+          <w:color w:val="414141"/>
+        </w:rPr>
+        <w:t>figura</w:t>
+      </w:r>
+      <w:r>
+        <w:rPr>
+          <w:rStyle w:val="Strong"/>
+          <w:rFonts w:ascii="Arial" w:hAnsi="Arial" w:cs="Arial"/>
+          <w:i/>
+          <w:iCs/>
+          <w:color w:val="414141"/>
+        </w:rPr>
+        <w:t xml:space="preserve"> 3</w:t>
+      </w:r>
+      <w:r>
+        <w:rPr>
+          <w:rStyle w:val="Strong"/>
+          <w:rFonts w:ascii="Arial" w:hAnsi="Arial" w:cs="Arial"/>
+          <w:b w:val="0"/>
+          <w:bCs w:val="0"/>
+          <w:color w:val="414141"/>
+        </w:rPr>
+        <w:t xml:space="preserve">, </w:t>
+      </w:r>
+      <w:r>
+        <w:rPr>
+          <w:rStyle w:val="Strong"/>
+          <w:rFonts w:ascii="Arial" w:hAnsi="Arial" w:cs="Arial"/>
+          <w:b w:val="0"/>
+          <w:bCs w:val="0"/>
+          <w:color w:val="414141"/>
+        </w:rPr>
+        <w:t>que representa el perfil de la carretilla de Alberto, en la que guarda las alpargatas que vende en su puesto de mercadillo. Puedes hacer</w:t>
+      </w:r>
+      <w:r>
+        <w:rPr>
+          <w:rStyle w:val="Strong"/>
+          <w:rFonts w:ascii="Arial" w:hAnsi="Arial" w:cs="Arial"/>
+          <w:b w:val="0"/>
+          <w:bCs w:val="0"/>
+          <w:color w:val="414141"/>
+        </w:rPr>
+        <w:t xml:space="preserve"> la aproximación </w:t>
+      </w:r>
+      <w:r>
+        <w:rPr>
+          <w:rStyle w:val="Strong"/>
+          <w:b w:val="0"/>
+          <w:bCs w:val="0"/>
+          <w:color w:val="414141"/>
+        </w:rPr>
+        <w:t>π</w:t>
+      </w:r>
+      <w:r>
+        <w:rPr>
+          <w:rStyle w:val="Strong"/>
+          <w:rFonts w:ascii="Arial" w:hAnsi="Arial" w:cs="Arial"/>
+          <w:b w:val="0"/>
+          <w:bCs w:val="0"/>
+          <w:color w:val="414141"/>
+        </w:rPr>
+        <w:t xml:space="preserve"> = 3</w:t>
+      </w:r>
+      <w:r>
+        <w:rPr>
+          <w:rStyle w:val="Strong"/>
+          <w:rFonts w:ascii="Arial" w:hAnsi="Arial" w:cs="Arial"/>
+          <w:b w:val="0"/>
+          <w:bCs w:val="0"/>
+          <w:color w:val="414141"/>
+        </w:rPr>
+        <w:t xml:space="preserve">. Además, </w:t>
+      </w:r>
+      <w:r>
+        <w:rPr>
+          <w:rStyle w:val="Strong"/>
+          <w:rFonts w:ascii="Arial" w:hAnsi="Arial" w:cs="Arial"/>
+          <w:b w:val="0"/>
+          <w:bCs w:val="0"/>
+          <w:color w:val="414141"/>
+        </w:rPr>
+        <w:t>cada cuadrado representa 1</w:t>
+      </w:r>
+      <w:r>
+        <w:rPr>
+          <w:rStyle w:val="Strong"/>
+          <w:rFonts w:ascii="Arial" w:hAnsi="Arial" w:cs="Arial"/>
+          <w:b w:val="0"/>
+          <w:bCs w:val="0"/>
+          <w:color w:val="414141"/>
+        </w:rPr>
+        <w:t>m</w:t>
+      </w:r>
+      <w:r>
+        <w:rPr>
+          <w:rStyle w:val="Strong"/>
+          <w:rFonts w:ascii="Arial" w:hAnsi="Arial" w:cs="Arial"/>
+          <w:b w:val="0"/>
+          <w:bCs w:val="0"/>
+          <w:color w:val="414141"/>
+        </w:rPr>
+        <w:t>m</w:t>
+      </w:r>
+      <w:r>
+        <w:rPr>
+          <w:rStyle w:val="Strong"/>
+          <w:rFonts w:ascii="Arial" w:hAnsi="Arial" w:cs="Arial"/>
+          <w:b w:val="0"/>
+          <w:bCs w:val="0"/>
+          <w:color w:val="414141"/>
+          <w:vertAlign w:val="superscript"/>
+        </w:rPr>
+        <w:t>2</w:t>
+      </w:r>
+      <w:r>
+        <w:rPr>
+          <w:rStyle w:val="Strong"/>
+          <w:rFonts w:ascii="Arial" w:hAnsi="Arial" w:cs="Arial"/>
+          <w:b w:val="0"/>
+          <w:bCs w:val="0"/>
+          <w:color w:val="414141"/>
+        </w:rPr>
+        <w:t>.</w:t>
       </w:r>
     </w:p>
     <w:p>
@@ -466,10 +2665,553 @@
         <w:rPr>
           <w:rStyle w:val="Strong"/>
           <w:rFonts w:ascii="Arial" w:hAnsi="Arial" w:cs="Arial"/>
-          <w:b w:val="0"/>
-          <w:bCs w:val="0"/>
-          <w:color w:val="414141"/>
-        </w:rPr>
+          <w:i/>
+          <w:iCs/>
+          <w:color w:val="414141"/>
+        </w:rPr>
+      </w:pPr>
+    </w:p>
+    <w:p>
+      <w:pPr>
+        <w:pStyle w:val="NormalWeb"/>
+        <w:shd w:val="clear" w:color="auto" w:fill="FFFFFF"/>
+        <w:spacing w:before="0" w:beforeAutospacing="0" w:after="225" w:afterAutospacing="0" w:line="405" w:lineRule="atLeast"/>
+        <w:ind w:left="720"/>
+        <w:rPr>
+          <w:rStyle w:val="Strong"/>
+          <w:rFonts w:ascii="Arial" w:hAnsi="Arial" w:cs="Arial"/>
+          <w:i/>
+          <w:iCs/>
+          <w:color w:val="414141"/>
+        </w:rPr>
+      </w:pPr>
+    </w:p>
+    <w:p>
+      <w:pPr>
+        <w:pStyle w:val="NormalWeb"/>
+        <w:shd w:val="clear" w:color="auto" w:fill="FFFFFF"/>
+        <w:spacing w:before="0" w:beforeAutospacing="0" w:after="225" w:afterAutospacing="0" w:line="405" w:lineRule="atLeast"/>
+        <w:ind w:left="720"/>
+        <w:rPr>
+          <w:rStyle w:val="Strong"/>
+          <w:rFonts w:ascii="Arial" w:hAnsi="Arial" w:cs="Arial"/>
+          <w:b w:val="0"/>
+          <w:bCs w:val="0"/>
+          <w:color w:val="414141"/>
+        </w:rPr>
+      </w:pPr>
+    </w:p>
+    <w:p>
+      <w:pPr>
+        <w:pStyle w:val="NormalWeb"/>
+        <w:numPr>
+          <w:ilvl w:val="0"/>
+          <w:numId w:val="8"/>
+        </w:numPr>
+        <w:shd w:val="clear" w:color="auto" w:fill="FFFFFF"/>
+        <w:spacing w:before="0" w:beforeAutospacing="0" w:after="225" w:afterAutospacing="0" w:line="405" w:lineRule="atLeast"/>
+        <w:rPr>
+          <w:rStyle w:val="Strong"/>
+          <w:rFonts w:ascii="Arial" w:hAnsi="Arial" w:cs="Arial"/>
+          <w:b w:val="0"/>
+          <w:bCs w:val="0"/>
+          <w:color w:val="414141"/>
+        </w:rPr>
+      </w:pPr>
+      <w:r>
+        <w:rPr>
+          <w:rStyle w:val="Strong"/>
+          <w:rFonts w:ascii="Arial" w:hAnsi="Arial" w:cs="Arial"/>
+          <w:i/>
+          <w:iCs/>
+          <w:color w:val="414141"/>
+        </w:rPr>
+        <w:t>[</w:t>
+      </w:r>
+      <w:r>
+        <w:rPr>
+          <w:rStyle w:val="Strong"/>
+          <w:rFonts w:ascii="Arial" w:hAnsi="Arial" w:cs="Arial"/>
+          <w:i/>
+          <w:iCs/>
+          <w:color w:val="414141"/>
+        </w:rPr>
+        <w:t>1</w:t>
+      </w:r>
+      <w:r>
+        <w:rPr>
+          <w:rStyle w:val="Strong"/>
+          <w:rFonts w:ascii="Arial" w:hAnsi="Arial" w:cs="Arial"/>
+          <w:i/>
+          <w:iCs/>
+          <w:color w:val="414141"/>
+        </w:rPr>
+        <w:t xml:space="preserve"> </w:t>
+      </w:r>
+      <w:proofErr w:type="spellStart"/>
+      <w:r>
+        <w:rPr>
+          <w:rStyle w:val="Strong"/>
+          <w:rFonts w:ascii="Arial" w:hAnsi="Arial" w:cs="Arial"/>
+          <w:i/>
+          <w:iCs/>
+          <w:color w:val="414141"/>
+        </w:rPr>
+        <w:t>pts</w:t>
+      </w:r>
+      <w:proofErr w:type="spellEnd"/>
+      <w:r>
+        <w:rPr>
+          <w:rStyle w:val="Strong"/>
+          <w:rFonts w:ascii="Arial" w:hAnsi="Arial" w:cs="Arial"/>
+          <w:i/>
+          <w:iCs/>
+          <w:color w:val="414141"/>
+        </w:rPr>
+        <w:t>]</w:t>
+      </w:r>
+      <w:r>
+        <w:rPr>
+          <w:rStyle w:val="Strong"/>
+          <w:rFonts w:ascii="Arial" w:hAnsi="Arial" w:cs="Arial"/>
+          <w:b w:val="0"/>
+          <w:bCs w:val="0"/>
+          <w:color w:val="414141"/>
+        </w:rPr>
+        <w:t xml:space="preserve"> </w:t>
+      </w:r>
+      <w:r>
+        <w:rPr>
+          <w:rStyle w:val="Strong"/>
+          <w:rFonts w:ascii="Arial" w:hAnsi="Arial" w:cs="Arial"/>
+          <w:b w:val="0"/>
+          <w:bCs w:val="0"/>
+          <w:color w:val="414141"/>
+        </w:rPr>
+        <w:t xml:space="preserve">Para descansar de su jornada de trabajo, a Alberto le suele gustar jugar </w:t>
+      </w:r>
+      <w:r>
+        <w:rPr>
+          <w:rStyle w:val="Strong"/>
+          <w:rFonts w:ascii="Arial" w:hAnsi="Arial" w:cs="Arial"/>
+          <w:b w:val="0"/>
+          <w:bCs w:val="0"/>
+          <w:color w:val="414141"/>
+        </w:rPr>
+        <w:t xml:space="preserve">con sus amigos </w:t>
+      </w:r>
+      <w:r>
+        <w:rPr>
+          <w:rStyle w:val="Strong"/>
+          <w:rFonts w:ascii="Arial" w:hAnsi="Arial" w:cs="Arial"/>
+          <w:b w:val="0"/>
+          <w:bCs w:val="0"/>
+          <w:color w:val="414141"/>
+        </w:rPr>
+        <w:t>al Catán, un</w:t>
+      </w:r>
+      <w:r>
+        <w:rPr>
+          <w:rStyle w:val="Strong"/>
+          <w:rFonts w:ascii="Arial" w:hAnsi="Arial" w:cs="Arial"/>
+          <w:b w:val="0"/>
+          <w:bCs w:val="0"/>
+          <w:color w:val="414141"/>
+        </w:rPr>
+        <w:t xml:space="preserve"> conocido juego de mesa </w:t>
+      </w:r>
+      <w:r>
+        <w:rPr>
+          <w:rStyle w:val="Strong"/>
+          <w:rFonts w:ascii="Arial" w:hAnsi="Arial" w:cs="Arial"/>
+          <w:b w:val="0"/>
+          <w:bCs w:val="0"/>
+          <w:color w:val="414141"/>
+        </w:rPr>
+        <w:t xml:space="preserve">cuyo tablero </w:t>
+      </w:r>
+      <w:r>
+        <w:rPr>
+          <w:rStyle w:val="Strong"/>
+          <w:rFonts w:ascii="Arial" w:hAnsi="Arial" w:cs="Arial"/>
+          <w:b w:val="0"/>
+          <w:bCs w:val="0"/>
+          <w:color w:val="414141"/>
+        </w:rPr>
+        <w:t>se forma poniendo</w:t>
+      </w:r>
+      <w:r>
+        <w:rPr>
+          <w:rStyle w:val="Strong"/>
+          <w:rFonts w:ascii="Arial" w:hAnsi="Arial" w:cs="Arial"/>
+          <w:b w:val="0"/>
+          <w:bCs w:val="0"/>
+          <w:color w:val="414141"/>
+        </w:rPr>
+        <w:t xml:space="preserve"> </w:t>
+      </w:r>
+      <w:r>
+        <w:rPr>
+          <w:rStyle w:val="Strong"/>
+          <w:rFonts w:ascii="Arial" w:hAnsi="Arial" w:cs="Arial"/>
+          <w:b w:val="0"/>
+          <w:bCs w:val="0"/>
+          <w:color w:val="414141"/>
+        </w:rPr>
+        <w:t>losetas hexagonales adyacentes</w:t>
+      </w:r>
+      <w:r>
+        <w:rPr>
+          <w:rStyle w:val="Strong"/>
+          <w:rFonts w:ascii="Arial" w:hAnsi="Arial" w:cs="Arial"/>
+          <w:b w:val="0"/>
+          <w:bCs w:val="0"/>
+          <w:color w:val="414141"/>
+        </w:rPr>
+        <w:t xml:space="preserve"> unas a otras </w:t>
+      </w:r>
+      <w:r>
+        <w:rPr>
+          <w:rStyle w:val="Strong"/>
+          <w:rFonts w:ascii="Arial" w:hAnsi="Arial" w:cs="Arial"/>
+          <w:b w:val="0"/>
+          <w:bCs w:val="0"/>
+          <w:color w:val="414141"/>
+        </w:rPr>
+        <w:t xml:space="preserve">de manera aleatoria </w:t>
+      </w:r>
+      <w:r>
+        <w:rPr>
+          <w:rStyle w:val="Strong"/>
+          <w:rFonts w:ascii="Arial" w:hAnsi="Arial" w:cs="Arial"/>
+          <w:b w:val="0"/>
+          <w:bCs w:val="0"/>
+          <w:color w:val="414141"/>
+        </w:rPr>
+        <w:t>en la disposición que</w:t>
+      </w:r>
+      <w:r>
+        <w:rPr>
+          <w:rStyle w:val="Strong"/>
+          <w:rFonts w:ascii="Arial" w:hAnsi="Arial" w:cs="Arial"/>
+          <w:b w:val="0"/>
+          <w:bCs w:val="0"/>
+          <w:color w:val="414141"/>
+        </w:rPr>
+        <w:t xml:space="preserve"> muestra la </w:t>
+      </w:r>
+      <w:r>
+        <w:rPr>
+          <w:rStyle w:val="Strong"/>
+          <w:rFonts w:ascii="Arial" w:hAnsi="Arial" w:cs="Arial"/>
+          <w:i/>
+          <w:iCs/>
+          <w:color w:val="414141"/>
+        </w:rPr>
+        <w:t>figura</w:t>
+      </w:r>
+      <w:r>
+        <w:rPr>
+          <w:rStyle w:val="Strong"/>
+          <w:rFonts w:ascii="Arial" w:hAnsi="Arial" w:cs="Arial"/>
+          <w:i/>
+          <w:iCs/>
+          <w:color w:val="414141"/>
+        </w:rPr>
+        <w:t xml:space="preserve"> 4</w:t>
+      </w:r>
+      <w:r>
+        <w:rPr>
+          <w:rStyle w:val="Strong"/>
+          <w:rFonts w:ascii="Arial" w:hAnsi="Arial" w:cs="Arial"/>
+          <w:b w:val="0"/>
+          <w:bCs w:val="0"/>
+          <w:color w:val="414141"/>
+        </w:rPr>
+        <w:t xml:space="preserve">. La medida de un lado de cada loseta es de unos 5 cm y su apotema </w:t>
+      </w:r>
+      <w:r>
+        <w:rPr>
+          <w:rStyle w:val="Strong"/>
+          <w:rFonts w:ascii="Arial" w:hAnsi="Arial" w:cs="Arial"/>
+          <w:b w:val="0"/>
+          <w:bCs w:val="0"/>
+          <w:color w:val="414141"/>
+        </w:rPr>
+        <w:t>mide</w:t>
+      </w:r>
+      <w:r>
+        <w:rPr>
+          <w:rStyle w:val="Strong"/>
+          <w:rFonts w:ascii="Arial" w:hAnsi="Arial" w:cs="Arial"/>
+          <w:b w:val="0"/>
+          <w:bCs w:val="0"/>
+          <w:color w:val="414141"/>
+        </w:rPr>
+        <w:t xml:space="preserve"> unos 4cm.</w:t>
+      </w:r>
+    </w:p>
+    <w:p>
+      <w:pPr>
+        <w:pStyle w:val="NormalWeb"/>
+        <w:numPr>
+          <w:ilvl w:val="1"/>
+          <w:numId w:val="8"/>
+        </w:numPr>
+        <w:shd w:val="clear" w:color="auto" w:fill="FFFFFF"/>
+        <w:spacing w:before="0" w:beforeAutospacing="0" w:after="225" w:afterAutospacing="0" w:line="405" w:lineRule="atLeast"/>
+        <w:rPr>
+          <w:rStyle w:val="Strong"/>
+          <w:rFonts w:ascii="Arial" w:hAnsi="Arial" w:cs="Arial"/>
+          <w:b w:val="0"/>
+          <w:bCs w:val="0"/>
+          <w:color w:val="414141"/>
+        </w:rPr>
+      </w:pPr>
+      <w:r>
+        <w:rPr>
+          <w:rStyle w:val="Strong"/>
+          <w:rFonts w:ascii="Arial" w:hAnsi="Arial" w:cs="Arial"/>
+          <w:b w:val="0"/>
+          <w:bCs w:val="0"/>
+          <w:color w:val="414141"/>
+        </w:rPr>
+        <w:t>¿Cuál es el área total abarcada por las 19 losetas que conforman el mapa?</w:t>
+      </w:r>
+    </w:p>
+    <w:p>
+      <w:pPr>
+        <w:pStyle w:val="NormalWeb"/>
+        <w:shd w:val="clear" w:color="auto" w:fill="FFFFFF"/>
+        <w:spacing w:before="0" w:beforeAutospacing="0" w:after="225" w:afterAutospacing="0" w:line="405" w:lineRule="atLeast"/>
+        <w:ind w:left="1440"/>
+        <w:rPr>
+          <w:rStyle w:val="Strong"/>
+          <w:rFonts w:ascii="Arial" w:hAnsi="Arial" w:cs="Arial"/>
+          <w:b w:val="0"/>
+          <w:bCs w:val="0"/>
+          <w:color w:val="414141"/>
+        </w:rPr>
+      </w:pPr>
+    </w:p>
+    <w:p>
+      <w:pPr>
+        <w:pStyle w:val="NormalWeb"/>
+        <w:shd w:val="clear" w:color="auto" w:fill="FFFFFF"/>
+        <w:spacing w:before="0" w:beforeAutospacing="0" w:after="225" w:afterAutospacing="0" w:line="405" w:lineRule="atLeast"/>
+        <w:ind w:left="1440"/>
+        <w:rPr>
+          <w:rStyle w:val="Strong"/>
+          <w:rFonts w:ascii="Arial" w:hAnsi="Arial" w:cs="Arial"/>
+          <w:b w:val="0"/>
+          <w:bCs w:val="0"/>
+          <w:color w:val="414141"/>
+        </w:rPr>
+      </w:pPr>
+    </w:p>
+    <w:p>
+      <w:pPr>
+        <w:pStyle w:val="NormalWeb"/>
+        <w:numPr>
+          <w:ilvl w:val="1"/>
+          <w:numId w:val="8"/>
+        </w:numPr>
+        <w:shd w:val="clear" w:color="auto" w:fill="FFFFFF"/>
+        <w:spacing w:before="0" w:beforeAutospacing="0" w:after="225" w:afterAutospacing="0" w:line="405" w:lineRule="atLeast"/>
+        <w:rPr>
+          <w:rStyle w:val="Strong"/>
+          <w:rFonts w:ascii="Arial" w:hAnsi="Arial" w:cs="Arial"/>
+          <w:b w:val="0"/>
+          <w:bCs w:val="0"/>
+          <w:color w:val="414141"/>
+        </w:rPr>
+      </w:pPr>
+      <w:r>
+        <w:rPr>
+          <w:rStyle w:val="Strong"/>
+          <w:rFonts w:ascii="Arial" w:hAnsi="Arial" w:cs="Arial"/>
+          <w:b w:val="0"/>
+          <w:bCs w:val="0"/>
+          <w:color w:val="414141"/>
+        </w:rPr>
+        <w:t>¿Cuántos centímetros de costa tiene el mapa?</w:t>
+      </w:r>
+    </w:p>
+    <w:p>
+      <w:pPr>
+        <w:pStyle w:val="NormalWeb"/>
+        <w:shd w:val="clear" w:color="auto" w:fill="FFFFFF"/>
+        <w:spacing w:before="0" w:beforeAutospacing="0" w:after="225" w:afterAutospacing="0" w:line="405" w:lineRule="atLeast"/>
+        <w:ind w:left="1440"/>
+        <w:rPr>
+          <w:rStyle w:val="Strong"/>
+          <w:rFonts w:ascii="Arial" w:hAnsi="Arial" w:cs="Arial"/>
+          <w:b w:val="0"/>
+          <w:bCs w:val="0"/>
+          <w:color w:val="414141"/>
+        </w:rPr>
+      </w:pPr>
+    </w:p>
+    <w:p>
+      <w:pPr>
+        <w:pStyle w:val="NormalWeb"/>
+        <w:numPr>
+          <w:ilvl w:val="1"/>
+          <w:numId w:val="8"/>
+        </w:numPr>
+        <w:shd w:val="clear" w:color="auto" w:fill="FFFFFF"/>
+        <w:spacing w:before="0" w:beforeAutospacing="0" w:after="225" w:afterAutospacing="0" w:line="405" w:lineRule="atLeast"/>
+        <w:rPr>
+          <w:rStyle w:val="Strong"/>
+          <w:rFonts w:ascii="Arial" w:hAnsi="Arial" w:cs="Arial"/>
+          <w:b w:val="0"/>
+          <w:bCs w:val="0"/>
+          <w:color w:val="414141"/>
+        </w:rPr>
+      </w:pPr>
+      <w:r>
+        <w:rPr>
+          <w:rStyle w:val="Strong"/>
+          <w:rFonts w:ascii="Arial" w:hAnsi="Arial" w:cs="Arial"/>
+          <w:i/>
+          <w:iCs/>
+          <w:color w:val="414141"/>
+        </w:rPr>
+        <w:t>EXTRA</w:t>
+      </w:r>
+      <w:r>
+        <w:rPr>
+          <w:rStyle w:val="Strong"/>
+          <w:rFonts w:ascii="Arial" w:hAnsi="Arial" w:cs="Arial"/>
+          <w:b w:val="0"/>
+          <w:bCs w:val="0"/>
+          <w:color w:val="414141"/>
+        </w:rPr>
+        <w:t xml:space="preserve">: ¿Se pueden redistribuir las losetas en otra configuración para maximizar la longitud de costa? </w:t>
+      </w:r>
+      <w:r>
+        <w:rPr>
+          <w:rStyle w:val="Strong"/>
+          <w:rFonts w:ascii="Arial" w:hAnsi="Arial" w:cs="Arial"/>
+          <w:b w:val="0"/>
+          <w:bCs w:val="0"/>
+          <w:color w:val="414141"/>
+        </w:rPr>
+        <w:t xml:space="preserve">¿Cuánto valdría esa longitud máxima? </w:t>
+      </w:r>
+      <w:proofErr w:type="gramStart"/>
+      <w:r>
+        <w:rPr>
+          <w:rStyle w:val="Strong"/>
+          <w:rFonts w:ascii="Arial" w:hAnsi="Arial" w:cs="Arial"/>
+          <w:b w:val="0"/>
+          <w:bCs w:val="0"/>
+          <w:color w:val="414141"/>
+        </w:rPr>
+        <w:t>¿</w:t>
+      </w:r>
+      <w:proofErr w:type="gramEnd"/>
+      <w:r>
+        <w:rPr>
+          <w:rStyle w:val="Strong"/>
+          <w:rFonts w:ascii="Arial" w:hAnsi="Arial" w:cs="Arial"/>
+          <w:b w:val="0"/>
+          <w:bCs w:val="0"/>
+          <w:color w:val="414141"/>
+        </w:rPr>
+        <w:t>Se maximizaría así</w:t>
+      </w:r>
+      <w:r>
+        <w:rPr>
+          <w:rStyle w:val="Strong"/>
+          <w:rFonts w:ascii="Arial" w:hAnsi="Arial" w:cs="Arial"/>
+          <w:b w:val="0"/>
+          <w:bCs w:val="0"/>
+          <w:color w:val="414141"/>
+        </w:rPr>
+        <w:t xml:space="preserve"> el área abarcada? Dibuja un esquema de la configuración que </w:t>
+      </w:r>
+      <w:r>
+        <w:rPr>
+          <w:rStyle w:val="Strong"/>
+          <w:rFonts w:ascii="Arial" w:hAnsi="Arial" w:cs="Arial"/>
+          <w:b w:val="0"/>
+          <w:bCs w:val="0"/>
+          <w:color w:val="414141"/>
+        </w:rPr>
+        <w:t xml:space="preserve">maximiza </w:t>
+      </w:r>
+      <w:proofErr w:type="spellStart"/>
+      <w:r>
+        <w:rPr>
+          <w:rStyle w:val="Strong"/>
+          <w:rFonts w:ascii="Arial" w:hAnsi="Arial" w:cs="Arial"/>
+          <w:b w:val="0"/>
+          <w:bCs w:val="0"/>
+          <w:color w:val="414141"/>
+        </w:rPr>
+        <w:t>el</w:t>
+      </w:r>
+      <w:proofErr w:type="spellEnd"/>
+      <w:r>
+        <w:rPr>
+          <w:rStyle w:val="Strong"/>
+          <w:rFonts w:ascii="Arial" w:hAnsi="Arial" w:cs="Arial"/>
+          <w:b w:val="0"/>
+          <w:bCs w:val="0"/>
+          <w:color w:val="414141"/>
+        </w:rPr>
+        <w:t xml:space="preserve"> área</w:t>
+      </w:r>
+      <w:r>
+        <w:rPr>
+          <w:rStyle w:val="Strong"/>
+          <w:rFonts w:ascii="Arial" w:hAnsi="Arial" w:cs="Arial"/>
+          <w:b w:val="0"/>
+          <w:bCs w:val="0"/>
+          <w:color w:val="414141"/>
+        </w:rPr>
+        <w:t xml:space="preserve">, si </w:t>
+      </w:r>
+      <w:r>
+        <w:rPr>
+          <w:rStyle w:val="Strong"/>
+          <w:rFonts w:ascii="Arial" w:hAnsi="Arial" w:cs="Arial"/>
+          <w:b w:val="0"/>
+          <w:bCs w:val="0"/>
+          <w:color w:val="414141"/>
+        </w:rPr>
+        <w:t>existiera</w:t>
+      </w:r>
+      <w:r>
+        <w:rPr>
+          <w:rStyle w:val="Strong"/>
+          <w:rFonts w:ascii="Arial" w:hAnsi="Arial" w:cs="Arial"/>
+          <w:b w:val="0"/>
+          <w:bCs w:val="0"/>
+          <w:color w:val="414141"/>
+        </w:rPr>
+        <w:t>.</w:t>
+      </w:r>
+    </w:p>
+    <w:p>
+      <w:pPr>
+        <w:pStyle w:val="NormalWeb"/>
+        <w:shd w:val="clear" w:color="auto" w:fill="FFFFFF"/>
+        <w:spacing w:before="0" w:beforeAutospacing="0" w:after="225" w:afterAutospacing="0" w:line="405" w:lineRule="atLeast"/>
+        <w:rPr>
+          <w:rFonts w:ascii="Arial" w:hAnsi="Arial" w:cs="Arial"/>
+          <w:color w:val="414141"/>
+        </w:rPr>
+      </w:pPr>
+    </w:p>
+    <w:p>
+      <w:pPr>
+        <w:pStyle w:val="NormalWeb"/>
+        <w:keepNext/>
+        <w:shd w:val="clear" w:color="auto" w:fill="FFFFFF"/>
+        <w:spacing w:before="0" w:beforeAutospacing="0" w:after="225" w:afterAutospacing="0" w:line="405" w:lineRule="atLeast"/>
+        <w:ind w:left="720"/>
       </w:pPr>
       <w:r>
         <w:rPr>
@@ -481,9 +3223,95 @@
         </w:rPr>
         <w:lastRenderedPageBreak/>
         <w:drawing>
-          <wp:inline distT="0" distB="0" distL="0" distR="0" wp14:anchorId="51F698C2" wp14:editId="0A63B1E8">
-            <wp:extent cx="5400040" cy="4988560"/>
-            <wp:effectExtent l="0" t="0" r="0" b="2540"/>
+          <wp:inline distT="0" distB="0" distL="0" distR="0" wp14:anchorId="24356F61" wp14:editId="08E590B2">
+            <wp:extent cx="5118100" cy="3595429"/>
+            <wp:effectExtent l="0" t="0" r="6350" b="5080"/>
+            <wp:docPr id="904970291" name="Picture 1"/>
+            <wp:cNvGraphicFramePr>
+              <a:graphicFrameLocks xmlns:a="http://schemas.openxmlformats.org/drawingml/2006/main" noChangeAspect="1"/>
+            </wp:cNvGraphicFramePr>
+            <a:graphic xmlns:a="http://schemas.openxmlformats.org/drawingml/2006/main">
+              <a:graphicData uri="http://schemas.openxmlformats.org/drawingml/2006/picture">
+                <pic:pic xmlns:pic="http://schemas.openxmlformats.org/drawingml/2006/picture">
+                  <pic:nvPicPr>
+                    <pic:cNvPr id="904970291" name=""/>
+                    <pic:cNvPicPr/>
+                  </pic:nvPicPr>
+                  <pic:blipFill>
+                    <a:blip r:embed="rId14"/>
+                    <a:stretch>
+                      <a:fillRect/>
+                    </a:stretch>
+                  </pic:blipFill>
+                  <pic:spPr>
+                    <a:xfrm>
+                      <a:off x="0" y="0"/>
+                      <a:ext cx="5120087" cy="3596825"/>
+                    </a:xfrm>
+                    <a:prstGeom prst="rect">
+                      <a:avLst/>
+                    </a:prstGeom>
+                  </pic:spPr>
+                </pic:pic>
+              </a:graphicData>
+            </a:graphic>
+          </wp:inline>
+        </w:drawing>
+      </w:r>
+    </w:p>
+    <w:p>
+      <w:pPr>
+        <w:pStyle w:val="Caption"/>
+      </w:pPr>
+      <w:r>
+        <w:t xml:space="preserve">figura </w:t>
+      </w:r>
+      <w:r>
+        <w:fldChar w:fldCharType="begin"/>
+      </w:r>
+      <w:r>
+        <w:instrText xml:space="preserve"> SEQ figura \* ARABIC </w:instrText>
+      </w:r>
+      <w:r>
+        <w:fldChar w:fldCharType="separate"/>
+      </w:r>
+      <w:r>
+        <w:rPr>
+          <w:noProof/>
+        </w:rPr>
+        <w:t>1</w:t>
+      </w:r>
+      <w:r>
+        <w:fldChar w:fldCharType="end"/>
+      </w:r>
+      <w:r>
+        <w:t xml:space="preserve">: Ingresos y gastos en </w:t>
+      </w:r>
+      <w:r>
+        <w:t>la</w:t>
+      </w:r>
+      <w:r>
+        <w:t xml:space="preserve"> tienda de zapatos.</w:t>
+      </w:r>
+    </w:p>
+    <w:p/>
+    <w:p>
+      <w:pPr>
+        <w:keepNext/>
+      </w:pPr>
+      <w:r>
+        <w:rPr>
+          <w:rStyle w:val="Strong"/>
+          <w:rFonts w:ascii="Arial" w:hAnsi="Arial" w:cs="Arial"/>
+          <w:b w:val="0"/>
+          <w:bCs w:val="0"/>
+          <w:noProof/>
+          <w:color w:val="414141"/>
+        </w:rPr>
+        <w:drawing>
+          <wp:inline distT="0" distB="0" distL="0" distR="0" wp14:anchorId="2DCEC0CD" wp14:editId="22CA5DC7">
+            <wp:extent cx="3546869" cy="3276600"/>
+            <wp:effectExtent l="0" t="0" r="0" b="0"/>
             <wp:docPr id="536709051" name="Picture 1"/>
             <wp:cNvGraphicFramePr>
               <a:graphicFrameLocks xmlns:a="http://schemas.openxmlformats.org/drawingml/2006/main" noChangeAspect="1"/>
@@ -496,7 +3324,7 @@
                     <pic:cNvPicPr/>
                   </pic:nvPicPr>
                   <pic:blipFill>
-                    <a:blip r:embed="rId8"/>
+                    <a:blip r:embed="rId15"/>
                     <a:stretch>
                       <a:fillRect/>
                     </a:stretch>
@@ -504,7 +3332,7 @@
                   <pic:spPr>
                     <a:xfrm>
                       <a:off x="0" y="0"/>
-                      <a:ext cx="5400040" cy="4988560"/>
+                      <a:ext cx="3560914" cy="3289574"/>
                     </a:xfrm>
                     <a:prstGeom prst="rect">
                       <a:avLst/>
@@ -519,36 +3347,209 @@
     </w:p>
     <w:p>
       <w:pPr>
-        <w:pStyle w:val="NormalWeb"/>
-        <w:numPr>
-          <w:ilvl w:val="0"/>
-          <w:numId w:val="8"/>
-        </w:numPr>
-        <w:shd w:val="clear" w:color="auto" w:fill="FFFFFF"/>
-        <w:spacing w:before="0" w:beforeAutospacing="0" w:after="225" w:afterAutospacing="0" w:line="405" w:lineRule="atLeast"/>
-        <w:rPr>
-          <w:rFonts w:ascii="Arial" w:hAnsi="Arial" w:cs="Arial"/>
-          <w:color w:val="414141"/>
-        </w:rPr>
-      </w:pPr>
-      <w:r>
-        <w:rPr>
-          <w:rStyle w:val="Strong"/>
-          <w:rFonts w:ascii="Arial" w:hAnsi="Arial" w:cs="Arial"/>
-          <w:b w:val="0"/>
-          <w:bCs w:val="0"/>
-          <w:color w:val="414141"/>
-        </w:rPr>
-        <w:t>¿Cuánto mide cada ángulo de un hexágono regular?</w:t>
+        <w:pStyle w:val="Caption"/>
+      </w:pPr>
+      <w:r>
+        <w:t xml:space="preserve">figura </w:t>
+      </w:r>
+      <w:r>
+        <w:fldChar w:fldCharType="begin"/>
+      </w:r>
+      <w:r>
+        <w:instrText xml:space="preserve"> SEQ figura \* ARABIC </w:instrText>
+      </w:r>
+      <w:r>
+        <w:fldChar w:fldCharType="separate"/>
+      </w:r>
+      <w:r>
+        <w:rPr>
+          <w:noProof/>
+        </w:rPr>
+        <w:t>2</w:t>
+      </w:r>
+      <w:r>
+        <w:fldChar w:fldCharType="end"/>
+      </w:r>
+      <w:r>
+        <w:t xml:space="preserve">: </w:t>
+      </w:r>
+      <w:r>
+        <w:t>Logo de la marca de alpargatas de Alberto.</w:t>
+      </w:r>
+    </w:p>
+    <w:p/>
+    <w:p>
+      <w:pPr>
+        <w:keepNext/>
+      </w:pPr>
+      <w:r>
+        <w:rPr>
+          <w:rFonts w:ascii="Arial" w:hAnsi="Arial" w:cs="Arial"/>
+          <w:color w:val="414141"/>
+        </w:rPr>
+        <w:lastRenderedPageBreak/>
+        <w:drawing>
+          <wp:inline distT="0" distB="0" distL="0" distR="0" wp14:anchorId="10AF5BA8" wp14:editId="56CCB927">
+            <wp:extent cx="3943871" cy="3352800"/>
+            <wp:effectExtent l="0" t="0" r="0" b="0"/>
+            <wp:docPr id="273998695" name="Picture 1"/>
+            <wp:cNvGraphicFramePr>
+              <a:graphicFrameLocks xmlns:a="http://schemas.openxmlformats.org/drawingml/2006/main" noChangeAspect="1"/>
+            </wp:cNvGraphicFramePr>
+            <a:graphic xmlns:a="http://schemas.openxmlformats.org/drawingml/2006/main">
+              <a:graphicData uri="http://schemas.openxmlformats.org/drawingml/2006/picture">
+                <pic:pic xmlns:pic="http://schemas.openxmlformats.org/drawingml/2006/picture">
+                  <pic:nvPicPr>
+                    <pic:cNvPr id="273998695" name=""/>
+                    <pic:cNvPicPr/>
+                  </pic:nvPicPr>
+                  <pic:blipFill>
+                    <a:blip r:embed="rId16"/>
+                    <a:stretch>
+                      <a:fillRect/>
+                    </a:stretch>
+                  </pic:blipFill>
+                  <pic:spPr>
+                    <a:xfrm>
+                      <a:off x="0" y="0"/>
+                      <a:ext cx="3946132" cy="3354722"/>
+                    </a:xfrm>
+                    <a:prstGeom prst="rect">
+                      <a:avLst/>
+                    </a:prstGeom>
+                  </pic:spPr>
+                </pic:pic>
+              </a:graphicData>
+            </a:graphic>
+          </wp:inline>
+        </w:drawing>
+      </w:r>
+    </w:p>
+    <w:p>
+      <w:pPr>
+        <w:pStyle w:val="Caption"/>
+      </w:pPr>
+      <w:r>
+        <w:t xml:space="preserve">figura </w:t>
+      </w:r>
+      <w:r>
+        <w:fldChar w:fldCharType="begin"/>
+      </w:r>
+      <w:r>
+        <w:instrText xml:space="preserve"> SEQ figura \* ARABIC </w:instrText>
+      </w:r>
+      <w:r>
+        <w:fldChar w:fldCharType="separate"/>
+      </w:r>
+      <w:r>
+        <w:rPr>
+          <w:noProof/>
+        </w:rPr>
+        <w:t>3</w:t>
+      </w:r>
+      <w:r>
+        <w:fldChar w:fldCharType="end"/>
+      </w:r>
+      <w:r>
+        <w:t xml:space="preserve">: </w:t>
+      </w:r>
+      <w:r>
+        <w:t>P</w:t>
+      </w:r>
+      <w:r>
+        <w:t>erfil de la carretilla de Alberto.</w:t>
+      </w:r>
+    </w:p>
+    <w:p/>
+    <w:p>
+      <w:pPr>
+        <w:keepNext/>
+      </w:pPr>
+      <w:r>
+        <w:rPr>
+          <w:noProof/>
+        </w:rPr>
+        <w:drawing>
+          <wp:inline distT="0" distB="0" distL="0" distR="0" wp14:anchorId="7E8D3B32" wp14:editId="06DF0355">
+            <wp:extent cx="3943833" cy="3777343"/>
+            <wp:effectExtent l="0" t="0" r="0" b="0"/>
+            <wp:docPr id="708784924" name="Picture 1" descr="Dónde te colocas primero en este tablero? : r/Catan"/>
+            <wp:cNvGraphicFramePr>
+              <a:graphicFrameLocks xmlns:a="http://schemas.openxmlformats.org/drawingml/2006/main" noChangeAspect="1"/>
+            </wp:cNvGraphicFramePr>
+            <a:graphic xmlns:a="http://schemas.openxmlformats.org/drawingml/2006/main">
+              <a:graphicData uri="http://schemas.openxmlformats.org/drawingml/2006/picture">
+                <pic:pic xmlns:pic="http://schemas.openxmlformats.org/drawingml/2006/picture">
+                  <pic:nvPicPr>
+                    <pic:cNvPr id="0" name="Picture 1" descr="Dónde te colocas primero en este tablero? : r/Catan"/>
+                    <pic:cNvPicPr>
+                      <a:picLocks noChangeAspect="1" noChangeArrowheads="1"/>
+                    </pic:cNvPicPr>
+                  </pic:nvPicPr>
+                  <pic:blipFill>
+                    <a:blip r:embed="rId17">
+                      <a:extLst>
+                        <a:ext uri="{28A0092B-C50C-407E-A947-70E740481C1C}">
+                          <a14:useLocalDpi xmlns:a14="http://schemas.microsoft.com/office/drawing/2010/main" val="0"/>
+                        </a:ext>
+                      </a:extLst>
+                    </a:blip>
+                    <a:srcRect/>
+                    <a:stretch>
+                      <a:fillRect/>
+                    </a:stretch>
+                  </pic:blipFill>
+                  <pic:spPr bwMode="auto">
+                    <a:xfrm>
+                      <a:off x="0" y="0"/>
+                      <a:ext cx="3953259" cy="3786371"/>
+                    </a:xfrm>
+                    <a:prstGeom prst="rect">
+                      <a:avLst/>
+                    </a:prstGeom>
+                    <a:noFill/>
+                    <a:ln>
+                      <a:noFill/>
+                    </a:ln>
+                  </pic:spPr>
+                </pic:pic>
+              </a:graphicData>
+            </a:graphic>
+          </wp:inline>
+        </w:drawing>
+      </w:r>
+    </w:p>
+    <w:p>
+      <w:pPr>
+        <w:pStyle w:val="Caption"/>
+      </w:pPr>
+      <w:r>
+        <w:t xml:space="preserve">figura </w:t>
+      </w:r>
+      <w:r>
+        <w:fldChar w:fldCharType="begin"/>
+      </w:r>
+      <w:r>
+        <w:instrText xml:space="preserve"> SEQ figura \* ARABIC </w:instrText>
+      </w:r>
+      <w:r>
+        <w:fldChar w:fldCharType="separate"/>
+      </w:r>
+      <w:r>
+        <w:rPr>
+          <w:noProof/>
+        </w:rPr>
+        <w:t>4</w:t>
+      </w:r>
+      <w:r>
+        <w:fldChar w:fldCharType="end"/>
+      </w:r>
+      <w:r>
+        <w:t>: Tablero de Catán.</w:t>
       </w:r>
     </w:p>
     <w:sectPr>
-      <w:headerReference w:type="even" r:id="rId9"/>
-      <w:headerReference w:type="default" r:id="rId10"/>
-      <w:footerReference w:type="even" r:id="rId11"/>
-      <w:footerReference w:type="default" r:id="rId12"/>
-      <w:headerReference w:type="first" r:id="rId13"/>
-      <w:footerReference w:type="first" r:id="rId14"/>
+      <w:headerReference w:type="default" r:id="rId18"/>
       <w:type w:val="continuous"/>
       <w:pgSz w:w="11906" w:h="16838"/>
       <w:pgMar w:top="1417" w:right="1701" w:bottom="1417" w:left="1701" w:header="283" w:footer="708" w:gutter="0"/>
@@ -579,36 +3580,6 @@
 </w:endnotes>
 </file>
 
-<file path=word/footer1.xml><?xml version="1.0" encoding="utf-8"?>
-<w:ftr xmlns:wpc="http://schemas.microsoft.com/office/word/2010/wordprocessingCanvas" xmlns:cx="http://schemas.microsoft.com/office/drawing/2014/chartex" xmlns:cx1="http://schemas.microsoft.com/office/drawing/2015/9/8/chartex" xmlns:cx2="http://schemas.microsoft.com/office/drawing/2015/10/21/chartex" xmlns:cx3="http://schemas.microsoft.com/office/drawing/2016/5/9/chartex" xmlns:cx4="http://schemas.microsoft.com/office/drawing/2016/5/10/chartex" xmlns:cx5="http://schemas.microsoft.com/office/drawing/2016/5/11/chartex" xmlns:cx6="http://schemas.microsoft.com/office/drawing/2016/5/12/chartex" xmlns:cx7="http://schemas.microsoft.com/office/drawing/2016/5/13/chartex" xmlns:cx8="http://schemas.microsoft.com/office/drawing/2016/5/14/chartex" xmlns:mc="http://schemas.openxmlformats.org/markup-compatibility/2006" xmlns:aink="http://schemas.microsoft.com/office/drawing/2016/ink" xmlns:am3d="http://schemas.microsoft.com/office/drawing/2017/model3d" xmlns:o="urn:schemas-microsoft-com:office:office" xmlns:oel="http://schemas.microsoft.com/office/2019/extlst" xmlns:r="http://schemas.openxmlformats.org/officeDocument/2006/relationships" xmlns:m="http://schemas.openxmlformats.org/officeDocument/2006/math" xmlns:v="urn:schemas-microsoft-com:vml" xmlns:wp14="http://schemas.microsoft.com/office/word/2010/wordprocessingDrawing" xmlns:wp="http://schemas.openxmlformats.org/drawingml/2006/wordprocessingDrawing" xmlns:w10="urn:schemas-microsoft-com:office:word" xmlns:w="http://schemas.openxmlformats.org/wordprocessingml/2006/main" xmlns:w14="http://schemas.microsoft.com/office/word/2010/wordml" xmlns:w15="http://schemas.microsoft.com/office/word/2012/wordml" xmlns:w16cex="http://schemas.microsoft.com/office/word/2018/wordml/cex" xmlns:w16cid="http://schemas.microsoft.com/office/word/2016/wordml/cid" xmlns:w16="http://schemas.microsoft.com/office/word/2018/wordml" xmlns:w16du="http://schemas.microsoft.com/office/word/2023/wordml/word16du" xmlns:w16sdtdh="http://schemas.microsoft.com/office/word/2020/wordml/sdtdatahash" xmlns:w16sdtfl="http://schemas.microsoft.com/office/word/2024/wordml/sdtformatlock" xmlns:w16se="http://schemas.microsoft.com/office/word/2015/wordml/symex" xmlns:wpg="http://schemas.microsoft.com/office/word/2010/wordprocessingGroup" xmlns:wpi="http://schemas.microsoft.com/office/word/2010/wordprocessingInk" xmlns:wne="http://schemas.microsoft.com/office/word/2006/wordml" xmlns:wps="http://schemas.microsoft.com/office/word/2010/wordprocessingShape" mc:Ignorable="w14 w15 w16se w16cid w16 w16cex w16sdtdh w16sdtfl w16du wp14">
-  <w:p>
-    <w:pPr>
-      <w:pStyle w:val="Footer"/>
-    </w:pPr>
-  </w:p>
-</w:ftr>
-</file>
-
-<file path=word/footer2.xml><?xml version="1.0" encoding="utf-8"?>
-<w:ftr xmlns:wpc="http://schemas.microsoft.com/office/word/2010/wordprocessingCanvas" xmlns:cx="http://schemas.microsoft.com/office/drawing/2014/chartex" xmlns:cx1="http://schemas.microsoft.com/office/drawing/2015/9/8/chartex" xmlns:cx2="http://schemas.microsoft.com/office/drawing/2015/10/21/chartex" xmlns:cx3="http://schemas.microsoft.com/office/drawing/2016/5/9/chartex" xmlns:cx4="http://schemas.microsoft.com/office/drawing/2016/5/10/chartex" xmlns:cx5="http://schemas.microsoft.com/office/drawing/2016/5/11/chartex" xmlns:cx6="http://schemas.microsoft.com/office/drawing/2016/5/12/chartex" xmlns:cx7="http://schemas.microsoft.com/office/drawing/2016/5/13/chartex" xmlns:cx8="http://schemas.microsoft.com/office/drawing/2016/5/14/chartex" xmlns:mc="http://schemas.openxmlformats.org/markup-compatibility/2006" xmlns:aink="http://schemas.microsoft.com/office/drawing/2016/ink" xmlns:am3d="http://schemas.microsoft.com/office/drawing/2017/model3d" xmlns:o="urn:schemas-microsoft-com:office:office" xmlns:oel="http://schemas.microsoft.com/office/2019/extlst" xmlns:r="http://schemas.openxmlformats.org/officeDocument/2006/relationships" xmlns:m="http://schemas.openxmlformats.org/officeDocument/2006/math" xmlns:v="urn:schemas-microsoft-com:vml" xmlns:wp14="http://schemas.microsoft.com/office/word/2010/wordprocessingDrawing" xmlns:wp="http://schemas.openxmlformats.org/drawingml/2006/wordprocessingDrawing" xmlns:w10="urn:schemas-microsoft-com:office:word" xmlns:w="http://schemas.openxmlformats.org/wordprocessingml/2006/main" xmlns:w14="http://schemas.microsoft.com/office/word/2010/wordml" xmlns:w15="http://schemas.microsoft.com/office/word/2012/wordml" xmlns:w16cex="http://schemas.microsoft.com/office/word/2018/wordml/cex" xmlns:w16cid="http://schemas.microsoft.com/office/word/2016/wordml/cid" xmlns:w16="http://schemas.microsoft.com/office/word/2018/wordml" xmlns:w16du="http://schemas.microsoft.com/office/word/2023/wordml/word16du" xmlns:w16sdtdh="http://schemas.microsoft.com/office/word/2020/wordml/sdtdatahash" xmlns:w16sdtfl="http://schemas.microsoft.com/office/word/2024/wordml/sdtformatlock" xmlns:w16se="http://schemas.microsoft.com/office/word/2015/wordml/symex" xmlns:wpg="http://schemas.microsoft.com/office/word/2010/wordprocessingGroup" xmlns:wpi="http://schemas.microsoft.com/office/word/2010/wordprocessingInk" xmlns:wne="http://schemas.microsoft.com/office/word/2006/wordml" xmlns:wps="http://schemas.microsoft.com/office/word/2010/wordprocessingShape" mc:Ignorable="w14 w15 w16se w16cid w16 w16cex w16sdtdh w16sdtfl w16du wp14">
-  <w:p>
-    <w:pPr>
-      <w:pStyle w:val="Footer"/>
-    </w:pPr>
-  </w:p>
-</w:ftr>
-</file>
-
-<file path=word/footer3.xml><?xml version="1.0" encoding="utf-8"?>
-<w:ftr xmlns:wpc="http://schemas.microsoft.com/office/word/2010/wordprocessingCanvas" xmlns:cx="http://schemas.microsoft.com/office/drawing/2014/chartex" xmlns:cx1="http://schemas.microsoft.com/office/drawing/2015/9/8/chartex" xmlns:cx2="http://schemas.microsoft.com/office/drawing/2015/10/21/chartex" xmlns:cx3="http://schemas.microsoft.com/office/drawing/2016/5/9/chartex" xmlns:cx4="http://schemas.microsoft.com/office/drawing/2016/5/10/chartex" xmlns:cx5="http://schemas.microsoft.com/office/drawing/2016/5/11/chartex" xmlns:cx6="http://schemas.microsoft.com/office/drawing/2016/5/12/chartex" xmlns:cx7="http://schemas.microsoft.com/office/drawing/2016/5/13/chartex" xmlns:cx8="http://schemas.microsoft.com/office/drawing/2016/5/14/chartex" xmlns:mc="http://schemas.openxmlformats.org/markup-compatibility/2006" xmlns:aink="http://schemas.microsoft.com/office/drawing/2016/ink" xmlns:am3d="http://schemas.microsoft.com/office/drawing/2017/model3d" xmlns:o="urn:schemas-microsoft-com:office:office" xmlns:oel="http://schemas.microsoft.com/office/2019/extlst" xmlns:r="http://schemas.openxmlformats.org/officeDocument/2006/relationships" xmlns:m="http://schemas.openxmlformats.org/officeDocument/2006/math" xmlns:v="urn:schemas-microsoft-com:vml" xmlns:wp14="http://schemas.microsoft.com/office/word/2010/wordprocessingDrawing" xmlns:wp="http://schemas.openxmlformats.org/drawingml/2006/wordprocessingDrawing" xmlns:w10="urn:schemas-microsoft-com:office:word" xmlns:w="http://schemas.openxmlformats.org/wordprocessingml/2006/main" xmlns:w14="http://schemas.microsoft.com/office/word/2010/wordml" xmlns:w15="http://schemas.microsoft.com/office/word/2012/wordml" xmlns:w16cex="http://schemas.microsoft.com/office/word/2018/wordml/cex" xmlns:w16cid="http://schemas.microsoft.com/office/word/2016/wordml/cid" xmlns:w16="http://schemas.microsoft.com/office/word/2018/wordml" xmlns:w16du="http://schemas.microsoft.com/office/word/2023/wordml/word16du" xmlns:w16sdtdh="http://schemas.microsoft.com/office/word/2020/wordml/sdtdatahash" xmlns:w16sdtfl="http://schemas.microsoft.com/office/word/2024/wordml/sdtformatlock" xmlns:w16se="http://schemas.microsoft.com/office/word/2015/wordml/symex" xmlns:wpg="http://schemas.microsoft.com/office/word/2010/wordprocessingGroup" xmlns:wpi="http://schemas.microsoft.com/office/word/2010/wordprocessingInk" xmlns:wne="http://schemas.microsoft.com/office/word/2006/wordml" xmlns:wps="http://schemas.microsoft.com/office/word/2010/wordprocessingShape" mc:Ignorable="w14 w15 w16se w16cid w16 w16cex w16sdtdh w16sdtfl w16du wp14">
-  <w:p>
-    <w:pPr>
-      <w:pStyle w:val="Footer"/>
-    </w:pPr>
-  </w:p>
-</w:ftr>
-</file>
-
 <file path=word/footnotes.xml><?xml version="1.0" encoding="utf-8"?>
 <w:footnotes xmlns:wpc="http://schemas.microsoft.com/office/word/2010/wordprocessingCanvas" xmlns:cx="http://schemas.microsoft.com/office/drawing/2014/chartex" xmlns:cx1="http://schemas.microsoft.com/office/drawing/2015/9/8/chartex" xmlns:cx2="http://schemas.microsoft.com/office/drawing/2015/10/21/chartex" xmlns:cx3="http://schemas.microsoft.com/office/drawing/2016/5/9/chartex" xmlns:cx4="http://schemas.microsoft.com/office/drawing/2016/5/10/chartex" xmlns:cx5="http://schemas.microsoft.com/office/drawing/2016/5/11/chartex" xmlns:cx6="http://schemas.microsoft.com/office/drawing/2016/5/12/chartex" xmlns:cx7="http://schemas.microsoft.com/office/drawing/2016/5/13/chartex" xmlns:cx8="http://schemas.microsoft.com/office/drawing/2016/5/14/chartex" xmlns:mc="http://schemas.openxmlformats.org/markup-compatibility/2006" xmlns:aink="http://schemas.microsoft.com/office/drawing/2016/ink" xmlns:am3d="http://schemas.microsoft.com/office/drawing/2017/model3d" xmlns:o="urn:schemas-microsoft-com:office:office" xmlns:oel="http://schemas.microsoft.com/office/2019/extlst" xmlns:r="http://schemas.openxmlformats.org/officeDocument/2006/relationships" xmlns:m="http://schemas.openxmlformats.org/officeDocument/2006/math" xmlns:v="urn:schemas-microsoft-com:vml" xmlns:wp14="http://schemas.microsoft.com/office/word/2010/wordprocessingDrawing" xmlns:wp="http://schemas.openxmlformats.org/drawingml/2006/wordprocessingDrawing" xmlns:w10="urn:schemas-microsoft-com:office:word" xmlns:w="http://schemas.openxmlformats.org/wordprocessingml/2006/main" xmlns:w14="http://schemas.microsoft.com/office/word/2010/wordml" xmlns:w15="http://schemas.microsoft.com/office/word/2012/wordml" xmlns:w16cex="http://schemas.microsoft.com/office/word/2018/wordml/cex" xmlns:w16cid="http://schemas.microsoft.com/office/word/2016/wordml/cid" xmlns:w16="http://schemas.microsoft.com/office/word/2018/wordml" xmlns:w16du="http://schemas.microsoft.com/office/word/2023/wordml/word16du" xmlns:w16sdtdh="http://schemas.microsoft.com/office/word/2020/wordml/sdtdatahash" xmlns:w16sdtfl="http://schemas.microsoft.com/office/word/2024/wordml/sdtformatlock" xmlns:w16se="http://schemas.microsoft.com/office/word/2015/wordml/symex" xmlns:wpg="http://schemas.microsoft.com/office/word/2010/wordprocessingGroup" xmlns:wpi="http://schemas.microsoft.com/office/word/2010/wordprocessingInk" xmlns:wne="http://schemas.microsoft.com/office/word/2006/wordml" xmlns:wps="http://schemas.microsoft.com/office/word/2010/wordprocessingShape" mc:Ignorable="w14 w15 w16se w16cid w16 w16cex w16sdtdh w16sdtfl w16du wp14">
   <w:footnote w:type="separator" w:id="-1">
@@ -629,16 +3600,6 @@
 </file>
 
 <file path=word/header1.xml><?xml version="1.0" encoding="utf-8"?>
-<w:hdr xmlns:wpc="http://schemas.microsoft.com/office/word/2010/wordprocessingCanvas" xmlns:cx="http://schemas.microsoft.com/office/drawing/2014/chartex" xmlns:cx1="http://schemas.microsoft.com/office/drawing/2015/9/8/chartex" xmlns:cx2="http://schemas.microsoft.com/office/drawing/2015/10/21/chartex" xmlns:cx3="http://schemas.microsoft.com/office/drawing/2016/5/9/chartex" xmlns:cx4="http://schemas.microsoft.com/office/drawing/2016/5/10/chartex" xmlns:cx5="http://schemas.microsoft.com/office/drawing/2016/5/11/chartex" xmlns:cx6="http://schemas.microsoft.com/office/drawing/2016/5/12/chartex" xmlns:cx7="http://schemas.microsoft.com/office/drawing/2016/5/13/chartex" xmlns:cx8="http://schemas.microsoft.com/office/drawing/2016/5/14/chartex" xmlns:mc="http://schemas.openxmlformats.org/markup-compatibility/2006" xmlns:aink="http://schemas.microsoft.com/office/drawing/2016/ink" xmlns:am3d="http://schemas.microsoft.com/office/drawing/2017/model3d" xmlns:o="urn:schemas-microsoft-com:office:office" xmlns:oel="http://schemas.microsoft.com/office/2019/extlst" xmlns:r="http://schemas.openxmlformats.org/officeDocument/2006/relationships" xmlns:m="http://schemas.openxmlformats.org/officeDocument/2006/math" xmlns:v="urn:schemas-microsoft-com:vml" xmlns:wp14="http://schemas.microsoft.com/office/word/2010/wordprocessingDrawing" xmlns:wp="http://schemas.openxmlformats.org/drawingml/2006/wordprocessingDrawing" xmlns:w10="urn:schemas-microsoft-com:office:word" xmlns:w="http://schemas.openxmlformats.org/wordprocessingml/2006/main" xmlns:w14="http://schemas.microsoft.com/office/word/2010/wordml" xmlns:w15="http://schemas.microsoft.com/office/word/2012/wordml" xmlns:w16cex="http://schemas.microsoft.com/office/word/2018/wordml/cex" xmlns:w16cid="http://schemas.microsoft.com/office/word/2016/wordml/cid" xmlns:w16="http://schemas.microsoft.com/office/word/2018/wordml" xmlns:w16du="http://schemas.microsoft.com/office/word/2023/wordml/word16du" xmlns:w16sdtdh="http://schemas.microsoft.com/office/word/2020/wordml/sdtdatahash" xmlns:w16sdtfl="http://schemas.microsoft.com/office/word/2024/wordml/sdtformatlock" xmlns:w16se="http://schemas.microsoft.com/office/word/2015/wordml/symex" xmlns:wpg="http://schemas.microsoft.com/office/word/2010/wordprocessingGroup" xmlns:wpi="http://schemas.microsoft.com/office/word/2010/wordprocessingInk" xmlns:wne="http://schemas.microsoft.com/office/word/2006/wordml" xmlns:wps="http://schemas.microsoft.com/office/word/2010/wordprocessingShape" mc:Ignorable="w14 w15 w16se w16cid w16 w16cex w16sdtdh w16sdtfl w16du wp14">
-  <w:p>
-    <w:pPr>
-      <w:pStyle w:val="Header"/>
-    </w:pPr>
-  </w:p>
-</w:hdr>
-</file>
-
-<file path=word/header2.xml><?xml version="1.0" encoding="utf-8"?>
 <w:hdr xmlns:wpc="http://schemas.microsoft.com/office/word/2010/wordprocessingCanvas" xmlns:cx="http://schemas.microsoft.com/office/drawing/2014/chartex" xmlns:cx1="http://schemas.microsoft.com/office/drawing/2015/9/8/chartex" xmlns:cx2="http://schemas.microsoft.com/office/drawing/2015/10/21/chartex" xmlns:cx3="http://schemas.microsoft.com/office/drawing/2016/5/9/chartex" xmlns:cx4="http://schemas.microsoft.com/office/drawing/2016/5/10/chartex" xmlns:cx5="http://schemas.microsoft.com/office/drawing/2016/5/11/chartex" xmlns:cx6="http://schemas.microsoft.com/office/drawing/2016/5/12/chartex" xmlns:cx7="http://schemas.microsoft.com/office/drawing/2016/5/13/chartex" xmlns:cx8="http://schemas.microsoft.com/office/drawing/2016/5/14/chartex" xmlns:mc="http://schemas.openxmlformats.org/markup-compatibility/2006" xmlns:aink="http://schemas.microsoft.com/office/drawing/2016/ink" xmlns:am3d="http://schemas.microsoft.com/office/drawing/2017/model3d" xmlns:o="urn:schemas-microsoft-com:office:office" xmlns:oel="http://schemas.microsoft.com/office/2019/extlst" xmlns:r="http://schemas.openxmlformats.org/officeDocument/2006/relationships" xmlns:m="http://schemas.openxmlformats.org/officeDocument/2006/math" xmlns:v="urn:schemas-microsoft-com:vml" xmlns:wp14="http://schemas.microsoft.com/office/word/2010/wordprocessingDrawing" xmlns:wp="http://schemas.openxmlformats.org/drawingml/2006/wordprocessingDrawing" xmlns:w10="urn:schemas-microsoft-com:office:word" xmlns:w="http://schemas.openxmlformats.org/wordprocessingml/2006/main" xmlns:w14="http://schemas.microsoft.com/office/word/2010/wordml" xmlns:w15="http://schemas.microsoft.com/office/word/2012/wordml" xmlns:w16cex="http://schemas.microsoft.com/office/word/2018/wordml/cex" xmlns:w16cid="http://schemas.microsoft.com/office/word/2016/wordml/cid" xmlns:w16="http://schemas.microsoft.com/office/word/2018/wordml" xmlns:w16du="http://schemas.microsoft.com/office/word/2023/wordml/word16du" xmlns:w16sdtdh="http://schemas.microsoft.com/office/word/2020/wordml/sdtdatahash" xmlns:w16sdtfl="http://schemas.microsoft.com/office/word/2024/wordml/sdtformatlock" xmlns:w16se="http://schemas.microsoft.com/office/word/2015/wordml/symex" xmlns:wpg="http://schemas.microsoft.com/office/word/2010/wordprocessingGroup" xmlns:wpi="http://schemas.microsoft.com/office/word/2010/wordprocessingInk" xmlns:wne="http://schemas.microsoft.com/office/word/2006/wordml" xmlns:wps="http://schemas.microsoft.com/office/word/2010/wordprocessingShape" mc:Ignorable="w14 w15 w16se w16cid w16 w16cex w16sdtdh w16sdtfl w16du wp14">
   <w:p>
     <w:pPr>
@@ -1127,16 +4088,6 @@
 </w:hdr>
 </file>
 
-<file path=word/header3.xml><?xml version="1.0" encoding="utf-8"?>
-<w:hdr xmlns:wpc="http://schemas.microsoft.com/office/word/2010/wordprocessingCanvas" xmlns:cx="http://schemas.microsoft.com/office/drawing/2014/chartex" xmlns:cx1="http://schemas.microsoft.com/office/drawing/2015/9/8/chartex" xmlns:cx2="http://schemas.microsoft.com/office/drawing/2015/10/21/chartex" xmlns:cx3="http://schemas.microsoft.com/office/drawing/2016/5/9/chartex" xmlns:cx4="http://schemas.microsoft.com/office/drawing/2016/5/10/chartex" xmlns:cx5="http://schemas.microsoft.com/office/drawing/2016/5/11/chartex" xmlns:cx6="http://schemas.microsoft.com/office/drawing/2016/5/12/chartex" xmlns:cx7="http://schemas.microsoft.com/office/drawing/2016/5/13/chartex" xmlns:cx8="http://schemas.microsoft.com/office/drawing/2016/5/14/chartex" xmlns:mc="http://schemas.openxmlformats.org/markup-compatibility/2006" xmlns:aink="http://schemas.microsoft.com/office/drawing/2016/ink" xmlns:am3d="http://schemas.microsoft.com/office/drawing/2017/model3d" xmlns:o="urn:schemas-microsoft-com:office:office" xmlns:oel="http://schemas.microsoft.com/office/2019/extlst" xmlns:r="http://schemas.openxmlformats.org/officeDocument/2006/relationships" xmlns:m="http://schemas.openxmlformats.org/officeDocument/2006/math" xmlns:v="urn:schemas-microsoft-com:vml" xmlns:wp14="http://schemas.microsoft.com/office/word/2010/wordprocessingDrawing" xmlns:wp="http://schemas.openxmlformats.org/drawingml/2006/wordprocessingDrawing" xmlns:w10="urn:schemas-microsoft-com:office:word" xmlns:w="http://schemas.openxmlformats.org/wordprocessingml/2006/main" xmlns:w14="http://schemas.microsoft.com/office/word/2010/wordml" xmlns:w15="http://schemas.microsoft.com/office/word/2012/wordml" xmlns:w16cex="http://schemas.microsoft.com/office/word/2018/wordml/cex" xmlns:w16cid="http://schemas.microsoft.com/office/word/2016/wordml/cid" xmlns:w16="http://schemas.microsoft.com/office/word/2018/wordml" xmlns:w16du="http://schemas.microsoft.com/office/word/2023/wordml/word16du" xmlns:w16sdtdh="http://schemas.microsoft.com/office/word/2020/wordml/sdtdatahash" xmlns:w16sdtfl="http://schemas.microsoft.com/office/word/2024/wordml/sdtformatlock" xmlns:w16se="http://schemas.microsoft.com/office/word/2015/wordml/symex" xmlns:wpg="http://schemas.microsoft.com/office/word/2010/wordprocessingGroup" xmlns:wpi="http://schemas.microsoft.com/office/word/2010/wordprocessingInk" xmlns:wne="http://schemas.microsoft.com/office/word/2006/wordml" xmlns:wps="http://schemas.microsoft.com/office/word/2010/wordprocessingShape" mc:Ignorable="w14 w15 w16se w16cid w16 w16cex w16sdtdh w16sdtfl w16du wp14">
-  <w:p>
-    <w:pPr>
-      <w:pStyle w:val="Header"/>
-    </w:pPr>
-  </w:p>
-</w:hdr>
-</file>
-
 <file path=word/numbering.xml><?xml version="1.0" encoding="utf-8"?>
 <w:numbering xmlns:wpc="http://schemas.microsoft.com/office/word/2010/wordprocessingCanvas" xmlns:cx="http://schemas.microsoft.com/office/drawing/2014/chartex" xmlns:cx1="http://schemas.microsoft.com/office/drawing/2015/9/8/chartex" xmlns:cx2="http://schemas.microsoft.com/office/drawing/2015/10/21/chartex" xmlns:cx3="http://schemas.microsoft.com/office/drawing/2016/5/9/chartex" xmlns:cx4="http://schemas.microsoft.com/office/drawing/2016/5/10/chartex" xmlns:cx5="http://schemas.microsoft.com/office/drawing/2016/5/11/chartex" xmlns:cx6="http://schemas.microsoft.com/office/drawing/2016/5/12/chartex" xmlns:cx7="http://schemas.microsoft.com/office/drawing/2016/5/13/chartex" xmlns:cx8="http://schemas.microsoft.com/office/drawing/2016/5/14/chartex" xmlns:mc="http://schemas.openxmlformats.org/markup-compatibility/2006" xmlns:aink="http://schemas.microsoft.com/office/drawing/2016/ink" xmlns:am3d="http://schemas.microsoft.com/office/drawing/2017/model3d" xmlns:o="urn:schemas-microsoft-com:office:office" xmlns:oel="http://schemas.microsoft.com/office/2019/extlst" xmlns:r="http://schemas.openxmlformats.org/officeDocument/2006/relationships" xmlns:m="http://schemas.openxmlformats.org/officeDocument/2006/math" xmlns:v="urn:schemas-microsoft-com:vml" xmlns:wp14="http://schemas.microsoft.com/office/word/2010/wordprocessingDrawing" xmlns:wp="http://schemas.openxmlformats.org/drawingml/2006/wordprocessingDrawing" xmlns:w10="urn:schemas-microsoft-com:office:word" xmlns:w="http://schemas.openxmlformats.org/wordprocessingml/2006/main" xmlns:w14="http://schemas.microsoft.com/office/word/2010/wordml" xmlns:w15="http://schemas.microsoft.com/office/word/2012/wordml" xmlns:w16cex="http://schemas.microsoft.com/office/word/2018/wordml/cex" xmlns:w16cid="http://schemas.microsoft.com/office/word/2016/wordml/cid" xmlns:w16="http://schemas.microsoft.com/office/word/2018/wordml" xmlns:w16du="http://schemas.microsoft.com/office/word/2023/wordml/word16du" xmlns:w16sdtdh="http://schemas.microsoft.com/office/word/2020/wordml/sdtdatahash" xmlns:w16sdtfl="http://schemas.microsoft.com/office/word/2024/wordml/sdtformatlock" xmlns:w16se="http://schemas.microsoft.com/office/word/2015/wordml/symex" xmlns:wpg="http://schemas.microsoft.com/office/word/2010/wordprocessingGroup" xmlns:wpi="http://schemas.microsoft.com/office/word/2010/wordprocessingInk" xmlns:wne="http://schemas.microsoft.com/office/word/2006/wordml" xmlns:wps="http://schemas.microsoft.com/office/word/2010/wordprocessingShape" mc:Ignorable="w14 w15 w16se w16cid w16 w16cex w16sdtdh w16sdtfl w16du wp14">
   <w:abstractNum w:abstractNumId="0" w15:restartNumberingAfterBreak="0">
@@ -1229,6 +4180,95 @@
     </w:lvl>
   </w:abstractNum>
   <w:abstractNum w:abstractNumId="1" w15:restartNumberingAfterBreak="0">
+    <w:nsid w:val="379F0CD3"/>
+    <w:multiLevelType w:val="hybridMultilevel"/>
+    <w:tmpl w:val="537AE8A6"/>
+    <w:lvl w:ilvl="0" w:tplc="0C0A0019">
+      <w:start w:val="1"/>
+      <w:numFmt w:val="lowerLetter"/>
+      <w:lvlText w:val="%1."/>
+      <w:lvlJc w:val="left"/>
+      <w:pPr>
+        <w:ind w:left="720" w:hanging="360"/>
+      </w:pPr>
+      <w:rPr>
+        <w:rFonts w:hint="default"/>
+      </w:rPr>
+    </w:lvl>
+    <w:lvl w:ilvl="1" w:tplc="0C0A0019" w:tentative="1">
+      <w:start w:val="1"/>
+      <w:numFmt w:val="lowerLetter"/>
+      <w:lvlText w:val="%2."/>
+      <w:lvlJc w:val="left"/>
+      <w:pPr>
+        <w:ind w:left="1440" w:hanging="360"/>
+      </w:pPr>
+    </w:lvl>
+    <w:lvl w:ilvl="2" w:tplc="0C0A001B" w:tentative="1">
+      <w:start w:val="1"/>
+      <w:numFmt w:val="lowerRoman"/>
+      <w:lvlText w:val="%3."/>
+      <w:lvlJc w:val="right"/>
+      <w:pPr>
+        <w:ind w:left="2160" w:hanging="180"/>
+      </w:pPr>
+    </w:lvl>
+    <w:lvl w:ilvl="3" w:tplc="0C0A000F" w:tentative="1">
+      <w:start w:val="1"/>
+      <w:numFmt w:val="decimal"/>
+      <w:lvlText w:val="%4."/>
+      <w:lvlJc w:val="left"/>
+      <w:pPr>
+        <w:ind w:left="2880" w:hanging="360"/>
+      </w:pPr>
+    </w:lvl>
+    <w:lvl w:ilvl="4" w:tplc="0C0A0019" w:tentative="1">
+      <w:start w:val="1"/>
+      <w:numFmt w:val="lowerLetter"/>
+      <w:lvlText w:val="%5."/>
+      <w:lvlJc w:val="left"/>
+      <w:pPr>
+        <w:ind w:left="3600" w:hanging="360"/>
+      </w:pPr>
+    </w:lvl>
+    <w:lvl w:ilvl="5" w:tplc="0C0A001B" w:tentative="1">
+      <w:start w:val="1"/>
+      <w:numFmt w:val="lowerRoman"/>
+      <w:lvlText w:val="%6."/>
+      <w:lvlJc w:val="right"/>
+      <w:pPr>
+        <w:ind w:left="4320" w:hanging="180"/>
+      </w:pPr>
+    </w:lvl>
+    <w:lvl w:ilvl="6" w:tplc="0C0A000F" w:tentative="1">
+      <w:start w:val="1"/>
+      <w:numFmt w:val="decimal"/>
+      <w:lvlText w:val="%7."/>
+      <w:lvlJc w:val="left"/>
+      <w:pPr>
+        <w:ind w:left="5040" w:hanging="360"/>
+      </w:pPr>
+    </w:lvl>
+    <w:lvl w:ilvl="7" w:tplc="0C0A0019" w:tentative="1">
+      <w:start w:val="1"/>
+      <w:numFmt w:val="lowerLetter"/>
+      <w:lvlText w:val="%8."/>
+      <w:lvlJc w:val="left"/>
+      <w:pPr>
+        <w:ind w:left="5760" w:hanging="360"/>
+      </w:pPr>
+    </w:lvl>
+    <w:lvl w:ilvl="8" w:tplc="0C0A001B" w:tentative="1">
+      <w:start w:val="1"/>
+      <w:numFmt w:val="lowerRoman"/>
+      <w:lvlText w:val="%9."/>
+      <w:lvlJc w:val="right"/>
+      <w:pPr>
+        <w:ind w:left="6480" w:hanging="180"/>
+      </w:pPr>
+    </w:lvl>
+  </w:abstractNum>
+  <w:abstractNum w:abstractNumId="2" w15:restartNumberingAfterBreak="0">
     <w:nsid w:val="3B6C6EDE"/>
     <w:multiLevelType w:val="multilevel"/>
     <w:tmpl w:val="0194E31C"/>
@@ -1348,7 +4388,7 @@
       </w:rPr>
     </w:lvl>
   </w:abstractNum>
-  <w:abstractNum w:abstractNumId="2" w15:restartNumberingAfterBreak="0">
+  <w:abstractNum w:abstractNumId="3" w15:restartNumberingAfterBreak="0">
     <w:nsid w:val="481224C7"/>
     <w:multiLevelType w:val="hybridMultilevel"/>
     <w:tmpl w:val="2F10E3EC"/>
@@ -1437,7 +4477,7 @@
       </w:pPr>
     </w:lvl>
   </w:abstractNum>
-  <w:abstractNum w:abstractNumId="3" w15:restartNumberingAfterBreak="0">
+  <w:abstractNum w:abstractNumId="4" w15:restartNumberingAfterBreak="0">
     <w:nsid w:val="5382767B"/>
     <w:multiLevelType w:val="multilevel"/>
     <w:tmpl w:val="108627E6"/>
@@ -1559,7 +4599,7 @@
       </w:rPr>
     </w:lvl>
   </w:abstractNum>
-  <w:abstractNum w:abstractNumId="4" w15:restartNumberingAfterBreak="0">
+  <w:abstractNum w:abstractNumId="5" w15:restartNumberingAfterBreak="0">
     <w:nsid w:val="566644DE"/>
     <w:multiLevelType w:val="hybridMultilevel"/>
     <w:tmpl w:val="60FAF016"/>
@@ -1648,7 +4688,7 @@
       </w:pPr>
     </w:lvl>
   </w:abstractNum>
-  <w:abstractNum w:abstractNumId="5" w15:restartNumberingAfterBreak="0">
+  <w:abstractNum w:abstractNumId="6" w15:restartNumberingAfterBreak="0">
     <w:nsid w:val="69B20DC0"/>
     <w:multiLevelType w:val="hybridMultilevel"/>
     <w:tmpl w:val="18F27B34"/>
@@ -1739,7 +4779,7 @@
       </w:pPr>
     </w:lvl>
   </w:abstractNum>
-  <w:abstractNum w:abstractNumId="6" w15:restartNumberingAfterBreak="0">
+  <w:abstractNum w:abstractNumId="7" w15:restartNumberingAfterBreak="0">
     <w:nsid w:val="7AF67AAE"/>
     <w:multiLevelType w:val="hybridMultilevel"/>
     <w:tmpl w:val="0C1CDF14"/>
@@ -1828,7 +4868,7 @@
       </w:pPr>
     </w:lvl>
   </w:abstractNum>
-  <w:abstractNum w:abstractNumId="7" w15:restartNumberingAfterBreak="0">
+  <w:abstractNum w:abstractNumId="8" w15:restartNumberingAfterBreak="0">
     <w:nsid w:val="7C0D51D2"/>
     <w:multiLevelType w:val="multilevel"/>
     <w:tmpl w:val="4F6E8C3E"/>
@@ -1942,28 +4982,31 @@
     </w:lvl>
   </w:abstractNum>
   <w:num w:numId="1" w16cid:durableId="1524320792">
-    <w:abstractNumId w:val="3"/>
+    <w:abstractNumId w:val="4"/>
   </w:num>
   <w:num w:numId="2" w16cid:durableId="90862655">
-    <w:abstractNumId w:val="1"/>
+    <w:abstractNumId w:val="2"/>
   </w:num>
   <w:num w:numId="3" w16cid:durableId="1339890196">
-    <w:abstractNumId w:val="7"/>
+    <w:abstractNumId w:val="8"/>
   </w:num>
   <w:num w:numId="4" w16cid:durableId="2115006295">
-    <w:abstractNumId w:val="4"/>
+    <w:abstractNumId w:val="5"/>
   </w:num>
   <w:num w:numId="5" w16cid:durableId="751660094">
-    <w:abstractNumId w:val="5"/>
+    <w:abstractNumId w:val="6"/>
   </w:num>
   <w:num w:numId="6" w16cid:durableId="2024240738">
     <w:abstractNumId w:val="0"/>
   </w:num>
   <w:num w:numId="7" w16cid:durableId="935134534">
-    <w:abstractNumId w:val="6"/>
+    <w:abstractNumId w:val="7"/>
   </w:num>
   <w:num w:numId="8" w16cid:durableId="1458065563">
-    <w:abstractNumId w:val="2"/>
+    <w:abstractNumId w:val="3"/>
+  </w:num>
+  <w:num w:numId="9" w16cid:durableId="1088963675">
+    <w:abstractNumId w:val="1"/>
   </w:num>
 </w:numbering>
 </file>
@@ -2942,6 +5985,35 @@
       <w:lang w:val="es-ES"/>
     </w:rPr>
   </w:style>
+  <w:style w:type="character" w:styleId="PlaceholderText">
+    <w:name w:val="Placeholder Text"/>
+    <w:basedOn w:val="DefaultParagraphFont"/>
+    <w:uiPriority w:val="99"/>
+    <w:semiHidden/>
+    <w:rsid w:val="009C2AA4"/>
+    <w:rPr>
+      <w:color w:val="666666"/>
+    </w:rPr>
+  </w:style>
+  <w:style w:type="paragraph" w:styleId="Caption">
+    <w:name w:val="caption"/>
+    <w:basedOn w:val="Normal"/>
+    <w:next w:val="Normal"/>
+    <w:uiPriority w:val="35"/>
+    <w:unhideWhenUsed/>
+    <w:qFormat/>
+    <w:rsid w:val="007C3AE1"/>
+    <w:pPr>
+      <w:spacing w:after="200"/>
+    </w:pPr>
+    <w:rPr>
+      <w:i/>
+      <w:iCs/>
+      <w:color w:val="1F497D" w:themeColor="text2"/>
+      <w:sz w:val="18"/>
+      <w:szCs w:val="18"/>
+    </w:rPr>
+  </w:style>
 </w:styles>
 </file>
 

</xml_diff>